<commit_message>
Auto-save: 5 file(s) — 2026-10-16 09:22
</commit_message>
<xml_diff>
--- a/Projects/TekRevol/03-website/TekRevol-Healthcare-AI-Ops-Landing-Page-Copy-v1-Cover-A.docx
+++ b/Projects/TekRevol/03-website/TekRevol-Healthcare-AI-Ops-Landing-Page-Copy-v1-Cover-A.docx
@@ -7811,8 +7811,8 @@
         <w:tblLook w:val="04A0" w:firstRow="1" w:lastRow="0" w:firstColumn="1" w:lastColumn="0" w:noHBand="0" w:noVBand="1"/>
       </w:tblPr>
       <w:tblGrid>
-        <w:gridCol w:w="1826"/>
-        <w:gridCol w:w="7534"/>
+        <w:gridCol w:w="1101"/>
+        <w:gridCol w:w="8259"/>
       </w:tblGrid>
       <w:tr>
         <w:trPr>
@@ -7821,7 +7821,7 @@
         </w:trPr>
         <w:tc>
           <w:tcPr>
-            <w:tcW w:w="1826" w:type="dxa"/>
+            <w:tcW w:w="1101" w:type="dxa"/>
             <w:tcBorders>
               <w:top w:val="single" w:sz="4" w:space="0" w:color="C9CCCF"/>
               <w:left w:val="single" w:sz="4" w:space="0" w:color="C9CCCF"/>
@@ -7853,7 +7853,7 @@
         </w:tc>
         <w:tc>
           <w:tcPr>
-            <w:tcW w:w="7534" w:type="dxa"/>
+            <w:tcW w:w="8259" w:type="dxa"/>
             <w:tcBorders>
               <w:top w:val="single" w:sz="4" w:space="0" w:color="C9CCCF"/>
               <w:left w:val="single" w:sz="4" w:space="0" w:color="C9CCCF"/>
@@ -7890,7 +7890,7 @@
         </w:trPr>
         <w:tc>
           <w:tcPr>
-            <w:tcW w:w="1826" w:type="dxa"/>
+            <w:tcW w:w="1101" w:type="dxa"/>
             <w:tcBorders>
               <w:top w:val="single" w:sz="4" w:space="0" w:color="C9CCCF"/>
               <w:left w:val="single" w:sz="4" w:space="0" w:color="C9CCCF"/>
@@ -7919,7 +7919,7 @@
         </w:tc>
         <w:tc>
           <w:tcPr>
-            <w:tcW w:w="7534" w:type="dxa"/>
+            <w:tcW w:w="8259" w:type="dxa"/>
             <w:tcBorders>
               <w:top w:val="single" w:sz="4" w:space="0" w:color="C9CCCF"/>
               <w:left w:val="single" w:sz="4" w:space="0" w:color="C9CCCF"/>
@@ -7945,6 +7945,71 @@
                 <w:szCs w:val="18"/>
               </w:rPr>
               <w:t>Healthcare software we've shipped</w:t>
+            </w:r>
+          </w:p>
+        </w:tc>
+      </w:tr>
+      <w:tr>
+        <w:trPr>
+          <w:cantSplit/>
+        </w:trPr>
+        <w:tc>
+          <w:tcPr>
+            <w:tcW w:w="1101" w:type="dxa"/>
+            <w:tcBorders>
+              <w:top w:val="single" w:sz="4" w:space="0" w:color="C9CCCF"/>
+              <w:left w:val="single" w:sz="4" w:space="0" w:color="C9CCCF"/>
+              <w:bottom w:val="single" w:sz="4" w:space="0" w:color="C9CCCF"/>
+              <w:right w:val="single" w:sz="4" w:space="0" w:color="C9CCCF"/>
+            </w:tcBorders>
+            <w:shd w:val="clear" w:color="auto" w:fill="F3F4F4"/>
+            <w:tcMar>
+              <w:top w:w="70" w:type="dxa"/>
+              <w:left w:w="100" w:type="dxa"/>
+              <w:bottom w:w="70" w:type="dxa"/>
+              <w:right w:w="100" w:type="dxa"/>
+            </w:tcMar>
+          </w:tcPr>
+          <w:p>
+            <w:pPr>
+              <w:spacing w:line="260" w:lineRule="auto"/>
+            </w:pPr>
+            <w:r>
+              <w:rPr>
+                <w:sz w:val="18"/>
+                <w:szCs w:val="18"/>
+              </w:rPr>
+              <w:t>Intro</w:t>
+            </w:r>
+          </w:p>
+        </w:tc>
+        <w:tc>
+          <w:tcPr>
+            <w:tcW w:w="8259" w:type="dxa"/>
+            <w:tcBorders>
+              <w:top w:val="single" w:sz="4" w:space="0" w:color="C9CCCF"/>
+              <w:left w:val="single" w:sz="4" w:space="0" w:color="C9CCCF"/>
+              <w:bottom w:val="single" w:sz="4" w:space="0" w:color="C9CCCF"/>
+              <w:right w:val="single" w:sz="4" w:space="0" w:color="C9CCCF"/>
+            </w:tcBorders>
+            <w:shd w:val="clear" w:color="auto" w:fill="F3F4F4"/>
+            <w:tcMar>
+              <w:top w:w="70" w:type="dxa"/>
+              <w:left w:w="100" w:type="dxa"/>
+              <w:bottom w:w="70" w:type="dxa"/>
+              <w:right w:w="100" w:type="dxa"/>
+            </w:tcMar>
+          </w:tcPr>
+          <w:p>
+            <w:pPr>
+              <w:spacing w:line="260" w:lineRule="auto"/>
+            </w:pPr>
+            <w:r>
+              <w:rPr>
+                <w:sz w:val="18"/>
+                <w:szCs w:val="18"/>
+              </w:rPr>
+              <w:t>Scheduling, home visits, patient communication and AI, running in production for care providers.</w:t>
             </w:r>
           </w:p>
         </w:tc>
@@ -7954,6 +8019,14 @@
       <w:pPr>
         <w:spacing w:after="100"/>
       </w:pPr>
+    </w:p>
+    <w:p>
+      <w:pPr>
+        <w:spacing w:after="120" w:line="300" w:lineRule="auto"/>
+      </w:pPr>
+      <w:r>
+        <w:t>Four cards, in this order. Each links to its case study page in a new tab, so the visitor doesn't lose the form.</w:t>
+      </w:r>
     </w:p>
     <w:tbl>
       <w:tblPr>
@@ -7969,8 +8042,10 @@
         <w:tblLook w:val="04A0" w:firstRow="1" w:lastRow="0" w:firstColumn="1" w:lastColumn="0" w:noHBand="0" w:noVBand="1"/>
       </w:tblPr>
       <w:tblGrid>
-        <w:gridCol w:w="3854"/>
-        <w:gridCol w:w="5506"/>
+        <w:gridCol w:w="1771"/>
+        <w:gridCol w:w="2530"/>
+        <w:gridCol w:w="2530"/>
+        <w:gridCol w:w="2529"/>
       </w:tblGrid>
       <w:tr>
         <w:trPr>
@@ -7979,7 +8054,7 @@
         </w:trPr>
         <w:tc>
           <w:tcPr>
-            <w:tcW w:w="3854" w:type="dxa"/>
+            <w:tcW w:w="1771" w:type="dxa"/>
             <w:tcBorders>
               <w:top w:val="single" w:sz="4" w:space="0" w:color="C9CCCF"/>
               <w:left w:val="single" w:sz="4" w:space="0" w:color="C9CCCF"/>
@@ -8011,7 +8086,7 @@
         </w:tc>
         <w:tc>
           <w:tcPr>
-            <w:tcW w:w="5506" w:type="dxa"/>
+            <w:tcW w:w="2530" w:type="dxa"/>
             <w:tcBorders>
               <w:top w:val="single" w:sz="4" w:space="0" w:color="C9CCCF"/>
               <w:left w:val="single" w:sz="4" w:space="0" w:color="C9CCCF"/>
@@ -8038,6 +8113,70 @@
                 <w:szCs w:val="15"/>
               </w:rPr>
               <w:t>Card copy</w:t>
+            </w:r>
+          </w:p>
+        </w:tc>
+        <w:tc>
+          <w:tcPr>
+            <w:tcW w:w="2530" w:type="dxa"/>
+            <w:tcBorders>
+              <w:top w:val="single" w:sz="4" w:space="0" w:color="C9CCCF"/>
+              <w:left w:val="single" w:sz="4" w:space="0" w:color="C9CCCF"/>
+              <w:bottom w:val="single" w:sz="4" w:space="0" w:color="C9CCCF"/>
+              <w:right w:val="single" w:sz="4" w:space="0" w:color="C9CCCF"/>
+            </w:tcBorders>
+            <w:shd w:val="clear" w:color="auto" w:fill="1D1E21"/>
+            <w:tcMar>
+              <w:top w:w="70" w:type="dxa"/>
+              <w:left w:w="100" w:type="dxa"/>
+              <w:bottom w:w="70" w:type="dxa"/>
+              <w:right w:w="100" w:type="dxa"/>
+            </w:tcMar>
+          </w:tcPr>
+          <w:p>
+            <w:pPr>
+              <w:spacing w:line="260" w:lineRule="auto"/>
+            </w:pPr>
+            <w:r>
+              <w:rPr>
+                <w:rFonts w:ascii="JetBrains Mono" w:eastAsia="JetBrains Mono" w:hAnsi="JetBrains Mono" w:cs="JetBrains Mono"/>
+                <w:color w:val="FFFFFF"/>
+                <w:sz w:val="15"/>
+                <w:szCs w:val="15"/>
+              </w:rPr>
+              <w:t>Outcome line</w:t>
+            </w:r>
+          </w:p>
+        </w:tc>
+        <w:tc>
+          <w:tcPr>
+            <w:tcW w:w="2529" w:type="dxa"/>
+            <w:tcBorders>
+              <w:top w:val="single" w:sz="4" w:space="0" w:color="C9CCCF"/>
+              <w:left w:val="single" w:sz="4" w:space="0" w:color="C9CCCF"/>
+              <w:bottom w:val="single" w:sz="4" w:space="0" w:color="C9CCCF"/>
+              <w:right w:val="single" w:sz="4" w:space="0" w:color="C9CCCF"/>
+            </w:tcBorders>
+            <w:shd w:val="clear" w:color="auto" w:fill="1D1E21"/>
+            <w:tcMar>
+              <w:top w:w="70" w:type="dxa"/>
+              <w:left w:w="100" w:type="dxa"/>
+              <w:bottom w:w="70" w:type="dxa"/>
+              <w:right w:w="100" w:type="dxa"/>
+            </w:tcMar>
+          </w:tcPr>
+          <w:p>
+            <w:pPr>
+              <w:spacing w:line="260" w:lineRule="auto"/>
+            </w:pPr>
+            <w:r>
+              <w:rPr>
+                <w:rFonts w:ascii="JetBrains Mono" w:eastAsia="JetBrains Mono" w:hAnsi="JetBrains Mono" w:cs="JetBrains Mono"/>
+                <w:color w:val="FFFFFF"/>
+                <w:sz w:val="15"/>
+                <w:szCs w:val="15"/>
+              </w:rPr>
+              <w:t>Source check</w:t>
             </w:r>
           </w:p>
         </w:tc>
@@ -8048,7 +8187,7 @@
         </w:trPr>
         <w:tc>
           <w:tcPr>
-            <w:tcW w:w="3854" w:type="dxa"/>
+            <w:tcW w:w="1771" w:type="dxa"/>
             <w:tcBorders>
               <w:top w:val="single" w:sz="4" w:space="0" w:color="C9CCCF"/>
               <w:left w:val="single" w:sz="4" w:space="0" w:color="C9CCCF"/>
@@ -8073,36 +8212,200 @@
                 <w:sz w:val="18"/>
                 <w:szCs w:val="18"/>
               </w:rPr>
-              <w:t>MiloCare</w:t>
-            </w:r>
-          </w:p>
-        </w:tc>
-        <w:tc>
-          <w:tcPr>
-            <w:tcW w:w="5506" w:type="dxa"/>
-            <w:tcBorders>
-              <w:top w:val="single" w:sz="4" w:space="0" w:color="C9CCCF"/>
-              <w:left w:val="single" w:sz="4" w:space="0" w:color="C9CCCF"/>
-              <w:bottom w:val="single" w:sz="4" w:space="0" w:color="C9CCCF"/>
-              <w:right w:val="single" w:sz="4" w:space="0" w:color="C9CCCF"/>
-            </w:tcBorders>
-            <w:tcMar>
-              <w:top w:w="70" w:type="dxa"/>
-              <w:left w:w="100" w:type="dxa"/>
-              <w:bottom w:w="70" w:type="dxa"/>
-              <w:right w:w="100" w:type="dxa"/>
-            </w:tcMar>
-          </w:tcPr>
-          <w:p>
-            <w:pPr>
-              <w:spacing w:line="260" w:lineRule="auto"/>
-            </w:pPr>
-            <w:r>
-              <w:rPr>
-                <w:sz w:val="18"/>
-                <w:szCs w:val="18"/>
-              </w:rPr>
-              <w:t xml:space="preserve">Health record intelligence for patients and care teams. </w:t>
+              <w:t>Libido Health</w:t>
+            </w:r>
+          </w:p>
+        </w:tc>
+        <w:tc>
+          <w:tcPr>
+            <w:tcW w:w="2530" w:type="dxa"/>
+            <w:tcBorders>
+              <w:top w:val="single" w:sz="4" w:space="0" w:color="C9CCCF"/>
+              <w:left w:val="single" w:sz="4" w:space="0" w:color="C9CCCF"/>
+              <w:bottom w:val="single" w:sz="4" w:space="0" w:color="C9CCCF"/>
+              <w:right w:val="single" w:sz="4" w:space="0" w:color="C9CCCF"/>
+            </w:tcBorders>
+            <w:tcMar>
+              <w:top w:w="70" w:type="dxa"/>
+              <w:left w:w="100" w:type="dxa"/>
+              <w:bottom w:w="70" w:type="dxa"/>
+              <w:right w:w="100" w:type="dxa"/>
+            </w:tcMar>
+          </w:tcPr>
+          <w:p>
+            <w:pPr>
+              <w:spacing w:line="260" w:lineRule="auto"/>
+            </w:pPr>
+            <w:r>
+              <w:rPr>
+                <w:sz w:val="18"/>
+                <w:szCs w:val="18"/>
+              </w:rPr>
+              <w:t>A HIPAA-compliant platform for therapy and coaching sessions: scheduling, real-time video visits and an AI coaching assistant that checks in with members daily.</w:t>
+            </w:r>
+          </w:p>
+        </w:tc>
+        <w:tc>
+          <w:tcPr>
+            <w:tcW w:w="2530" w:type="dxa"/>
+            <w:tcBorders>
+              <w:top w:val="single" w:sz="4" w:space="0" w:color="C9CCCF"/>
+              <w:left w:val="single" w:sz="4" w:space="0" w:color="C9CCCF"/>
+              <w:bottom w:val="single" w:sz="4" w:space="0" w:color="C9CCCF"/>
+              <w:right w:val="single" w:sz="4" w:space="0" w:color="C9CCCF"/>
+            </w:tcBorders>
+            <w:tcMar>
+              <w:top w:w="70" w:type="dxa"/>
+              <w:left w:w="100" w:type="dxa"/>
+              <w:bottom w:w="70" w:type="dxa"/>
+              <w:right w:w="100" w:type="dxa"/>
+            </w:tcMar>
+          </w:tcPr>
+          <w:p>
+            <w:pPr>
+              <w:spacing w:line="260" w:lineRule="auto"/>
+            </w:pPr>
+            <w:r>
+              <w:rPr>
+                <w:b/>
+                <w:bCs/>
+                <w:sz w:val="18"/>
+                <w:szCs w:val="18"/>
+              </w:rPr>
+              <w:t>80% fewer session no-shows. 20,000+ active users in the first three months.</w:t>
+            </w:r>
+          </w:p>
+        </w:tc>
+        <w:tc>
+          <w:tcPr>
+            <w:tcW w:w="2529" w:type="dxa"/>
+            <w:tcBorders>
+              <w:top w:val="single" w:sz="4" w:space="0" w:color="C9CCCF"/>
+              <w:left w:val="single" w:sz="4" w:space="0" w:color="C9CCCF"/>
+              <w:bottom w:val="single" w:sz="4" w:space="0" w:color="C9CCCF"/>
+              <w:right w:val="single" w:sz="4" w:space="0" w:color="C9CCCF"/>
+            </w:tcBorders>
+            <w:tcMar>
+              <w:top w:w="70" w:type="dxa"/>
+              <w:left w:w="100" w:type="dxa"/>
+              <w:bottom w:w="70" w:type="dxa"/>
+              <w:right w:w="100" w:type="dxa"/>
+            </w:tcMar>
+          </w:tcPr>
+          <w:p>
+            <w:pPr>
+              <w:spacing w:line="260" w:lineRule="auto"/>
+            </w:pPr>
+            <w:r>
+              <w:rPr>
+                <w:sz w:val="18"/>
+                <w:szCs w:val="18"/>
+              </w:rPr>
+              <w:t xml:space="preserve">Both </w:t>
+            </w:r>
+            <w:r>
+              <w:rPr>
+                <w:sz w:val="18"/>
+                <w:szCs w:val="18"/>
+              </w:rPr>
+              <w:t>numbers are in the case study body. Safe</w:t>
+            </w:r>
+          </w:p>
+        </w:tc>
+      </w:tr>
+      <w:tr>
+        <w:trPr>
+          <w:cantSplit/>
+        </w:trPr>
+        <w:tc>
+          <w:tcPr>
+            <w:tcW w:w="1771" w:type="dxa"/>
+            <w:tcBorders>
+              <w:top w:val="single" w:sz="4" w:space="0" w:color="C9CCCF"/>
+              <w:left w:val="single" w:sz="4" w:space="0" w:color="C9CCCF"/>
+              <w:bottom w:val="single" w:sz="4" w:space="0" w:color="C9CCCF"/>
+              <w:right w:val="single" w:sz="4" w:space="0" w:color="C9CCCF"/>
+            </w:tcBorders>
+            <w:shd w:val="clear" w:color="auto" w:fill="F3F4F4"/>
+            <w:tcMar>
+              <w:top w:w="70" w:type="dxa"/>
+              <w:left w:w="100" w:type="dxa"/>
+              <w:bottom w:w="70" w:type="dxa"/>
+              <w:right w:w="100" w:type="dxa"/>
+            </w:tcMar>
+          </w:tcPr>
+          <w:p>
+            <w:pPr>
+              <w:spacing w:line="260" w:lineRule="auto"/>
+            </w:pPr>
+            <w:r>
+              <w:rPr>
+                <w:b/>
+                <w:bCs/>
+                <w:sz w:val="18"/>
+                <w:szCs w:val="18"/>
+              </w:rPr>
+              <w:t>Nurse Practitioners</w:t>
+            </w:r>
+          </w:p>
+        </w:tc>
+        <w:tc>
+          <w:tcPr>
+            <w:tcW w:w="2530" w:type="dxa"/>
+            <w:tcBorders>
+              <w:top w:val="single" w:sz="4" w:space="0" w:color="C9CCCF"/>
+              <w:left w:val="single" w:sz="4" w:space="0" w:color="C9CCCF"/>
+              <w:bottom w:val="single" w:sz="4" w:space="0" w:color="C9CCCF"/>
+              <w:right w:val="single" w:sz="4" w:space="0" w:color="C9CCCF"/>
+            </w:tcBorders>
+            <w:shd w:val="clear" w:color="auto" w:fill="F3F4F4"/>
+            <w:tcMar>
+              <w:top w:w="70" w:type="dxa"/>
+              <w:left w:w="100" w:type="dxa"/>
+              <w:bottom w:w="70" w:type="dxa"/>
+              <w:right w:w="100" w:type="dxa"/>
+            </w:tcMar>
+          </w:tcPr>
+          <w:p>
+            <w:pPr>
+              <w:spacing w:line="260" w:lineRule="auto"/>
+            </w:pPr>
+            <w:r>
+              <w:rPr>
+                <w:sz w:val="18"/>
+                <w:szCs w:val="18"/>
+              </w:rPr>
+              <w:t>In-home care on demand. Patients book nurse visits by the hour, consult by video, and track every request. Nurse pay is calculated in the same platform.</w:t>
+            </w:r>
+          </w:p>
+        </w:tc>
+        <w:tc>
+          <w:tcPr>
+            <w:tcW w:w="2530" w:type="dxa"/>
+            <w:tcBorders>
+              <w:top w:val="single" w:sz="4" w:space="0" w:color="C9CCCF"/>
+              <w:left w:val="single" w:sz="4" w:space="0" w:color="C9CCCF"/>
+              <w:bottom w:val="single" w:sz="4" w:space="0" w:color="C9CCCF"/>
+              <w:right w:val="single" w:sz="4" w:space="0" w:color="C9CCCF"/>
+            </w:tcBorders>
+            <w:shd w:val="clear" w:color="auto" w:fill="F3F4F4"/>
+            <w:tcMar>
+              <w:top w:w="70" w:type="dxa"/>
+              <w:left w:w="100" w:type="dxa"/>
+              <w:bottom w:w="70" w:type="dxa"/>
+              <w:right w:w="100" w:type="dxa"/>
+            </w:tcMar>
+          </w:tcPr>
+          <w:p>
+            <w:pPr>
+              <w:spacing w:line="260" w:lineRule="auto"/>
+            </w:pPr>
+            <w:r>
+              <w:rPr>
+                <w:sz w:val="18"/>
+                <w:szCs w:val="18"/>
+              </w:rPr>
+              <w:t xml:space="preserve">Cut patient wait times by 40% </w:t>
             </w:r>
             <w:r>
               <w:rPr>
@@ -8116,12 +8419,35 @@
               </w:rPr>
               <w:t xml:space="preserve"> CONFIRM </w:t>
             </w:r>
-            <w:r>
-              <w:rPr>
-                <w:sz w:val="18"/>
-                <w:szCs w:val="18"/>
-              </w:rPr>
-              <w:t xml:space="preserve"> one outcome line from TekRevol (users, time saved, or scope)</w:t>
+          </w:p>
+        </w:tc>
+        <w:tc>
+          <w:tcPr>
+            <w:tcW w:w="2529" w:type="dxa"/>
+            <w:tcBorders>
+              <w:top w:val="single" w:sz="4" w:space="0" w:color="C9CCCF"/>
+              <w:left w:val="single" w:sz="4" w:space="0" w:color="C9CCCF"/>
+              <w:bottom w:val="single" w:sz="4" w:space="0" w:color="C9CCCF"/>
+              <w:right w:val="single" w:sz="4" w:space="0" w:color="C9CCCF"/>
+            </w:tcBorders>
+            <w:shd w:val="clear" w:color="auto" w:fill="F3F4F4"/>
+            <w:tcMar>
+              <w:top w:w="70" w:type="dxa"/>
+              <w:left w:w="100" w:type="dxa"/>
+              <w:bottom w:w="70" w:type="dxa"/>
+              <w:right w:w="100" w:type="dxa"/>
+            </w:tcMar>
+          </w:tcPr>
+          <w:p>
+            <w:pPr>
+              <w:spacing w:line="260" w:lineRule="auto"/>
+            </w:pPr>
+            <w:r>
+              <w:rPr>
+                <w:sz w:val="18"/>
+                <w:szCs w:val="18"/>
+              </w:rPr>
+              <w:t>Only in the page's meta description, not the body. Use only if TekRevol confirms it; otherwise show the card without a number</w:t>
             </w:r>
           </w:p>
         </w:tc>
@@ -8132,14 +8458,13 @@
         </w:trPr>
         <w:tc>
           <w:tcPr>
-            <w:tcW w:w="3854" w:type="dxa"/>
-            <w:tcBorders>
-              <w:top w:val="single" w:sz="4" w:space="0" w:color="C9CCCF"/>
-              <w:left w:val="single" w:sz="4" w:space="0" w:color="C9CCCF"/>
-              <w:bottom w:val="single" w:sz="4" w:space="0" w:color="C9CCCF"/>
-              <w:right w:val="single" w:sz="4" w:space="0" w:color="C9CCCF"/>
-            </w:tcBorders>
-            <w:shd w:val="clear" w:color="auto" w:fill="F3F4F4"/>
+            <w:tcW w:w="1771" w:type="dxa"/>
+            <w:tcBorders>
+              <w:top w:val="single" w:sz="4" w:space="0" w:color="C9CCCF"/>
+              <w:left w:val="single" w:sz="4" w:space="0" w:color="C9CCCF"/>
+              <w:bottom w:val="single" w:sz="4" w:space="0" w:color="C9CCCF"/>
+              <w:right w:val="single" w:sz="4" w:space="0" w:color="C9CCCF"/>
+            </w:tcBorders>
             <w:tcMar>
               <w:top w:w="70" w:type="dxa"/>
               <w:left w:w="100" w:type="dxa"/>
@@ -8158,37 +8483,65 @@
                 <w:sz w:val="18"/>
                 <w:szCs w:val="18"/>
               </w:rPr>
-              <w:t>Nurse Practitioners</w:t>
-            </w:r>
-          </w:p>
-        </w:tc>
-        <w:tc>
-          <w:tcPr>
-            <w:tcW w:w="5506" w:type="dxa"/>
-            <w:tcBorders>
-              <w:top w:val="single" w:sz="4" w:space="0" w:color="C9CCCF"/>
-              <w:left w:val="single" w:sz="4" w:space="0" w:color="C9CCCF"/>
-              <w:bottom w:val="single" w:sz="4" w:space="0" w:color="C9CCCF"/>
-              <w:right w:val="single" w:sz="4" w:space="0" w:color="C9CCCF"/>
-            </w:tcBorders>
-            <w:shd w:val="clear" w:color="auto" w:fill="F3F4F4"/>
-            <w:tcMar>
-              <w:top w:w="70" w:type="dxa"/>
-              <w:left w:w="100" w:type="dxa"/>
-              <w:bottom w:w="70" w:type="dxa"/>
-              <w:right w:w="100" w:type="dxa"/>
-            </w:tcMar>
-          </w:tcPr>
-          <w:p>
-            <w:pPr>
-              <w:spacing w:line="260" w:lineRule="auto"/>
-            </w:pPr>
-            <w:r>
-              <w:rPr>
-                <w:sz w:val="18"/>
-                <w:szCs w:val="18"/>
-              </w:rPr>
-              <w:t xml:space="preserve">On-demand nursing care: booking, matching and visits in one app. </w:t>
+              <w:t>Kinekt</w:t>
+            </w:r>
+          </w:p>
+        </w:tc>
+        <w:tc>
+          <w:tcPr>
+            <w:tcW w:w="2530" w:type="dxa"/>
+            <w:tcBorders>
+              <w:top w:val="single" w:sz="4" w:space="0" w:color="C9CCCF"/>
+              <w:left w:val="single" w:sz="4" w:space="0" w:color="C9CCCF"/>
+              <w:bottom w:val="single" w:sz="4" w:space="0" w:color="C9CCCF"/>
+              <w:right w:val="single" w:sz="4" w:space="0" w:color="C9CCCF"/>
+            </w:tcBorders>
+            <w:tcMar>
+              <w:top w:w="70" w:type="dxa"/>
+              <w:left w:w="100" w:type="dxa"/>
+              <w:bottom w:w="70" w:type="dxa"/>
+              <w:right w:w="100" w:type="dxa"/>
+            </w:tcMar>
+          </w:tcPr>
+          <w:p>
+            <w:pPr>
+              <w:spacing w:line="260" w:lineRule="auto"/>
+            </w:pPr>
+            <w:r>
+              <w:rPr>
+                <w:sz w:val="18"/>
+                <w:szCs w:val="18"/>
+              </w:rPr>
+              <w:t>AI patient feedback for UK care providers. GPT-4 reads feedback from every channel, scores sentiment, sorts it automatically and drafts replies.</w:t>
+            </w:r>
+          </w:p>
+        </w:tc>
+        <w:tc>
+          <w:tcPr>
+            <w:tcW w:w="2530" w:type="dxa"/>
+            <w:tcBorders>
+              <w:top w:val="single" w:sz="4" w:space="0" w:color="C9CCCF"/>
+              <w:left w:val="single" w:sz="4" w:space="0" w:color="C9CCCF"/>
+              <w:bottom w:val="single" w:sz="4" w:space="0" w:color="C9CCCF"/>
+              <w:right w:val="single" w:sz="4" w:space="0" w:color="C9CCCF"/>
+            </w:tcBorders>
+            <w:tcMar>
+              <w:top w:w="70" w:type="dxa"/>
+              <w:left w:w="100" w:type="dxa"/>
+              <w:bottom w:w="70" w:type="dxa"/>
+              <w:right w:w="100" w:type="dxa"/>
+            </w:tcMar>
+          </w:tcPr>
+          <w:p>
+            <w:pPr>
+              <w:spacing w:line="260" w:lineRule="auto"/>
+            </w:pPr>
+            <w:r>
+              <w:rPr>
+                <w:sz w:val="18"/>
+                <w:szCs w:val="18"/>
+              </w:rPr>
+              <w:t xml:space="preserve">45% more user engagement </w:t>
             </w:r>
             <w:r>
               <w:rPr>
@@ -8202,12 +8555,41 @@
               </w:rPr>
               <w:t xml:space="preserve"> CONFIRM </w:t>
             </w:r>
-            <w:r>
-              <w:rPr>
-                <w:sz w:val="18"/>
-                <w:szCs w:val="18"/>
-              </w:rPr>
-              <w:t xml:space="preserve"> one outcome line</w:t>
+          </w:p>
+        </w:tc>
+        <w:tc>
+          <w:tcPr>
+            <w:tcW w:w="2529" w:type="dxa"/>
+            <w:tcBorders>
+              <w:top w:val="single" w:sz="4" w:space="0" w:color="C9CCCF"/>
+              <w:left w:val="single" w:sz="4" w:space="0" w:color="C9CCCF"/>
+              <w:bottom w:val="single" w:sz="4" w:space="0" w:color="C9CCCF"/>
+              <w:right w:val="single" w:sz="4" w:space="0" w:color="C9CCCF"/>
+            </w:tcBorders>
+            <w:tcMar>
+              <w:top w:w="70" w:type="dxa"/>
+              <w:left w:w="100" w:type="dxa"/>
+              <w:bottom w:w="70" w:type="dxa"/>
+              <w:right w:w="100" w:type="dxa"/>
+            </w:tcMar>
+          </w:tcPr>
+          <w:p>
+            <w:pPr>
+              <w:spacing w:line="260" w:lineRule="auto"/>
+            </w:pPr>
+            <w:r>
+              <w:rPr>
+                <w:sz w:val="18"/>
+                <w:szCs w:val="18"/>
+              </w:rPr>
+              <w:t>Headline number on the page, but the projects list says "30% faster response</w:t>
+            </w:r>
+            <w:r>
+              <w:rPr>
+                <w:sz w:val="18"/>
+                <w:szCs w:val="18"/>
+              </w:rPr>
+              <w:t xml:space="preserve"> times" for the same case. TekRevol must pick one</w:t>
             </w:r>
           </w:p>
         </w:tc>
@@ -8218,13 +8600,14 @@
         </w:trPr>
         <w:tc>
           <w:tcPr>
-            <w:tcW w:w="3854" w:type="dxa"/>
-            <w:tcBorders>
-              <w:top w:val="single" w:sz="4" w:space="0" w:color="C9CCCF"/>
-              <w:left w:val="single" w:sz="4" w:space="0" w:color="C9CCCF"/>
-              <w:bottom w:val="single" w:sz="4" w:space="0" w:color="C9CCCF"/>
-              <w:right w:val="single" w:sz="4" w:space="0" w:color="C9CCCF"/>
-            </w:tcBorders>
+            <w:tcW w:w="1771" w:type="dxa"/>
+            <w:tcBorders>
+              <w:top w:val="single" w:sz="4" w:space="0" w:color="C9CCCF"/>
+              <w:left w:val="single" w:sz="4" w:space="0" w:color="C9CCCF"/>
+              <w:bottom w:val="single" w:sz="4" w:space="0" w:color="C9CCCF"/>
+              <w:right w:val="single" w:sz="4" w:space="0" w:color="C9CCCF"/>
+            </w:tcBorders>
+            <w:shd w:val="clear" w:color="auto" w:fill="F3F4F4"/>
             <w:tcMar>
               <w:top w:w="70" w:type="dxa"/>
               <w:left w:w="100" w:type="dxa"/>
@@ -8243,62 +8626,254 @@
                 <w:sz w:val="18"/>
                 <w:szCs w:val="18"/>
               </w:rPr>
-              <w:t>Kinekt</w:t>
-            </w:r>
-          </w:p>
-        </w:tc>
-        <w:tc>
-          <w:tcPr>
-            <w:tcW w:w="5506" w:type="dxa"/>
-            <w:tcBorders>
-              <w:top w:val="single" w:sz="4" w:space="0" w:color="C9CCCF"/>
-              <w:left w:val="single" w:sz="4" w:space="0" w:color="C9CCCF"/>
-              <w:bottom w:val="single" w:sz="4" w:space="0" w:color="C9CCCF"/>
-              <w:right w:val="single" w:sz="4" w:space="0" w:color="C9CCCF"/>
-            </w:tcBorders>
-            <w:tcMar>
-              <w:top w:w="70" w:type="dxa"/>
-              <w:left w:w="100" w:type="dxa"/>
-              <w:bottom w:w="70" w:type="dxa"/>
-              <w:right w:w="100" w:type="dxa"/>
-            </w:tcMar>
-          </w:tcPr>
-          <w:p>
-            <w:pPr>
-              <w:spacing w:line="260" w:lineRule="auto"/>
-            </w:pPr>
-            <w:r>
-              <w:rPr>
-                <w:sz w:val="18"/>
-                <w:szCs w:val="18"/>
-              </w:rPr>
-              <w:t xml:space="preserve">Patient </w:t>
-            </w:r>
-            <w:r>
-              <w:rPr>
-                <w:sz w:val="18"/>
-                <w:szCs w:val="18"/>
-              </w:rPr>
-              <w:t xml:space="preserve">feedback intelligence. </w:t>
-            </w:r>
+              <w:t>Rehkempers</w:t>
+            </w:r>
+            <w:r>
+              <w:rPr>
+                <w:sz w:val="18"/>
+                <w:szCs w:val="18"/>
+              </w:rPr>
+              <w:t xml:space="preserve"> (automation outside healthcare)</w:t>
+            </w:r>
+          </w:p>
+        </w:tc>
+        <w:tc>
+          <w:tcPr>
+            <w:tcW w:w="2530" w:type="dxa"/>
+            <w:tcBorders>
+              <w:top w:val="single" w:sz="4" w:space="0" w:color="C9CCCF"/>
+              <w:left w:val="single" w:sz="4" w:space="0" w:color="C9CCCF"/>
+              <w:bottom w:val="single" w:sz="4" w:space="0" w:color="C9CCCF"/>
+              <w:right w:val="single" w:sz="4" w:space="0" w:color="C9CCCF"/>
+            </w:tcBorders>
+            <w:shd w:val="clear" w:color="auto" w:fill="F3F4F4"/>
+            <w:tcMar>
+              <w:top w:w="70" w:type="dxa"/>
+              <w:left w:w="100" w:type="dxa"/>
+              <w:bottom w:w="70" w:type="dxa"/>
+              <w:right w:w="100" w:type="dxa"/>
+            </w:tcMar>
+          </w:tcPr>
+          <w:p>
+            <w:pPr>
+              <w:spacing w:line="260" w:lineRule="auto"/>
+            </w:pPr>
+            <w:r>
+              <w:rPr>
+                <w:sz w:val="18"/>
+                <w:szCs w:val="18"/>
+              </w:rPr>
+              <w:t>Replaced a 50-year manual pricing process across 4 manufacturing plants. The same approach applies to intake and claims work.</w:t>
+            </w:r>
+          </w:p>
+        </w:tc>
+        <w:tc>
+          <w:tcPr>
+            <w:tcW w:w="2530" w:type="dxa"/>
+            <w:tcBorders>
+              <w:top w:val="single" w:sz="4" w:space="0" w:color="C9CCCF"/>
+              <w:left w:val="single" w:sz="4" w:space="0" w:color="C9CCCF"/>
+              <w:bottom w:val="single" w:sz="4" w:space="0" w:color="C9CCCF"/>
+              <w:right w:val="single" w:sz="4" w:space="0" w:color="C9CCCF"/>
+            </w:tcBorders>
+            <w:shd w:val="clear" w:color="auto" w:fill="F3F4F4"/>
+            <w:tcMar>
+              <w:top w:w="70" w:type="dxa"/>
+              <w:left w:w="100" w:type="dxa"/>
+              <w:bottom w:w="70" w:type="dxa"/>
+              <w:right w:w="100" w:type="dxa"/>
+            </w:tcMar>
+          </w:tcPr>
+          <w:p>
+            <w:pPr>
+              <w:spacing w:line="260" w:lineRule="auto"/>
+            </w:pPr>
+            <w:r>
+              <w:rPr>
+                <w:sz w:val="18"/>
+                <w:szCs w:val="18"/>
+              </w:rPr>
+              <w:t>(in the card copy)</w:t>
+            </w:r>
+          </w:p>
+        </w:tc>
+        <w:tc>
+          <w:tcPr>
+            <w:tcW w:w="2529" w:type="dxa"/>
+            <w:tcBorders>
+              <w:top w:val="single" w:sz="4" w:space="0" w:color="C9CCCF"/>
+              <w:left w:val="single" w:sz="4" w:space="0" w:color="C9CCCF"/>
+              <w:bottom w:val="single" w:sz="4" w:space="0" w:color="C9CCCF"/>
+              <w:right w:val="single" w:sz="4" w:space="0" w:color="C9CCCF"/>
+            </w:tcBorders>
+            <w:shd w:val="clear" w:color="auto" w:fill="F3F4F4"/>
+            <w:tcMar>
+              <w:top w:w="70" w:type="dxa"/>
+              <w:left w:w="100" w:type="dxa"/>
+              <w:bottom w:w="70" w:type="dxa"/>
+              <w:right w:w="100" w:type="dxa"/>
+            </w:tcMar>
+          </w:tcPr>
+          <w:p>
+            <w:pPr>
+              <w:spacing w:line="260" w:lineRule="auto"/>
+            </w:pPr>
+            <w:r>
+              <w:rPr>
+                <w:sz w:val="18"/>
+                <w:szCs w:val="18"/>
+              </w:rPr>
+              <w:t>Approved claim. Safe</w:t>
+            </w:r>
+          </w:p>
+        </w:tc>
+      </w:tr>
+    </w:tbl>
+    <w:p>
+      <w:pPr>
+        <w:spacing w:after="100"/>
+      </w:pPr>
+    </w:p>
+    <w:p>
+      <w:pPr>
+        <w:keepNext/>
+        <w:spacing w:after="120" w:line="300" w:lineRule="auto"/>
+      </w:pPr>
+      <w:r>
+        <w:rPr>
+          <w:b/>
+          <w:bCs/>
+        </w:rPr>
+        <w:t>Testimonial slot (use this):</w:t>
+      </w:r>
+    </w:p>
+    <w:p>
+      <w:pPr>
+        <w:spacing w:after="120" w:line="300" w:lineRule="auto"/>
+      </w:pPr>
+      <w:r>
+        <w:t>"TekRevol transformed our platform into a comprehensive and secure space where our members feel empowered."</w:t>
+      </w:r>
+    </w:p>
+    <w:p>
+      <w:pPr>
+        <w:spacing w:after="120" w:line="300" w:lineRule="auto"/>
+      </w:pPr>
+      <w:r>
+        <w:t xml:space="preserve">Libido Health Inc., from the published case study (5.0 rating). Ask TekRevol if a named person and title can be added </w:t>
+      </w:r>
+      <w:r>
+        <w:rPr>
+          <w:rFonts w:ascii="JetBrains Mono" w:eastAsia="JetBrains Mono" w:hAnsi="JetBrains Mono" w:cs="JetBrains Mono"/>
+          <w:b/>
+          <w:bCs/>
+          <w:color w:val="C23A00"/>
+          <w:sz w:val="14"/>
+          <w:szCs w:val="14"/>
+          <w:shd w:val="clear" w:color="auto" w:fill="FFE8E0"/>
+        </w:rPr>
+        <w:t xml:space="preserve"> CONFIRM </w:t>
+      </w:r>
+      <w:r>
+        <w:t>; it works without them.</w:t>
+      </w:r>
+    </w:p>
+    <w:p>
+      <w:pPr>
+        <w:keepNext/>
+        <w:spacing w:after="120" w:line="300" w:lineRule="auto"/>
+      </w:pPr>
+      <w:r>
+        <w:rPr>
+          <w:b/>
+          <w:bCs/>
+        </w:rPr>
+        <w:t>Cases reviewed and left off this page:</w:t>
+      </w:r>
+    </w:p>
+    <w:tbl>
+      <w:tblPr>
+        <w:tblW w:w="9360" w:type="dxa"/>
+        <w:tblBorders>
+          <w:top w:val="single" w:sz="4" w:space="0" w:color="auto"/>
+          <w:left w:val="single" w:sz="4" w:space="0" w:color="auto"/>
+          <w:bottom w:val="single" w:sz="4" w:space="0" w:color="auto"/>
+          <w:right w:val="single" w:sz="4" w:space="0" w:color="auto"/>
+          <w:insideH w:val="single" w:sz="4" w:space="0" w:color="auto"/>
+          <w:insideV w:val="single" w:sz="4" w:space="0" w:color="auto"/>
+        </w:tblBorders>
+        <w:tblLook w:val="04A0" w:firstRow="1" w:lastRow="0" w:firstColumn="1" w:lastColumn="0" w:noHBand="0" w:noVBand="1"/>
+      </w:tblPr>
+      <w:tblGrid>
+        <w:gridCol w:w="3960"/>
+        <w:gridCol w:w="5400"/>
+      </w:tblGrid>
+      <w:tr>
+        <w:trPr>
+          <w:cantSplit/>
+          <w:tblHeader/>
+        </w:trPr>
+        <w:tc>
+          <w:tcPr>
+            <w:tcW w:w="3960" w:type="dxa"/>
+            <w:tcBorders>
+              <w:top w:val="single" w:sz="4" w:space="0" w:color="C9CCCF"/>
+              <w:left w:val="single" w:sz="4" w:space="0" w:color="C9CCCF"/>
+              <w:bottom w:val="single" w:sz="4" w:space="0" w:color="C9CCCF"/>
+              <w:right w:val="single" w:sz="4" w:space="0" w:color="C9CCCF"/>
+            </w:tcBorders>
+            <w:shd w:val="clear" w:color="auto" w:fill="1D1E21"/>
+            <w:tcMar>
+              <w:top w:w="70" w:type="dxa"/>
+              <w:left w:w="100" w:type="dxa"/>
+              <w:bottom w:w="70" w:type="dxa"/>
+              <w:right w:w="100" w:type="dxa"/>
+            </w:tcMar>
+          </w:tcPr>
+          <w:p>
+            <w:pPr>
+              <w:spacing w:line="260" w:lineRule="auto"/>
+            </w:pPr>
             <w:r>
               <w:rPr>
                 <w:rFonts w:ascii="JetBrains Mono" w:eastAsia="JetBrains Mono" w:hAnsi="JetBrains Mono" w:cs="JetBrains Mono"/>
-                <w:b/>
-                <w:bCs/>
-                <w:color w:val="C23A00"/>
-                <w:sz w:val="14"/>
-                <w:szCs w:val="14"/>
-                <w:shd w:val="clear" w:color="auto" w:fill="FFE8E0"/>
-              </w:rPr>
-              <w:t xml:space="preserve"> CONFIRM </w:t>
-            </w:r>
-            <w:r>
-              <w:rPr>
-                <w:sz w:val="18"/>
-                <w:szCs w:val="18"/>
-              </w:rPr>
-              <w:t xml:space="preserve"> one outcome line</w:t>
+                <w:color w:val="FFFFFF"/>
+                <w:sz w:val="15"/>
+                <w:szCs w:val="15"/>
+              </w:rPr>
+              <w:t>Case</w:t>
+            </w:r>
+          </w:p>
+        </w:tc>
+        <w:tc>
+          <w:tcPr>
+            <w:tcW w:w="5400" w:type="dxa"/>
+            <w:tcBorders>
+              <w:top w:val="single" w:sz="4" w:space="0" w:color="C9CCCF"/>
+              <w:left w:val="single" w:sz="4" w:space="0" w:color="C9CCCF"/>
+              <w:bottom w:val="single" w:sz="4" w:space="0" w:color="C9CCCF"/>
+              <w:right w:val="single" w:sz="4" w:space="0" w:color="C9CCCF"/>
+            </w:tcBorders>
+            <w:shd w:val="clear" w:color="auto" w:fill="1D1E21"/>
+            <w:tcMar>
+              <w:top w:w="70" w:type="dxa"/>
+              <w:left w:w="100" w:type="dxa"/>
+              <w:bottom w:w="70" w:type="dxa"/>
+              <w:right w:w="100" w:type="dxa"/>
+            </w:tcMar>
+          </w:tcPr>
+          <w:p>
+            <w:pPr>
+              <w:spacing w:line="260" w:lineRule="auto"/>
+            </w:pPr>
+            <w:r>
+              <w:rPr>
+                <w:rFonts w:ascii="JetBrains Mono" w:eastAsia="JetBrains Mono" w:hAnsi="JetBrains Mono" w:cs="JetBrains Mono"/>
+                <w:color w:val="FFFFFF"/>
+                <w:sz w:val="15"/>
+                <w:szCs w:val="15"/>
+              </w:rPr>
+              <w:t>Why not here</w:t>
             </w:r>
           </w:p>
         </w:tc>
@@ -8309,7 +8884,70 @@
         </w:trPr>
         <w:tc>
           <w:tcPr>
-            <w:tcW w:w="3854" w:type="dxa"/>
+            <w:tcW w:w="3960" w:type="dxa"/>
+            <w:tcBorders>
+              <w:top w:val="single" w:sz="4" w:space="0" w:color="C9CCCF"/>
+              <w:left w:val="single" w:sz="4" w:space="0" w:color="C9CCCF"/>
+              <w:bottom w:val="single" w:sz="4" w:space="0" w:color="C9CCCF"/>
+              <w:right w:val="single" w:sz="4" w:space="0" w:color="C9CCCF"/>
+            </w:tcBorders>
+            <w:tcMar>
+              <w:top w:w="70" w:type="dxa"/>
+              <w:left w:w="100" w:type="dxa"/>
+              <w:bottom w:w="70" w:type="dxa"/>
+              <w:right w:w="100" w:type="dxa"/>
+            </w:tcMar>
+          </w:tcPr>
+          <w:p>
+            <w:pPr>
+              <w:spacing w:line="260" w:lineRule="auto"/>
+            </w:pPr>
+            <w:r>
+              <w:rPr>
+                <w:sz w:val="18"/>
+                <w:szCs w:val="18"/>
+              </w:rPr>
+              <w:t>MiloCare+</w:t>
+            </w:r>
+          </w:p>
+        </w:tc>
+        <w:tc>
+          <w:tcPr>
+            <w:tcW w:w="5400" w:type="dxa"/>
+            <w:tcBorders>
+              <w:top w:val="single" w:sz="4" w:space="0" w:color="C9CCCF"/>
+              <w:left w:val="single" w:sz="4" w:space="0" w:color="C9CCCF"/>
+              <w:bottom w:val="single" w:sz="4" w:space="0" w:color="C9CCCF"/>
+              <w:right w:val="single" w:sz="4" w:space="0" w:color="C9CCCF"/>
+            </w:tcBorders>
+            <w:tcMar>
+              <w:top w:w="70" w:type="dxa"/>
+              <w:left w:w="100" w:type="dxa"/>
+              <w:bottom w:w="70" w:type="dxa"/>
+              <w:right w:w="100" w:type="dxa"/>
+            </w:tcMar>
+          </w:tcPr>
+          <w:p>
+            <w:pPr>
+              <w:spacing w:line="260" w:lineRule="auto"/>
+            </w:pPr>
+            <w:r>
+              <w:rPr>
+                <w:sz w:val="18"/>
+                <w:szCs w:val="18"/>
+              </w:rPr>
+              <w:t>Consumer health records and vaccination cards. HIPAA guidelines, encryption and access control are in the body, but the "68%" figure is only on the projects list. Good backup card if one of the four drops out</w:t>
+            </w:r>
+          </w:p>
+        </w:tc>
+      </w:tr>
+      <w:tr>
+        <w:trPr>
+          <w:cantSplit/>
+        </w:trPr>
+        <w:tc>
+          <w:tcPr>
+            <w:tcW w:w="3960" w:type="dxa"/>
             <w:tcBorders>
               <w:top w:val="single" w:sz="4" w:space="0" w:color="C9CCCF"/>
               <w:left w:val="single" w:sz="4" w:space="0" w:color="C9CCCF"/>
@@ -8330,25 +8968,16 @@
             </w:pPr>
             <w:r>
               <w:rPr>
-                <w:b/>
-                <w:bCs/>
-                <w:sz w:val="18"/>
-                <w:szCs w:val="18"/>
-              </w:rPr>
-              <w:t>Rehkempers</w:t>
-            </w:r>
-            <w:r>
-              <w:rPr>
-                <w:sz w:val="18"/>
-                <w:szCs w:val="18"/>
-              </w:rPr>
-              <w:t xml:space="preserve"> (automation outside healthcare)</w:t>
-            </w:r>
-          </w:p>
-        </w:tc>
-        <w:tc>
-          <w:tcPr>
-            <w:tcW w:w="5506" w:type="dxa"/>
+                <w:sz w:val="18"/>
+                <w:szCs w:val="18"/>
+              </w:rPr>
+              <w:t>Synapptic</w:t>
+            </w:r>
+          </w:p>
+        </w:tc>
+        <w:tc>
+          <w:tcPr>
+            <w:tcW w:w="5400" w:type="dxa"/>
             <w:tcBorders>
               <w:top w:val="single" w:sz="4" w:space="0" w:color="C9CCCF"/>
               <w:left w:val="single" w:sz="4" w:space="0" w:color="C9CCCF"/>
@@ -8372,7 +9001,142 @@
                 <w:sz w:val="18"/>
                 <w:szCs w:val="18"/>
               </w:rPr>
-              <w:t>Replaced a 50-year manual pricing process across 4 manufacturing plants. The same approach applies to intake and claims work.</w:t>
+              <w:t>UK mental wellness app, 60% retentio</w:t>
+            </w:r>
+            <w:r>
+              <w:rPr>
+                <w:sz w:val="18"/>
+                <w:szCs w:val="18"/>
+              </w:rPr>
+              <w:t>n in 30 days (in the body). Consumer wellness, not provider operations. Possible proof for the behavioral health variant later</w:t>
+            </w:r>
+          </w:p>
+        </w:tc>
+      </w:tr>
+      <w:tr>
+        <w:trPr>
+          <w:cantSplit/>
+        </w:trPr>
+        <w:tc>
+          <w:tcPr>
+            <w:tcW w:w="3960" w:type="dxa"/>
+            <w:tcBorders>
+              <w:top w:val="single" w:sz="4" w:space="0" w:color="C9CCCF"/>
+              <w:left w:val="single" w:sz="4" w:space="0" w:color="C9CCCF"/>
+              <w:bottom w:val="single" w:sz="4" w:space="0" w:color="C9CCCF"/>
+              <w:right w:val="single" w:sz="4" w:space="0" w:color="C9CCCF"/>
+            </w:tcBorders>
+            <w:tcMar>
+              <w:top w:w="70" w:type="dxa"/>
+              <w:left w:w="100" w:type="dxa"/>
+              <w:bottom w:w="70" w:type="dxa"/>
+              <w:right w:w="100" w:type="dxa"/>
+            </w:tcMar>
+          </w:tcPr>
+          <w:p>
+            <w:pPr>
+              <w:spacing w:line="260" w:lineRule="auto"/>
+            </w:pPr>
+            <w:r>
+              <w:rPr>
+                <w:sz w:val="18"/>
+                <w:szCs w:val="18"/>
+              </w:rPr>
+              <w:t>Stop Vaping</w:t>
+            </w:r>
+          </w:p>
+        </w:tc>
+        <w:tc>
+          <w:tcPr>
+            <w:tcW w:w="5400" w:type="dxa"/>
+            <w:tcBorders>
+              <w:top w:val="single" w:sz="4" w:space="0" w:color="C9CCCF"/>
+              <w:left w:val="single" w:sz="4" w:space="0" w:color="C9CCCF"/>
+              <w:bottom w:val="single" w:sz="4" w:space="0" w:color="C9CCCF"/>
+              <w:right w:val="single" w:sz="4" w:space="0" w:color="C9CCCF"/>
+            </w:tcBorders>
+            <w:tcMar>
+              <w:top w:w="70" w:type="dxa"/>
+              <w:left w:w="100" w:type="dxa"/>
+              <w:bottom w:w="70" w:type="dxa"/>
+              <w:right w:w="100" w:type="dxa"/>
+            </w:tcMar>
+          </w:tcPr>
+          <w:p>
+            <w:pPr>
+              <w:spacing w:line="260" w:lineRule="auto"/>
+            </w:pPr>
+            <w:r>
+              <w:rPr>
+                <w:sz w:val="18"/>
+                <w:szCs w:val="18"/>
+              </w:rPr>
+              <w:t>Health initiative app. The "65% success rate" is only in the meta description</w:t>
+            </w:r>
+          </w:p>
+        </w:tc>
+      </w:tr>
+      <w:tr>
+        <w:trPr>
+          <w:cantSplit/>
+        </w:trPr>
+        <w:tc>
+          <w:tcPr>
+            <w:tcW w:w="3960" w:type="dxa"/>
+            <w:tcBorders>
+              <w:top w:val="single" w:sz="4" w:space="0" w:color="C9CCCF"/>
+              <w:left w:val="single" w:sz="4" w:space="0" w:color="C9CCCF"/>
+              <w:bottom w:val="single" w:sz="4" w:space="0" w:color="C9CCCF"/>
+              <w:right w:val="single" w:sz="4" w:space="0" w:color="C9CCCF"/>
+            </w:tcBorders>
+            <w:shd w:val="clear" w:color="auto" w:fill="F3F4F4"/>
+            <w:tcMar>
+              <w:top w:w="70" w:type="dxa"/>
+              <w:left w:w="100" w:type="dxa"/>
+              <w:bottom w:w="70" w:type="dxa"/>
+              <w:right w:w="100" w:type="dxa"/>
+            </w:tcMar>
+          </w:tcPr>
+          <w:p>
+            <w:pPr>
+              <w:spacing w:line="260" w:lineRule="auto"/>
+            </w:pPr>
+            <w:r>
+              <w:rPr>
+                <w:sz w:val="18"/>
+                <w:szCs w:val="18"/>
+              </w:rPr>
+              <w:t>Tamreeni, Pure Plank, AMJ Workplace Wellness</w:t>
+            </w:r>
+          </w:p>
+        </w:tc>
+        <w:tc>
+          <w:tcPr>
+            <w:tcW w:w="5400" w:type="dxa"/>
+            <w:tcBorders>
+              <w:top w:val="single" w:sz="4" w:space="0" w:color="C9CCCF"/>
+              <w:left w:val="single" w:sz="4" w:space="0" w:color="C9CCCF"/>
+              <w:bottom w:val="single" w:sz="4" w:space="0" w:color="C9CCCF"/>
+              <w:right w:val="single" w:sz="4" w:space="0" w:color="C9CCCF"/>
+            </w:tcBorders>
+            <w:shd w:val="clear" w:color="auto" w:fill="F3F4F4"/>
+            <w:tcMar>
+              <w:top w:w="70" w:type="dxa"/>
+              <w:left w:w="100" w:type="dxa"/>
+              <w:bottom w:w="70" w:type="dxa"/>
+              <w:right w:w="100" w:type="dxa"/>
+            </w:tcMar>
+          </w:tcPr>
+          <w:p>
+            <w:pPr>
+              <w:spacing w:line="260" w:lineRule="auto"/>
+            </w:pPr>
+            <w:r>
+              <w:rPr>
+                <w:sz w:val="18"/>
+                <w:szCs w:val="18"/>
+              </w:rPr>
+              <w:t>Fitness and workplace wellness. Wrong audience for an operations page</w:t>
             </w:r>
           </w:p>
         </w:tc>
@@ -8397,10 +9161,10 @@
           <w:b/>
           <w:bCs/>
         </w:rPr>
-        <w:t>Testimonial slot:</w:t>
-      </w:r>
-      <w:r>
-        <w:t xml:space="preserve"> one Clutch review from a healthcare client, with name and title </w:t>
+        <w:t>Do not use</w:t>
+      </w:r>
+      <w:r>
+        <w:t xml:space="preserve"> the four reviewer quotes on the Kinekt page (Laura Bennett, Michael Lee, Emily Garcia, James Carter). They have no organization names and read like placeholders. Ask TekRevol whether they are real before they appear anywhere </w:t>
       </w:r>
       <w:r>
         <w:rPr>
@@ -8414,9 +9178,6 @@
         </w:rPr>
         <w:t xml:space="preserve"> CONFIRM </w:t>
       </w:r>
-      <w:r>
-        <w:t xml:space="preserve"> (if none exists, use the 4.8/5 Clutch badge alone)</w:t>
-      </w:r>
     </w:p>
     <w:p>
       <w:pPr>
@@ -8435,7 +9196,10 @@
         <w:t>Rule:</w:t>
       </w:r>
       <w:r>
-        <w:t xml:space="preserve"> no case without a real outcome. If TekRevol can't confirm one, show scope and leave the number out</w:t>
+        <w:t xml:space="preserve"> no number unle</w:t>
+      </w:r>
+      <w:r>
+        <w:t>ss it appears in the case study body or TekRevol confirms it. A card with no number still works: it shows the kind of work we've done</w:t>
       </w:r>
     </w:p>
     <w:p>
@@ -8454,16 +9218,7 @@
           <w:sz w:val="34"/>
           <w:szCs w:val="34"/>
         </w:rPr>
-        <w:t>Section 10: FAQ (answer f</w:t>
-      </w:r>
-      <w:r>
-        <w:rPr>
-          <w:rFonts w:ascii="Funnel Display" w:eastAsia="Funnel Display" w:hAnsi="Funnel Display" w:cs="Funnel Display"/>
-          <w:color w:val="1D1E21"/>
-          <w:sz w:val="34"/>
-          <w:szCs w:val="34"/>
-        </w:rPr>
-        <w:t>irst, short)</w:t>
+        <w:t>Section 10: FAQ (answer first, short)</w:t>
       </w:r>
     </w:p>
     <w:tbl>
@@ -8613,7 +9368,14 @@
                 <w:sz w:val="18"/>
                 <w:szCs w:val="18"/>
               </w:rPr>
-              <w:t xml:space="preserve">It depends on the workflow and the systems involved. Your review ends with a rough cost range in writing </w:t>
+              <w:t>It depends on the workflow and the systems invol</w:t>
+            </w:r>
+            <w:r>
+              <w:rPr>
+                <w:sz w:val="18"/>
+                <w:szCs w:val="18"/>
+              </w:rPr>
+              <w:t xml:space="preserve">ved. Your review ends with a rough cost range in writing </w:t>
             </w:r>
             <w:r>
               <w:rPr>
@@ -8783,14 +9545,7 @@
                 <w:sz w:val="18"/>
                 <w:szCs w:val="18"/>
               </w:rPr>
-              <w:t>We build for HIPAA from the first spri</w:t>
-            </w:r>
-            <w:r>
-              <w:rPr>
-                <w:sz w:val="18"/>
-                <w:szCs w:val="18"/>
-              </w:rPr>
-              <w:t xml:space="preserve">nt: encryption, access controls, audit logs and private AI models. We sign a BAA </w:t>
+              <w:t xml:space="preserve">We build for HIPAA from the first sprint: encryption, access controls, audit logs and private AI models. We sign a BAA </w:t>
             </w:r>
             <w:r>
               <w:rPr>
@@ -8941,7 +9696,14 @@
                 <w:sz w:val="18"/>
                 <w:szCs w:val="18"/>
               </w:rPr>
-              <w:t>It replaces tasks, not people. The aim is fewer late nights for coordinators and clinicians, and more of their time on patients.</w:t>
+              <w:t>It replaces tasks, not people. The aim is fewer late nights for coordinators a</w:t>
+            </w:r>
+            <w:r>
+              <w:rPr>
+                <w:sz w:val="18"/>
+                <w:szCs w:val="18"/>
+              </w:rPr>
+              <w:t>nd clinicians, and more of their time on patients.</w:t>
             </w:r>
           </w:p>
         </w:tc>
@@ -10328,14 +11090,14 @@
                 <w:sz w:val="18"/>
                 <w:szCs w:val="18"/>
               </w:rPr>
-              <w:t xml:space="preserve"> as the work that costs your team the most time, so that's where we'll start. If you haven't booked a time yet, here's the link: [booking link]. On the call we'll walk through h</w:t>
-            </w:r>
-            <w:r>
-              <w:rPr>
-                <w:sz w:val="18"/>
-                <w:szCs w:val="18"/>
-              </w:rPr>
-              <w:t>ow that work runs today, and within 2 business days you'll have a written plan for the first 3 workflows to automate. If it's easier, reply with a good time and your number, and I'll call you. [Name]</w:t>
+              <w:t xml:space="preserve"> as the work that costs your team the most time, so that's where we'll start. If you haven't booked a time yet, here's the link: [booking link]. On the call we'll walk through how that work runs today, and within 2 business days you'll have a written plan </w:t>
+            </w:r>
+            <w:r>
+              <w:rPr>
+                <w:sz w:val="18"/>
+                <w:szCs w:val="18"/>
+              </w:rPr>
+              <w:t>for the first 3 workflows to automate. If it's easier, reply with a good time and your number, and I'll call you. [Name]</w:t>
             </w:r>
           </w:p>
         </w:tc>
@@ -12728,7 +13490,7 @@
                 <w:sz w:val="18"/>
                 <w:szCs w:val="18"/>
               </w:rPr>
-              <w:t>One outcome line each for MiloCare, Nurse Practitioners, Kinekt</w:t>
+              <w:t>Nurse Practitioners "40% shorter wait times" (meta description only) and Kinekt "45% engagement" vs "30% faster response" (pick one)</w:t>
             </w:r>
           </w:p>
         </w:tc>
@@ -12758,7 +13520,7 @@
                 <w:sz w:val="18"/>
                 <w:szCs w:val="18"/>
               </w:rPr>
-              <w:t>Proof section</w:t>
+              <w:t>Proof section numbers</w:t>
             </w:r>
           </w:p>
         </w:tc>
@@ -12821,7 +13583,7 @@
                 <w:sz w:val="18"/>
                 <w:szCs w:val="18"/>
               </w:rPr>
-              <w:t>A healthcare client Clutch review we can quote</w:t>
+              <w:t>A named person and title for the Libido Health quote; whether the Kinekt reviewer quotes are real</w:t>
             </w:r>
           </w:p>
         </w:tc>
@@ -13264,10 +14026,7 @@
         <w:spacing w:after="80" w:line="290" w:lineRule="auto"/>
       </w:pPr>
       <w:r>
-        <w:t>Updat</w:t>
-      </w:r>
-      <w:r>
-        <w:t>e the ads in Ads Manager to the matching copy once the page is live</w:t>
+        <w:t>Update the ads in Ads Manager to the matching copy once the page is live</w:t>
       </w:r>
     </w:p>
     <w:sectPr>
@@ -13387,10 +14146,131 @@
 <file path=word/numbering.xml><?xml version="1.0" encoding="utf-8"?>
 <w:numbering xmlns:wpc="http://schemas.microsoft.com/office/word/2010/wordprocessingCanvas" xmlns:cx="http://schemas.microsoft.com/office/drawing/2014/chartex" xmlns:cx1="http://schemas.microsoft.com/office/drawing/2015/9/8/chartex" xmlns:cx2="http://schemas.microsoft.com/office/drawing/2015/10/21/chartex" xmlns:cx3="http://schemas.microsoft.com/office/drawing/2016/5/9/chartex" xmlns:cx4="http://schemas.microsoft.com/office/drawing/2016/5/10/chartex" xmlns:cx5="http://schemas.microsoft.com/office/drawing/2016/5/11/chartex" xmlns:cx6="http://schemas.microsoft.com/office/drawing/2016/5/12/chartex" xmlns:cx7="http://schemas.microsoft.com/office/drawing/2016/5/13/chartex" xmlns:cx8="http://schemas.microsoft.com/office/drawing/2016/5/14/chartex" xmlns:mc="http://schemas.openxmlformats.org/markup-compatibility/2006" xmlns:aink="http://schemas.microsoft.com/office/drawing/2016/ink" xmlns:am3d="http://schemas.microsoft.com/office/drawing/2017/model3d" xmlns:o="urn:schemas-microsoft-com:office:office" xmlns:r="http://schemas.openxmlformats.org/officeDocument/2006/relationships" xmlns:m="http://schemas.openxmlformats.org/officeDocument/2006/math" xmlns:v="urn:schemas-microsoft-com:vml" xmlns:wp14="http://schemas.microsoft.com/office/word/2010/wordprocessingDrawing" xmlns:wp="http://schemas.openxmlformats.org/drawingml/2006/wordprocessingDrawing" xmlns:w10="urn:schemas-microsoft-com:office:word" xmlns:w="http://schemas.openxmlformats.org/wordprocessingml/2006/main" xmlns:w14="http://schemas.microsoft.com/office/word/2010/wordml" xmlns:w15="http://schemas.microsoft.com/office/word/2012/wordml" xmlns:w16cid="http://schemas.microsoft.com/office/word/2016/wordml/cid" xmlns:w16se="http://schemas.microsoft.com/office/word/2015/wordml/symex" xmlns:wpg="http://schemas.microsoft.com/office/word/2010/wordprocessingGroup" xmlns:wpi="http://schemas.microsoft.com/office/word/2010/wordprocessingInk" xmlns:wne="http://schemas.microsoft.com/office/word/2006/wordml" xmlns:wps="http://schemas.microsoft.com/office/word/2010/wordprocessingShape" mc:Ignorable="w14 w15 w16se w16cid wp14">
   <w:abstractNum w:abstractNumId="0" w15:restartNumberingAfterBreak="0">
-    <w:nsid w:val="0F4C02AB"/>
+    <w:nsid w:val="0A580829"/>
     <w:multiLevelType w:val="hybridMultilevel"/>
-    <w:tmpl w:val="F976D9A0"/>
-    <w:lvl w:ilvl="0" w:tplc="73B66FA4" w:tentative="1">
+    <w:tmpl w:val="81123246"/>
+    <w:lvl w:ilvl="0" w:tplc="F2E6E79C" w:tentative="1">
+      <w:start w:val="1"/>
+      <w:numFmt w:val="bullet"/>
+      <w:lvlText w:val="☑"/>
+      <w:lvlJc w:val="left"/>
+      <w:pPr>
+        <w:ind w:left="400" w:hanging="340"/>
+      </w:pPr>
+      <w:rPr>
+        <w:color w:val="FF4A1C"/>
+      </w:rPr>
+    </w:lvl>
+    <w:lvl w:ilvl="1" w:tplc="DF22B558">
+      <w:numFmt w:val="decimal"/>
+      <w:lvlText w:val=""/>
+      <w:lvlJc w:val="left"/>
+    </w:lvl>
+    <w:lvl w:ilvl="2" w:tplc="84D09CDE">
+      <w:numFmt w:val="decimal"/>
+      <w:lvlText w:val=""/>
+      <w:lvlJc w:val="left"/>
+    </w:lvl>
+    <w:lvl w:ilvl="3" w:tplc="89F614AC">
+      <w:numFmt w:val="decimal"/>
+      <w:lvlText w:val=""/>
+      <w:lvlJc w:val="left"/>
+    </w:lvl>
+    <w:lvl w:ilvl="4" w:tplc="47CCD104">
+      <w:numFmt w:val="decimal"/>
+      <w:lvlText w:val=""/>
+      <w:lvlJc w:val="left"/>
+    </w:lvl>
+    <w:lvl w:ilvl="5" w:tplc="13261716">
+      <w:numFmt w:val="decimal"/>
+      <w:lvlText w:val=""/>
+      <w:lvlJc w:val="left"/>
+    </w:lvl>
+    <w:lvl w:ilvl="6" w:tplc="1B025B5E">
+      <w:numFmt w:val="decimal"/>
+      <w:lvlText w:val=""/>
+      <w:lvlJc w:val="left"/>
+    </w:lvl>
+    <w:lvl w:ilvl="7" w:tplc="78D02A30">
+      <w:numFmt w:val="decimal"/>
+      <w:lvlText w:val=""/>
+      <w:lvlJc w:val="left"/>
+    </w:lvl>
+    <w:lvl w:ilvl="8" w:tplc="D7F2F7BE">
+      <w:numFmt w:val="decimal"/>
+      <w:lvlText w:val=""/>
+      <w:lvlJc w:val="left"/>
+    </w:lvl>
+  </w:abstractNum>
+  <w:abstractNum w:abstractNumId="1" w15:restartNumberingAfterBreak="0">
+    <w:nsid w:val="1331671F"/>
+    <w:multiLevelType w:val="hybridMultilevel"/>
+    <w:tmpl w:val="A6D6072E"/>
+    <w:lvl w:ilvl="0" w:tplc="BA7A4AA4">
+      <w:start w:val="1"/>
+      <w:numFmt w:val="bullet"/>
+      <w:lvlText w:val="•"/>
+      <w:lvlJc w:val="left"/>
+      <w:pPr>
+        <w:ind w:left="360" w:hanging="260"/>
+      </w:pPr>
+      <w:rPr>
+        <w:color w:val="FF4A1C"/>
+      </w:rPr>
+    </w:lvl>
+    <w:lvl w:ilvl="1" w:tplc="E8B4EA66" w:tentative="1">
+      <w:start w:val="1"/>
+      <w:numFmt w:val="bullet"/>
+      <w:lvlText w:val="–"/>
+      <w:lvlJc w:val="left"/>
+      <w:pPr>
+        <w:ind w:left="900" w:hanging="260"/>
+      </w:pPr>
+      <w:rPr>
+        <w:color w:val="5E6166"/>
+      </w:rPr>
+    </w:lvl>
+    <w:lvl w:ilvl="2" w:tplc="09987A54">
+      <w:numFmt w:val="decimal"/>
+      <w:lvlText w:val=""/>
+      <w:lvlJc w:val="left"/>
+    </w:lvl>
+    <w:lvl w:ilvl="3" w:tplc="4A6C6B28">
+      <w:numFmt w:val="decimal"/>
+      <w:lvlText w:val=""/>
+      <w:lvlJc w:val="left"/>
+    </w:lvl>
+    <w:lvl w:ilvl="4" w:tplc="758AAFC8">
+      <w:numFmt w:val="decimal"/>
+      <w:lvlText w:val=""/>
+      <w:lvlJc w:val="left"/>
+    </w:lvl>
+    <w:lvl w:ilvl="5" w:tplc="3F62E2BE">
+      <w:numFmt w:val="decimal"/>
+      <w:lvlText w:val=""/>
+      <w:lvlJc w:val="left"/>
+    </w:lvl>
+    <w:lvl w:ilvl="6" w:tplc="47806B40">
+      <w:numFmt w:val="decimal"/>
+      <w:lvlText w:val=""/>
+      <w:lvlJc w:val="left"/>
+    </w:lvl>
+    <w:lvl w:ilvl="7" w:tplc="F4E6C53A">
+      <w:numFmt w:val="decimal"/>
+      <w:lvlText w:val=""/>
+      <w:lvlJc w:val="left"/>
+    </w:lvl>
+    <w:lvl w:ilvl="8" w:tplc="EEBA0262">
+      <w:numFmt w:val="decimal"/>
+      <w:lvlText w:val=""/>
+      <w:lvlJc w:val="left"/>
+    </w:lvl>
+  </w:abstractNum>
+  <w:abstractNum w:abstractNumId="2" w15:restartNumberingAfterBreak="0">
+    <w:nsid w:val="157975F7"/>
+    <w:multiLevelType w:val="hybridMultilevel"/>
+    <w:tmpl w:val="CB8E9C56"/>
+    <w:lvl w:ilvl="0" w:tplc="15082D44" w:tentative="1">
       <w:start w:val="1"/>
       <w:numFmt w:val="bullet"/>
       <w:lvlText w:val="●"/>
@@ -13399,7 +14279,7 @@
         <w:ind w:left="720" w:hanging="360"/>
       </w:pPr>
     </w:lvl>
-    <w:lvl w:ilvl="1" w:tplc="83548D60" w:tentative="1">
+    <w:lvl w:ilvl="1" w:tplc="D63C6078" w:tentative="1">
       <w:start w:val="1"/>
       <w:numFmt w:val="bullet"/>
       <w:lvlText w:val="○"/>
@@ -13408,7 +14288,7 @@
         <w:ind w:left="1440" w:hanging="360"/>
       </w:pPr>
     </w:lvl>
-    <w:lvl w:ilvl="2" w:tplc="075E216A" w:tentative="1">
+    <w:lvl w:ilvl="2" w:tplc="6B4A7F4A" w:tentative="1">
       <w:start w:val="1"/>
       <w:numFmt w:val="bullet"/>
       <w:lvlText w:val="■"/>
@@ -13417,7 +14297,7 @@
         <w:ind w:left="2160" w:hanging="360"/>
       </w:pPr>
     </w:lvl>
-    <w:lvl w:ilvl="3" w:tplc="6B56235E" w:tentative="1">
+    <w:lvl w:ilvl="3" w:tplc="BE94C486" w:tentative="1">
       <w:start w:val="1"/>
       <w:numFmt w:val="bullet"/>
       <w:lvlText w:val="●"/>
@@ -13426,7 +14306,7 @@
         <w:ind w:left="2880" w:hanging="360"/>
       </w:pPr>
     </w:lvl>
-    <w:lvl w:ilvl="4" w:tplc="36E8DD02" w:tentative="1">
+    <w:lvl w:ilvl="4" w:tplc="BCF6B6E0" w:tentative="1">
       <w:start w:val="1"/>
       <w:numFmt w:val="bullet"/>
       <w:lvlText w:val="○"/>
@@ -13435,7 +14315,7 @@
         <w:ind w:left="3600" w:hanging="360"/>
       </w:pPr>
     </w:lvl>
-    <w:lvl w:ilvl="5" w:tplc="11E0FF88" w:tentative="1">
+    <w:lvl w:ilvl="5" w:tplc="2E584EF0" w:tentative="1">
       <w:start w:val="1"/>
       <w:numFmt w:val="bullet"/>
       <w:lvlText w:val="■"/>
@@ -13444,7 +14324,7 @@
         <w:ind w:left="4320" w:hanging="360"/>
       </w:pPr>
     </w:lvl>
-    <w:lvl w:ilvl="6" w:tplc="D1424F0E" w:tentative="1">
+    <w:lvl w:ilvl="6" w:tplc="9EEC3FB2" w:tentative="1">
       <w:start w:val="1"/>
       <w:numFmt w:val="bullet"/>
       <w:lvlText w:val="●"/>
@@ -13453,7 +14333,7 @@
         <w:ind w:left="5040" w:hanging="360"/>
       </w:pPr>
     </w:lvl>
-    <w:lvl w:ilvl="7" w:tplc="409ADF7E" w:tentative="1">
+    <w:lvl w:ilvl="7" w:tplc="2182C72C" w:tentative="1">
       <w:start w:val="1"/>
       <w:numFmt w:val="bullet"/>
       <w:lvlText w:val="●"/>
@@ -13462,7 +14342,7 @@
         <w:ind w:left="5760" w:hanging="360"/>
       </w:pPr>
     </w:lvl>
-    <w:lvl w:ilvl="8" w:tplc="A7F4E328" w:tentative="1">
+    <w:lvl w:ilvl="8" w:tplc="87A07B5E" w:tentative="1">
       <w:start w:val="1"/>
       <w:numFmt w:val="bullet"/>
       <w:lvlText w:val="●"/>
@@ -13472,11 +14352,11 @@
       </w:pPr>
     </w:lvl>
   </w:abstractNum>
-  <w:abstractNum w:abstractNumId="1" w15:restartNumberingAfterBreak="0">
-    <w:nsid w:val="21E80124"/>
+  <w:abstractNum w:abstractNumId="3" w15:restartNumberingAfterBreak="0">
+    <w:nsid w:val="5AA40C8B"/>
     <w:multiLevelType w:val="hybridMultilevel"/>
-    <w:tmpl w:val="F6943AD8"/>
-    <w:lvl w:ilvl="0" w:tplc="F1DE586C" w:tentative="1">
+    <w:tmpl w:val="E8989CC8"/>
+    <w:lvl w:ilvl="0" w:tplc="0F7A2406" w:tentative="1">
       <w:start w:val="1"/>
       <w:numFmt w:val="decimal"/>
       <w:lvlText w:val="%1."/>
@@ -13489,52 +14369,52 @@
         <w:color w:val="C23A00"/>
       </w:rPr>
     </w:lvl>
-    <w:lvl w:ilvl="1" w:tplc="8F9861DE">
+    <w:lvl w:ilvl="1" w:tplc="669AA450">
       <w:numFmt w:val="decimal"/>
       <w:lvlText w:val=""/>
       <w:lvlJc w:val="left"/>
     </w:lvl>
-    <w:lvl w:ilvl="2" w:tplc="16287F34">
+    <w:lvl w:ilvl="2" w:tplc="17DA4FF8">
       <w:numFmt w:val="decimal"/>
       <w:lvlText w:val=""/>
       <w:lvlJc w:val="left"/>
     </w:lvl>
-    <w:lvl w:ilvl="3" w:tplc="810AD8E4">
+    <w:lvl w:ilvl="3" w:tplc="53B0E1EC">
       <w:numFmt w:val="decimal"/>
       <w:lvlText w:val=""/>
       <w:lvlJc w:val="left"/>
     </w:lvl>
-    <w:lvl w:ilvl="4" w:tplc="46AA3748">
+    <w:lvl w:ilvl="4" w:tplc="AC42F688">
       <w:numFmt w:val="decimal"/>
       <w:lvlText w:val=""/>
       <w:lvlJc w:val="left"/>
     </w:lvl>
-    <w:lvl w:ilvl="5" w:tplc="1EA04A46">
+    <w:lvl w:ilvl="5" w:tplc="499AE894">
       <w:numFmt w:val="decimal"/>
       <w:lvlText w:val=""/>
       <w:lvlJc w:val="left"/>
     </w:lvl>
-    <w:lvl w:ilvl="6" w:tplc="CE009340">
+    <w:lvl w:ilvl="6" w:tplc="35F2DDD6">
       <w:numFmt w:val="decimal"/>
       <w:lvlText w:val=""/>
       <w:lvlJc w:val="left"/>
     </w:lvl>
-    <w:lvl w:ilvl="7" w:tplc="6A500DD8">
+    <w:lvl w:ilvl="7" w:tplc="1452087A">
       <w:numFmt w:val="decimal"/>
       <w:lvlText w:val=""/>
       <w:lvlJc w:val="left"/>
     </w:lvl>
-    <w:lvl w:ilvl="8" w:tplc="773E2738">
+    <w:lvl w:ilvl="8" w:tplc="AD0642E4">
       <w:numFmt w:val="decimal"/>
       <w:lvlText w:val=""/>
       <w:lvlJc w:val="left"/>
     </w:lvl>
   </w:abstractNum>
-  <w:abstractNum w:abstractNumId="2" w15:restartNumberingAfterBreak="0">
-    <w:nsid w:val="2E831730"/>
+  <w:abstractNum w:abstractNumId="4" w15:restartNumberingAfterBreak="0">
+    <w:nsid w:val="6B376847"/>
     <w:multiLevelType w:val="hybridMultilevel"/>
-    <w:tmpl w:val="648CC56E"/>
-    <w:lvl w:ilvl="0" w:tplc="8B221694" w:tentative="1">
+    <w:tmpl w:val="74DED3F6"/>
+    <w:lvl w:ilvl="0" w:tplc="1632D280" w:tentative="1">
       <w:start w:val="1"/>
       <w:numFmt w:val="bullet"/>
       <w:lvlText w:val="☐"/>
@@ -13546,188 +14426,67 @@
         <w:color w:val="FF4A1C"/>
       </w:rPr>
     </w:lvl>
-    <w:lvl w:ilvl="1" w:tplc="949463C6">
+    <w:lvl w:ilvl="1" w:tplc="33104D36">
       <w:numFmt w:val="decimal"/>
       <w:lvlText w:val=""/>
       <w:lvlJc w:val="left"/>
     </w:lvl>
-    <w:lvl w:ilvl="2" w:tplc="058039DA">
+    <w:lvl w:ilvl="2" w:tplc="8C96BCBA">
       <w:numFmt w:val="decimal"/>
       <w:lvlText w:val=""/>
       <w:lvlJc w:val="left"/>
     </w:lvl>
-    <w:lvl w:ilvl="3" w:tplc="C84CC1F0">
+    <w:lvl w:ilvl="3" w:tplc="BE06996E">
       <w:numFmt w:val="decimal"/>
       <w:lvlText w:val=""/>
       <w:lvlJc w:val="left"/>
     </w:lvl>
-    <w:lvl w:ilvl="4" w:tplc="CC8E06BA">
+    <w:lvl w:ilvl="4" w:tplc="8F509602">
       <w:numFmt w:val="decimal"/>
       <w:lvlText w:val=""/>
       <w:lvlJc w:val="left"/>
     </w:lvl>
-    <w:lvl w:ilvl="5" w:tplc="46AA70A0">
+    <w:lvl w:ilvl="5" w:tplc="416EAA04">
       <w:numFmt w:val="decimal"/>
       <w:lvlText w:val=""/>
       <w:lvlJc w:val="left"/>
     </w:lvl>
-    <w:lvl w:ilvl="6" w:tplc="0BF04DAC">
+    <w:lvl w:ilvl="6" w:tplc="CFCEABAA">
       <w:numFmt w:val="decimal"/>
       <w:lvlText w:val=""/>
       <w:lvlJc w:val="left"/>
     </w:lvl>
-    <w:lvl w:ilvl="7" w:tplc="1F402358">
+    <w:lvl w:ilvl="7" w:tplc="130ACC96">
       <w:numFmt w:val="decimal"/>
       <w:lvlText w:val=""/>
       <w:lvlJc w:val="left"/>
     </w:lvl>
-    <w:lvl w:ilvl="8" w:tplc="5C8E264C">
-      <w:numFmt w:val="decimal"/>
-      <w:lvlText w:val=""/>
-      <w:lvlJc w:val="left"/>
-    </w:lvl>
-  </w:abstractNum>
-  <w:abstractNum w:abstractNumId="3" w15:restartNumberingAfterBreak="0">
-    <w:nsid w:val="57C60763"/>
-    <w:multiLevelType w:val="hybridMultilevel"/>
-    <w:tmpl w:val="0D5AB8AA"/>
-    <w:lvl w:ilvl="0" w:tplc="E9167C12" w:tentative="1">
-      <w:start w:val="1"/>
-      <w:numFmt w:val="bullet"/>
-      <w:lvlText w:val="☑"/>
-      <w:lvlJc w:val="left"/>
-      <w:pPr>
-        <w:ind w:left="400" w:hanging="340"/>
-      </w:pPr>
-      <w:rPr>
-        <w:color w:val="FF4A1C"/>
-      </w:rPr>
-    </w:lvl>
-    <w:lvl w:ilvl="1" w:tplc="464E8462">
-      <w:numFmt w:val="decimal"/>
-      <w:lvlText w:val=""/>
-      <w:lvlJc w:val="left"/>
-    </w:lvl>
-    <w:lvl w:ilvl="2" w:tplc="0FCEB502">
-      <w:numFmt w:val="decimal"/>
-      <w:lvlText w:val=""/>
-      <w:lvlJc w:val="left"/>
-    </w:lvl>
-    <w:lvl w:ilvl="3" w:tplc="839A43B8">
-      <w:numFmt w:val="decimal"/>
-      <w:lvlText w:val=""/>
-      <w:lvlJc w:val="left"/>
-    </w:lvl>
-    <w:lvl w:ilvl="4" w:tplc="4D7848D6">
-      <w:numFmt w:val="decimal"/>
-      <w:lvlText w:val=""/>
-      <w:lvlJc w:val="left"/>
-    </w:lvl>
-    <w:lvl w:ilvl="5" w:tplc="ADFC2EB4">
-      <w:numFmt w:val="decimal"/>
-      <w:lvlText w:val=""/>
-      <w:lvlJc w:val="left"/>
-    </w:lvl>
-    <w:lvl w:ilvl="6" w:tplc="304EAED0">
-      <w:numFmt w:val="decimal"/>
-      <w:lvlText w:val=""/>
-      <w:lvlJc w:val="left"/>
-    </w:lvl>
-    <w:lvl w:ilvl="7" w:tplc="F710C0FC">
-      <w:numFmt w:val="decimal"/>
-      <w:lvlText w:val=""/>
-      <w:lvlJc w:val="left"/>
-    </w:lvl>
-    <w:lvl w:ilvl="8" w:tplc="343A22D2">
-      <w:numFmt w:val="decimal"/>
-      <w:lvlText w:val=""/>
-      <w:lvlJc w:val="left"/>
-    </w:lvl>
-  </w:abstractNum>
-  <w:abstractNum w:abstractNumId="4" w15:restartNumberingAfterBreak="0">
-    <w:nsid w:val="78D6086D"/>
-    <w:multiLevelType w:val="hybridMultilevel"/>
-    <w:tmpl w:val="E2F8CF90"/>
-    <w:lvl w:ilvl="0" w:tplc="3BE07A2C">
-      <w:start w:val="1"/>
-      <w:numFmt w:val="bullet"/>
-      <w:lvlText w:val="•"/>
-      <w:lvlJc w:val="left"/>
-      <w:pPr>
-        <w:ind w:left="360" w:hanging="260"/>
-      </w:pPr>
-      <w:rPr>
-        <w:color w:val="FF4A1C"/>
-      </w:rPr>
-    </w:lvl>
-    <w:lvl w:ilvl="1" w:tplc="808CEFBE" w:tentative="1">
-      <w:start w:val="1"/>
-      <w:numFmt w:val="bullet"/>
-      <w:lvlText w:val="–"/>
-      <w:lvlJc w:val="left"/>
-      <w:pPr>
-        <w:ind w:left="900" w:hanging="260"/>
-      </w:pPr>
-      <w:rPr>
-        <w:color w:val="5E6166"/>
-      </w:rPr>
-    </w:lvl>
-    <w:lvl w:ilvl="2" w:tplc="FBD00F66">
-      <w:numFmt w:val="decimal"/>
-      <w:lvlText w:val=""/>
-      <w:lvlJc w:val="left"/>
-    </w:lvl>
-    <w:lvl w:ilvl="3" w:tplc="24B8206E">
-      <w:numFmt w:val="decimal"/>
-      <w:lvlText w:val=""/>
-      <w:lvlJc w:val="left"/>
-    </w:lvl>
-    <w:lvl w:ilvl="4" w:tplc="74D0EA0A">
-      <w:numFmt w:val="decimal"/>
-      <w:lvlText w:val=""/>
-      <w:lvlJc w:val="left"/>
-    </w:lvl>
-    <w:lvl w:ilvl="5" w:tplc="47C60600">
-      <w:numFmt w:val="decimal"/>
-      <w:lvlText w:val=""/>
-      <w:lvlJc w:val="left"/>
-    </w:lvl>
-    <w:lvl w:ilvl="6" w:tplc="ABE881EE">
-      <w:numFmt w:val="decimal"/>
-      <w:lvlText w:val=""/>
-      <w:lvlJc w:val="left"/>
-    </w:lvl>
-    <w:lvl w:ilvl="7" w:tplc="1E74CB3E">
-      <w:numFmt w:val="decimal"/>
-      <w:lvlText w:val=""/>
-      <w:lvlJc w:val="left"/>
-    </w:lvl>
-    <w:lvl w:ilvl="8" w:tplc="92FE9974">
+    <w:lvl w:ilvl="8" w:tplc="54C8D580">
       <w:numFmt w:val="decimal"/>
       <w:lvlText w:val=""/>
       <w:lvlJc w:val="left"/>
     </w:lvl>
   </w:abstractNum>
   <w:num w:numId="1">
-    <w:abstractNumId w:val="0"/>
+    <w:abstractNumId w:val="2"/>
     <w:lvlOverride w:ilvl="0">
       <w:startOverride w:val="1"/>
     </w:lvlOverride>
   </w:num>
   <w:num w:numId="2">
-    <w:abstractNumId w:val="4"/>
+    <w:abstractNumId w:val="1"/>
     <w:lvlOverride w:ilvl="0">
       <w:startOverride w:val="1"/>
     </w:lvlOverride>
   </w:num>
   <w:num w:numId="3">
-    <w:abstractNumId w:val="1"/>
+    <w:abstractNumId w:val="3"/>
     <w:lvlOverride w:ilvl="0">
       <w:startOverride w:val="1"/>
     </w:lvlOverride>
   </w:num>
   <w:num w:numId="4">
-    <w:abstractNumId w:val="2"/>
+    <w:abstractNumId w:val="4"/>
     <w:lvlOverride w:ilvl="0">
       <w:startOverride w:val="1"/>
     </w:lvlOverride>

</xml_diff>

<commit_message>
Auto-save: 1 file(s) — 2026-10-16 17:05
</commit_message>
<xml_diff>
--- a/Projects/TekRevol/03-website/TekRevol-Healthcare-AI-Ops-Landing-Page-Copy-v1-Cover-A.docx
+++ b/Projects/TekRevol/03-website/TekRevol-Healthcare-AI-Ops-Landing-Page-Copy-v1-Cover-A.docx
@@ -6,8 +6,6 @@
       <w:pPr>
         <w:spacing w:before="11250" w:after="80"/>
       </w:pPr>
-      <w:bookmarkStart w:id="0" w:name="_GoBack"/>
-      <w:bookmarkEnd w:id="0"/>
       <w:r>
         <w:rPr>
           <w:noProof/>
@@ -116,10 +114,18 @@
         <w:t>What this is:</w:t>
       </w:r>
       <w:r>
-        <w:t xml:space="preserve"> full copy for the dedicated ChatGPT Ads landing page recommended in 2026-10-15-chatgpt-ads-healthcare-landing-page-audit (action 2). It covers the page, its hero variants per ad group, the form, the thank-you page, the first follow-up email, the matching </w:t>
-      </w:r>
-      <w:r>
-        <w:t>ad copy and the tracking it needs.</w:t>
+        <w:t xml:space="preserve"> full copy for the dedicated </w:t>
+      </w:r>
+      <w:proofErr w:type="spellStart"/>
+      <w:r>
+        <w:t>ChatGPT</w:t>
+      </w:r>
+      <w:proofErr w:type="spellEnd"/>
+      <w:r>
+        <w:t xml:space="preserve"> Ads landing page recommended in 2026-10-15-chatgpt-ads-healthcare-landing-page-audit (action 2). It covers the page, its hero variants per ad group, the form, the thank-you page, the first follow-up email, the matching ad copy and the tracking it needs.</w:t>
+      </w:r>
+      <w:r>
+        <w:t xml:space="preserve"> </w:t>
       </w:r>
     </w:p>
     <w:p>
@@ -144,7 +150,15 @@
         <w:t>5% or more</w:t>
       </w:r>
       <w:r>
-        <w:t xml:space="preserve"> on healthcare ChatGPT Ads traffic.</w:t>
+        <w:t xml:space="preserve"> on healthcare </w:t>
+      </w:r>
+      <w:proofErr w:type="spellStart"/>
+      <w:r>
+        <w:t>ChatGPT</w:t>
+      </w:r>
+      <w:proofErr w:type="spellEnd"/>
+      <w:r>
+        <w:t xml:space="preserve"> Ads traffic.</w:t>
       </w:r>
     </w:p>
     <w:p>
@@ -159,7 +173,11 @@
         <w:t>Status:</w:t>
       </w:r>
       <w:r>
-        <w:t xml:space="preserve"> draft for Sana's review. Items marked </w:t>
+        <w:t xml:space="preserve"> draft for Sana's review. Items </w:t>
+      </w:r>
+      <w:proofErr w:type="gramStart"/>
+      <w:r>
+        <w:t xml:space="preserve">marked </w:t>
       </w:r>
       <w:r>
         <w:rPr>
@@ -171,11 +189,9 @@
           <w:szCs w:val="14"/>
           <w:shd w:val="clear" w:color="auto" w:fill="FFE8E0"/>
         </w:rPr>
-        <w:t xml:space="preserve"> CONFIRM </w:t>
-      </w:r>
-      <w:r>
-        <w:t xml:space="preserve"> need a yes from TekRevol before launch. Nothing goes live with a </w:t>
-      </w:r>
+        <w:t xml:space="preserve"> CONFIRM</w:t>
+      </w:r>
+      <w:proofErr w:type="gramEnd"/>
       <w:r>
         <w:rPr>
           <w:rFonts w:ascii="JetBrains Mono" w:eastAsia="JetBrains Mono" w:hAnsi="JetBrains Mono" w:cs="JetBrains Mono"/>
@@ -186,13 +202,50 @@
           <w:szCs w:val="14"/>
           <w:shd w:val="clear" w:color="auto" w:fill="FFE8E0"/>
         </w:rPr>
-        <w:t xml:space="preserve"> CONFIRM </w:t>
-      </w:r>
-      <w:r>
-        <w:t xml:space="preserve"> left in it: either co</w:t>
-      </w:r>
-      <w:r>
-        <w:t>nfirm it or delete the line.</w:t>
+        <w:t xml:space="preserve"> </w:t>
+      </w:r>
+      <w:r>
+        <w:t xml:space="preserve"> need a yes from </w:t>
+      </w:r>
+      <w:proofErr w:type="spellStart"/>
+      <w:r>
+        <w:t>TekRevol</w:t>
+      </w:r>
+      <w:proofErr w:type="spellEnd"/>
+      <w:r>
+        <w:t xml:space="preserve"> before launch. Nothing goes live with </w:t>
+      </w:r>
+      <w:proofErr w:type="gramStart"/>
+      <w:r>
+        <w:t xml:space="preserve">a </w:t>
+      </w:r>
+      <w:r>
+        <w:rPr>
+          <w:rFonts w:ascii="JetBrains Mono" w:eastAsia="JetBrains Mono" w:hAnsi="JetBrains Mono" w:cs="JetBrains Mono"/>
+          <w:b/>
+          <w:bCs/>
+          <w:color w:val="C23A00"/>
+          <w:sz w:val="14"/>
+          <w:szCs w:val="14"/>
+          <w:shd w:val="clear" w:color="auto" w:fill="FFE8E0"/>
+        </w:rPr>
+        <w:t xml:space="preserve"> CONFIRM</w:t>
+      </w:r>
+      <w:proofErr w:type="gramEnd"/>
+      <w:r>
+        <w:rPr>
+          <w:rFonts w:ascii="JetBrains Mono" w:eastAsia="JetBrains Mono" w:hAnsi="JetBrains Mono" w:cs="JetBrains Mono"/>
+          <w:b/>
+          <w:bCs/>
+          <w:color w:val="C23A00"/>
+          <w:sz w:val="14"/>
+          <w:szCs w:val="14"/>
+          <w:shd w:val="clear" w:color="auto" w:fill="FFE8E0"/>
+        </w:rPr>
+        <w:t xml:space="preserve"> </w:t>
+      </w:r>
+      <w:r>
+        <w:t xml:space="preserve"> left in it: either confirm it or delete the line.</w:t>
       </w:r>
     </w:p>
     <w:p>
@@ -207,7 +260,31 @@
         <w:t>Voice:</w:t>
       </w:r>
       <w:r>
-        <w:t xml:space="preserve"> TekRevol rules apply. No em dashes, active voice, approved claims only, no rival or tool names, no home-based care product names, no speed or cost claims about TekRevol's delivery.</w:t>
+        <w:t xml:space="preserve"> </w:t>
+      </w:r>
+      <w:proofErr w:type="spellStart"/>
+      <w:r>
+        <w:t>TekRevol</w:t>
+      </w:r>
+      <w:proofErr w:type="spellEnd"/>
+      <w:r>
+        <w:t xml:space="preserve"> rules apply. No </w:t>
+      </w:r>
+      <w:proofErr w:type="spellStart"/>
+      <w:r>
+        <w:t>em</w:t>
+      </w:r>
+      <w:proofErr w:type="spellEnd"/>
+      <w:r>
+        <w:t xml:space="preserve"> dashes, active voice, approved claims only, no rival or tool names, no home-based care product names, no speed or cost claims about </w:t>
+      </w:r>
+      <w:proofErr w:type="spellStart"/>
+      <w:r>
+        <w:t>TekRevol's</w:t>
+      </w:r>
+      <w:proofErr w:type="spellEnd"/>
+      <w:r>
+        <w:t xml:space="preserve"> delivery.</w:t>
       </w:r>
     </w:p>
     <w:p>
@@ -279,16 +356,7 @@
                 <w:sz w:val="15"/>
                 <w:szCs w:val="15"/>
               </w:rPr>
-              <w:t>Audit fi</w:t>
-            </w:r>
-            <w:r>
-              <w:rPr>
-                <w:rFonts w:ascii="JetBrains Mono" w:eastAsia="JetBrains Mono" w:hAnsi="JetBrains Mono" w:cs="JetBrains Mono"/>
-                <w:color w:val="FFFFFF"/>
-                <w:sz w:val="15"/>
-                <w:szCs w:val="15"/>
-              </w:rPr>
-              <w:t>nding</w:t>
+              <w:t>Audit finding</w:t>
             </w:r>
           </w:p>
         </w:tc>
@@ -511,14 +579,7 @@
                 <w:sz w:val="18"/>
                 <w:szCs w:val="18"/>
               </w:rPr>
-              <w:t>4 fields, 2 of them dro</w:t>
-            </w:r>
-            <w:r>
-              <w:rPr>
-                <w:sz w:val="18"/>
-                <w:szCs w:val="18"/>
-              </w:rPr>
-              <w:t>pdowns. Phone optional. Invisible spam check</w:t>
+              <w:t>4 fields, 2 of them dropdowns. Phone optional. Invisible spam check</w:t>
             </w:r>
           </w:p>
         </w:tc>
@@ -774,14 +835,7 @@
                 <w:sz w:val="18"/>
                 <w:szCs w:val="18"/>
               </w:rPr>
-              <w:t>The form asks which workflow hurts, so the first call starts</w:t>
-            </w:r>
-            <w:r>
-              <w:rPr>
-                <w:sz w:val="18"/>
-                <w:szCs w:val="18"/>
-              </w:rPr>
-              <w:t xml:space="preserve"> on the problem. A second, lighter conversion (a one-page summary to forward) catches the champion who can't book a call alone</w:t>
+              <w:t>The form asks which workflow hurts, so the first call starts on the problem. A second, lighter conversion (a one-page summary to forward) catches the champion who can't book a call alone</w:t>
             </w:r>
           </w:p>
         </w:tc>
@@ -842,7 +896,15 @@
         <w:t>Staffing is the top problem for the third year running</w:t>
       </w:r>
       <w:r>
-        <w:t xml:space="preserve"> in home-based care (Home Health Care News). Recruiting caregivers (54%) and scheduling gaps and call-outs (31.9%) lead the list (HHAeXchange 2026 survey, 465 agencies)</w:t>
+        <w:t xml:space="preserve"> in home-based care (Home Health Care News). Recruiting caregivers (54%) and scheduling gaps and call-outs (31.9%) lead the list (</w:t>
+      </w:r>
+      <w:proofErr w:type="spellStart"/>
+      <w:r>
+        <w:t>HHAeXchange</w:t>
+      </w:r>
+      <w:proofErr w:type="spellEnd"/>
+      <w:r>
+        <w:t xml:space="preserve"> 2026 survey, 465 agencies)</w:t>
       </w:r>
     </w:p>
     <w:p>
@@ -863,10 +925,15 @@
         <w:t>What operators want AI to do:</w:t>
       </w:r>
       <w:r>
-        <w:t xml:space="preserve"> fill shifts and build schedules (37.8%), track compliance</w:t>
-      </w:r>
-      <w:r>
-        <w:t xml:space="preserve"> and send alerts (34.5%), process claims and catch billing exceptions (27.1%). Today they mostly use it for notes (22.4%) and back-office admin (17.9%) (HHAeXchange)</w:t>
+        <w:t xml:space="preserve"> fill shifts and build schedules (37.8%), track compliance and send alerts (34.5%), process claims and catch billing exceptions (27.1%). Today they mostly use it for notes (22.4%) and back-office admin (17.9%) (</w:t>
+      </w:r>
+      <w:proofErr w:type="spellStart"/>
+      <w:r>
+        <w:t>HHAeXchange</w:t>
+      </w:r>
+      <w:proofErr w:type="spellEnd"/>
+      <w:r>
+        <w:t>)</w:t>
       </w:r>
     </w:p>
     <w:p>
@@ -903,20 +970,10 @@
           <w:b/>
           <w:bCs/>
         </w:rPr>
-        <w:t>Prior authori</w:t>
-      </w:r>
-      <w:r>
-        <w:rPr>
-          <w:b/>
-          <w:bCs/>
-        </w:rPr>
-        <w:t>zation is real friction for home health.</w:t>
-      </w:r>
-      <w:r>
-        <w:t xml:space="preserve"> Medicare Advantage plans deny roughly 12% to 18% of standard prior auth requests, and most appealed denials are overturned (KFF via HHCN). Patients often need services within 24 to 48 hours of discharge while author</w:t>
-      </w:r>
-      <w:r>
-        <w:t>izations lag (LeadingAge)</w:t>
+        <w:t>Prior authorization is real friction for home health.</w:t>
+      </w:r>
+      <w:r>
+        <w:t xml:space="preserve"> Medicare Advantage plans deny roughly 12% to 18% of standard prior auth requests, and most appealed denials are overturned (KFF via HHCN). Patients often need services within 24 to 48 hours of discharge while authorizations lag (LeadingAge)</w:t>
       </w:r>
     </w:p>
     <w:p>
@@ -936,7 +993,23 @@
         <w:t>Payment pressure:</w:t>
       </w:r>
       <w:r>
-        <w:t xml:space="preserve"> a looming CMS home health payment cut and shifting value-based purchasing targets (DecisionHealth); rising costs and Medicaid changes for home care (AxisCare 2026 survey)</w:t>
+        <w:t xml:space="preserve"> a looming CMS home health payment cut and shifting value-based purchasing targets (</w:t>
+      </w:r>
+      <w:proofErr w:type="spellStart"/>
+      <w:r>
+        <w:t>DecisionHealth</w:t>
+      </w:r>
+      <w:proofErr w:type="spellEnd"/>
+      <w:r>
+        <w:t>); rising costs and Medicaid changes for home care (</w:t>
+      </w:r>
+      <w:proofErr w:type="spellStart"/>
+      <w:r>
+        <w:t>AxisCare</w:t>
+      </w:r>
+      <w:proofErr w:type="spellEnd"/>
+      <w:r>
+        <w:t xml:space="preserve"> 2026 survey)</w:t>
       </w:r>
     </w:p>
     <w:p>
@@ -953,17 +1026,18 @@
           <w:b/>
           <w:bCs/>
         </w:rPr>
-        <w:t>Behavioral health admissions are won on r</w:t>
-      </w:r>
-      <w:r>
-        <w:rPr>
-          <w:b/>
-          <w:bCs/>
-        </w:rPr>
-        <w:t>esponse speed.</w:t>
-      </w:r>
-      <w:r>
-        <w:t xml:space="preserve"> Common targets: first response within 30 minutes in business hours, same-day callback after hours (Ritten). Most loss figures are vendor claims, so the page doesn't quote numbers</w:t>
+        <w:t>Behavioral health admissions are won on response speed.</w:t>
+      </w:r>
+      <w:r>
+        <w:t xml:space="preserve"> Common targets: first response within 30 minutes in business hours, same-day callback after hours (</w:t>
+      </w:r>
+      <w:proofErr w:type="spellStart"/>
+      <w:r>
+        <w:t>Ritten</w:t>
+      </w:r>
+      <w:proofErr w:type="spellEnd"/>
+      <w:r>
+        <w:t>). Most loss figures are vendor claims, so the page doesn't quote numbers</w:t>
       </w:r>
     </w:p>
     <w:p>
@@ -983,10 +1057,7 @@
         <w:t>Operators are skeptical of "AI-powered" claims</w:t>
       </w:r>
       <w:r>
-        <w:t xml:space="preserve"> (even vendors s</w:t>
-      </w:r>
-      <w:r>
-        <w:t>ay much of it is theater). The page answers that by saying exactly what AI does and what people still decide</w:t>
+        <w:t xml:space="preserve"> (even vendors say much of it is theater). The page answers that by saying exactly what AI does and what people still decide</w:t>
       </w:r>
     </w:p>
     <w:p>
@@ -994,7 +1065,15 @@
         <w:spacing w:after="120" w:line="300" w:lineRule="auto"/>
       </w:pPr>
       <w:r>
-        <w:t>These market figures describe the market, not TekRevol. The page uses them only to pick words and pains. It doesn't publish them.</w:t>
+        <w:t xml:space="preserve">These market figures describe the market, not </w:t>
+      </w:r>
+      <w:proofErr w:type="spellStart"/>
+      <w:r>
+        <w:t>TekRevol</w:t>
+      </w:r>
+      <w:proofErr w:type="spellEnd"/>
+      <w:r>
+        <w:t>. The page uses them only to pick words and pains. It doesn't publish them.</w:t>
       </w:r>
     </w:p>
     <w:p>
@@ -1008,14 +1087,7 @@
           <w:rFonts w:ascii="Funnel Display" w:eastAsia="Funnel Display" w:hAnsi="Funnel Display" w:cs="Funnel Display"/>
           <w:color w:val="1D1E21"/>
         </w:rPr>
-        <w:t xml:space="preserve">What competitors </w:t>
-      </w:r>
-      <w:r>
-        <w:rPr>
-          <w:rFonts w:ascii="Funnel Display" w:eastAsia="Funnel Display" w:hAnsi="Funnel Display" w:cs="Funnel Display"/>
-          <w:color w:val="1D1E21"/>
-        </w:rPr>
-        <w:t>do on their healthcare pages</w:t>
+        <w:t>What competitors do on their healthcare pages</w:t>
       </w:r>
     </w:p>
     <w:tbl>
@@ -1333,12 +1405,21 @@
             <w:pPr>
               <w:spacing w:line="260" w:lineRule="auto"/>
             </w:pPr>
-            <w:r>
-              <w:rPr>
-                <w:sz w:val="18"/>
-                <w:szCs w:val="18"/>
-              </w:rPr>
-              <w:t>HatchWorks AI</w:t>
+            <w:proofErr w:type="spellStart"/>
+            <w:r>
+              <w:rPr>
+                <w:sz w:val="18"/>
+                <w:szCs w:val="18"/>
+              </w:rPr>
+              <w:t>HatchWorks</w:t>
+            </w:r>
+            <w:proofErr w:type="spellEnd"/>
+            <w:r>
+              <w:rPr>
+                <w:sz w:val="18"/>
+                <w:szCs w:val="18"/>
+              </w:rPr>
+              <w:t xml:space="preserve"> AI</w:t>
             </w:r>
           </w:p>
         </w:tc>
@@ -1457,6 +1538,7 @@
             <w:pPr>
               <w:spacing w:line="260" w:lineRule="auto"/>
             </w:pPr>
+            <w:proofErr w:type="spellStart"/>
             <w:r>
               <w:rPr>
                 <w:sz w:val="18"/>
@@ -1464,6 +1546,7 @@
               </w:rPr>
               <w:t>ScienceSoft</w:t>
             </w:r>
+            <w:proofErr w:type="spellEnd"/>
           </w:p>
         </w:tc>
         <w:tc>
@@ -1579,12 +1662,21 @@
             <w:pPr>
               <w:spacing w:line="260" w:lineRule="auto"/>
             </w:pPr>
-            <w:r>
-              <w:rPr>
-                <w:sz w:val="18"/>
-                <w:szCs w:val="18"/>
-              </w:rPr>
-              <w:t xml:space="preserve">TekRevol </w:t>
+            <w:proofErr w:type="spellStart"/>
+            <w:r>
+              <w:rPr>
+                <w:sz w:val="18"/>
+                <w:szCs w:val="18"/>
+              </w:rPr>
+              <w:t>TekRevol</w:t>
+            </w:r>
+            <w:proofErr w:type="spellEnd"/>
+            <w:r>
+              <w:rPr>
+                <w:sz w:val="18"/>
+                <w:szCs w:val="18"/>
+              </w:rPr>
+              <w:t xml:space="preserve"> </w:t>
             </w:r>
             <w:r>
               <w:rPr>
@@ -1710,6 +1802,7 @@
           <w:b/>
           <w:bCs/>
         </w:rPr>
+        <w:lastRenderedPageBreak/>
         <w:t>Our edge in one line:</w:t>
       </w:r>
       <w:r>
@@ -1761,11 +1854,9 @@
           <w:sz w:val="17"/>
           <w:szCs w:val="17"/>
         </w:rPr>
-        <w:t>/lp/healthcare-ai-operations</w:t>
-      </w:r>
-      <w:r>
-        <w:t xml:space="preserve"> · </w:t>
-      </w:r>
+        <w:t>/</w:t>
+      </w:r>
+      <w:proofErr w:type="spellStart"/>
       <w:r>
         <w:rPr>
           <w:rFonts w:ascii="JetBrains Mono" w:eastAsia="JetBrains Mono" w:hAnsi="JetBrains Mono" w:cs="JetBrains Mono"/>
@@ -1773,8 +1864,52 @@
           <w:sz w:val="17"/>
           <w:szCs w:val="17"/>
         </w:rPr>
-        <w:t>noindex, nofollow</w:t>
-      </w:r>
+        <w:t>lp</w:t>
+      </w:r>
+      <w:proofErr w:type="spellEnd"/>
+      <w:r>
+        <w:rPr>
+          <w:rFonts w:ascii="JetBrains Mono" w:eastAsia="JetBrains Mono" w:hAnsi="JetBrains Mono" w:cs="JetBrains Mono"/>
+          <w:color w:val="5E6166"/>
+          <w:sz w:val="17"/>
+          <w:szCs w:val="17"/>
+        </w:rPr>
+        <w:t>/healthcare-ai-operations</w:t>
+      </w:r>
+      <w:r>
+        <w:t xml:space="preserve"> · </w:t>
+      </w:r>
+      <w:proofErr w:type="spellStart"/>
+      <w:r>
+        <w:rPr>
+          <w:rFonts w:ascii="JetBrains Mono" w:eastAsia="JetBrains Mono" w:hAnsi="JetBrains Mono" w:cs="JetBrains Mono"/>
+          <w:color w:val="5E6166"/>
+          <w:sz w:val="17"/>
+          <w:szCs w:val="17"/>
+        </w:rPr>
+        <w:t>noindex</w:t>
+      </w:r>
+      <w:proofErr w:type="spellEnd"/>
+      <w:r>
+        <w:rPr>
+          <w:rFonts w:ascii="JetBrains Mono" w:eastAsia="JetBrains Mono" w:hAnsi="JetBrains Mono" w:cs="JetBrains Mono"/>
+          <w:color w:val="5E6166"/>
+          <w:sz w:val="17"/>
+          <w:szCs w:val="17"/>
+        </w:rPr>
+        <w:t xml:space="preserve">, </w:t>
+      </w:r>
+      <w:proofErr w:type="spellStart"/>
+      <w:r>
+        <w:rPr>
+          <w:rFonts w:ascii="JetBrains Mono" w:eastAsia="JetBrains Mono" w:hAnsi="JetBrains Mono" w:cs="JetBrains Mono"/>
+          <w:color w:val="5E6166"/>
+          <w:sz w:val="17"/>
+          <w:szCs w:val="17"/>
+        </w:rPr>
+        <w:t>nofollow</w:t>
+      </w:r>
+      <w:proofErr w:type="spellEnd"/>
       <w:r>
         <w:t xml:space="preserve"> · paid traffic only</w:t>
       </w:r>
@@ -1796,8 +1931,13 @@
         <w:t>Title tag:</w:t>
       </w:r>
       <w:r>
-        <w:t xml:space="preserve"> AI Automation for Home Health and Clinic Operations | TekRevol</w:t>
-      </w:r>
+        <w:t xml:space="preserve"> AI Automation for Home Health and Clinic Operations | </w:t>
+      </w:r>
+      <w:proofErr w:type="spellStart"/>
+      <w:r>
+        <w:t>TekRevol</w:t>
+      </w:r>
+      <w:proofErr w:type="spellEnd"/>
     </w:p>
     <w:p>
       <w:pPr>
@@ -1836,10 +1976,7 @@
         <w:t>No top navigation.</w:t>
       </w:r>
       <w:r>
-        <w:t xml:space="preserve"> Logo is not</w:t>
-      </w:r>
-      <w:r>
-        <w:t xml:space="preserve"> a link. Footer: privacy policy, terms, phone number only</w:t>
+        <w:t xml:space="preserve"> Logo is not a link. Footer: privacy policy, terms, phone number only</w:t>
       </w:r>
     </w:p>
     <w:p>
@@ -1856,7 +1993,15 @@
           <w:b/>
           <w:bCs/>
         </w:rPr>
-        <w:t>Hero variants by URL parameter</w:t>
+        <w:t xml:space="preserve">Hero variants by URL </w:t>
+      </w:r>
+      <w:proofErr w:type="gramStart"/>
+      <w:r>
+        <w:rPr>
+          <w:b/>
+          <w:bCs/>
+        </w:rPr>
+        <w:t>parameter</w:t>
       </w:r>
       <w:r>
         <w:t xml:space="preserve"> </w:t>
@@ -1868,7 +2013,17 @@
           <w:sz w:val="17"/>
           <w:szCs w:val="17"/>
         </w:rPr>
-        <w:t>?for=</w:t>
+        <w:t>?for</w:t>
+      </w:r>
+      <w:proofErr w:type="gramEnd"/>
+      <w:r>
+        <w:rPr>
+          <w:rFonts w:ascii="JetBrains Mono" w:eastAsia="JetBrains Mono" w:hAnsi="JetBrains Mono" w:cs="JetBrains Mono"/>
+          <w:color w:val="5E6166"/>
+          <w:sz w:val="17"/>
+          <w:szCs w:val="17"/>
+        </w:rPr>
+        <w:t>=</w:t>
       </w:r>
       <w:r>
         <w:t xml:space="preserve"> (one page, swap the H1, subhead and preselected organization type). Each ad group links to its own variant</w:t>
@@ -1891,10 +2046,7 @@
         <w:t>Sticky bar on mobile</w:t>
       </w:r>
       <w:r>
-        <w:t xml:space="preserve"> after the hero scrolls away: "Get</w:t>
-      </w:r>
-      <w:r>
-        <w:t xml:space="preserve"> my free workflow review" button that jumps to the hero form</w:t>
+        <w:t xml:space="preserve"> after the hero scrolls away: "Get my free workflow review" button that jumps to the hero form</w:t>
       </w:r>
     </w:p>
     <w:p>
@@ -2408,7 +2560,15 @@
                 <w:sz w:val="18"/>
                 <w:szCs w:val="18"/>
               </w:rPr>
-              <w:t xml:space="preserve">30 minutes with a senior engineer who has built healthcare software </w:t>
+              <w:t xml:space="preserve">30 minutes with a senior engineer who has built healthcare </w:t>
+            </w:r>
+            <w:proofErr w:type="gramStart"/>
+            <w:r>
+              <w:rPr>
+                <w:sz w:val="18"/>
+                <w:szCs w:val="18"/>
+              </w:rPr>
+              <w:t xml:space="preserve">software </w:t>
             </w:r>
             <w:r>
               <w:rPr>
@@ -2420,7 +2580,20 @@
                 <w:szCs w:val="14"/>
                 <w:shd w:val="clear" w:color="auto" w:fill="FFE8E0"/>
               </w:rPr>
-              <w:t xml:space="preserve"> CONFIRM </w:t>
+              <w:t xml:space="preserve"> CONFIRM</w:t>
+            </w:r>
+            <w:proofErr w:type="gramEnd"/>
+            <w:r>
+              <w:rPr>
+                <w:rFonts w:ascii="JetBrains Mono" w:eastAsia="JetBrains Mono" w:hAnsi="JetBrains Mono" w:cs="JetBrains Mono"/>
+                <w:b/>
+                <w:bCs/>
+                <w:color w:val="C23A00"/>
+                <w:sz w:val="14"/>
+                <w:szCs w:val="14"/>
+                <w:shd w:val="clear" w:color="auto" w:fill="FFE8E0"/>
+              </w:rPr>
+              <w:t xml:space="preserve"> </w:t>
             </w:r>
             <w:r>
               <w:rPr>
@@ -2529,11 +2702,11 @@
         <w:tblLook w:val="04A0" w:firstRow="1" w:lastRow="0" w:firstColumn="1" w:lastColumn="0" w:noHBand="0" w:noVBand="1"/>
       </w:tblPr>
       <w:tblGrid>
-        <w:gridCol w:w="820"/>
-        <w:gridCol w:w="1737"/>
-        <w:gridCol w:w="2461"/>
-        <w:gridCol w:w="2895"/>
-        <w:gridCol w:w="1447"/>
+        <w:gridCol w:w="1125"/>
+        <w:gridCol w:w="1685"/>
+        <w:gridCol w:w="2352"/>
+        <w:gridCol w:w="2772"/>
+        <w:gridCol w:w="1426"/>
       </w:tblGrid>
       <w:tr>
         <w:trPr>
@@ -2883,6 +3056,7 @@
                 <w:sz w:val="14"/>
                 <w:szCs w:val="14"/>
               </w:rPr>
+              <w:lastRenderedPageBreak/>
               <w:t>home-health</w:t>
             </w:r>
           </w:p>
@@ -3508,10 +3682,10 @@
         <w:tblLook w:val="04A0" w:firstRow="1" w:lastRow="0" w:firstColumn="1" w:lastColumn="0" w:noHBand="0" w:noVBand="1"/>
       </w:tblPr>
       <w:tblGrid>
-        <w:gridCol w:w="3280"/>
-        <w:gridCol w:w="640"/>
-        <w:gridCol w:w="640"/>
-        <w:gridCol w:w="4800"/>
+        <w:gridCol w:w="2939"/>
+        <w:gridCol w:w="1090"/>
+        <w:gridCol w:w="920"/>
+        <w:gridCol w:w="4411"/>
       </w:tblGrid>
       <w:tr>
         <w:trPr>
@@ -4283,8 +4457,33 @@
         <w:t>Hidden fields:</w:t>
       </w:r>
       <w:r>
-        <w:t xml:space="preserve"> utm_source, utm_medium, utm_campaign, </w:t>
-      </w:r>
+        <w:t xml:space="preserve"> </w:t>
+      </w:r>
+      <w:proofErr w:type="spellStart"/>
+      <w:r>
+        <w:t>utm_source</w:t>
+      </w:r>
+      <w:proofErr w:type="spellEnd"/>
+      <w:r>
+        <w:t xml:space="preserve">, </w:t>
+      </w:r>
+      <w:proofErr w:type="spellStart"/>
+      <w:r>
+        <w:t>utm_medium</w:t>
+      </w:r>
+      <w:proofErr w:type="spellEnd"/>
+      <w:r>
+        <w:t xml:space="preserve">, </w:t>
+      </w:r>
+      <w:proofErr w:type="spellStart"/>
+      <w:r>
+        <w:t>utm_campaign</w:t>
+      </w:r>
+      <w:proofErr w:type="spellEnd"/>
+      <w:r>
+        <w:t xml:space="preserve">, </w:t>
+      </w:r>
+      <w:proofErr w:type="spellStart"/>
       <w:r>
         <w:rPr>
           <w:b/>
@@ -4292,8 +4491,17 @@
         </w:rPr>
         <w:t>utm_content</w:t>
       </w:r>
-      <w:r>
-        <w:t xml:space="preserve">, landing_page, </w:t>
+      <w:proofErr w:type="spellEnd"/>
+      <w:r>
+        <w:t xml:space="preserve">, </w:t>
+      </w:r>
+      <w:proofErr w:type="spellStart"/>
+      <w:r>
+        <w:t>landing_page</w:t>
+      </w:r>
+      <w:proofErr w:type="spellEnd"/>
+      <w:r>
+        <w:t xml:space="preserve">, </w:t>
       </w:r>
       <w:r>
         <w:rPr>
@@ -4365,11 +4573,9 @@
         <w:t>On submit:</w:t>
       </w:r>
       <w:r>
-        <w:t xml:space="preserve"> go to the thank-you page (see Thank-you</w:t>
-      </w:r>
-      <w:r>
-        <w:t xml:space="preserve"> page below). Fire </w:t>
-      </w:r>
+        <w:t xml:space="preserve"> go to the thank-you page (see Thank-you page below). Fire </w:t>
+      </w:r>
+      <w:proofErr w:type="spellStart"/>
       <w:r>
         <w:rPr>
           <w:rFonts w:ascii="JetBrains Mono" w:eastAsia="JetBrains Mono" w:hAnsi="JetBrains Mono" w:cs="JetBrains Mono"/>
@@ -4379,6 +4585,7 @@
         </w:rPr>
         <w:t>lead_created</w:t>
       </w:r>
+      <w:proofErr w:type="spellEnd"/>
     </w:p>
     <w:p>
       <w:pPr>
@@ -4396,6 +4603,7 @@
           <w:sz w:val="34"/>
           <w:szCs w:val="34"/>
         </w:rPr>
+        <w:lastRenderedPageBreak/>
         <w:t>Section 3: Trust strip (directly under the hero)</w:t>
       </w:r>
     </w:p>
@@ -4412,10 +4620,7 @@
         <w:spacing w:after="120" w:line="300" w:lineRule="auto"/>
       </w:pPr>
       <w:r>
-        <w:t>Logos: Clutch Top 1000 · Inc. 5000. Nothing else. Entertainment</w:t>
-      </w:r>
-      <w:r>
-        <w:t xml:space="preserve"> and mobile-app awards stay off this page.</w:t>
+        <w:t>Logos: Clutch Top 1000 · Inc. 5000. Nothing else. Entertainment and mobile-app awards stay off this page.</w:t>
       </w:r>
     </w:p>
     <w:p>
@@ -4758,14 +4963,7 @@
           <w:b/>
           <w:bCs/>
         </w:rPr>
-        <w:t>Each of these is a workflow. Each one c</w:t>
-      </w:r>
-      <w:r>
-        <w:rPr>
-          <w:b/>
-          <w:bCs/>
-        </w:rPr>
-        <w:t>an be automated, with your team still making the call.</w:t>
+        <w:t>Each of these is a workflow. Each one can be automated, with your team still making the call.</w:t>
       </w:r>
     </w:p>
     <w:p>
@@ -5007,7 +5205,23 @@
                 <w:sz w:val="18"/>
                 <w:szCs w:val="18"/>
               </w:rPr>
-              <w:t>We build each workflow around the EHR, scheduling and billing systems you already use. No system switch.</w:t>
+              <w:t xml:space="preserve">We build each workflow around the EHR, scheduling and billing systems you already use. No system </w:t>
+            </w:r>
+            <w:proofErr w:type="gramStart"/>
+            <w:r>
+              <w:rPr>
+                <w:sz w:val="18"/>
+                <w:szCs w:val="18"/>
+              </w:rPr>
+              <w:t>switch</w:t>
+            </w:r>
+            <w:proofErr w:type="gramEnd"/>
+            <w:r>
+              <w:rPr>
+                <w:sz w:val="18"/>
+                <w:szCs w:val="18"/>
+              </w:rPr>
+              <w:t>.</w:t>
             </w:r>
           </w:p>
         </w:tc>
@@ -5264,6 +5478,7 @@
                 <w:sz w:val="18"/>
                 <w:szCs w:val="18"/>
               </w:rPr>
+              <w:lastRenderedPageBreak/>
               <w:t>Eligibility and authorizations</w:t>
             </w:r>
           </w:p>
@@ -5706,14 +5921,7 @@
                 <w:sz w:val="18"/>
                 <w:szCs w:val="18"/>
               </w:rPr>
-              <w:t>Clinical scre</w:t>
-            </w:r>
-            <w:r>
-              <w:rPr>
-                <w:sz w:val="18"/>
-                <w:szCs w:val="18"/>
-              </w:rPr>
-              <w:t>ening</w:t>
+              <w:t>Clinical screening</w:t>
             </w:r>
           </w:p>
         </w:tc>
@@ -6222,80 +6430,9 @@
                 <w:szCs w:val="14"/>
                 <w:shd w:val="clear" w:color="auto" w:fill="FFE8E0"/>
               </w:rPr>
-              <w:t xml:space="preserve"> CONFIRM </w:t>
-            </w:r>
-            <w:r>
-              <w:rPr>
-                <w:sz w:val="18"/>
-                <w:szCs w:val="18"/>
-              </w:rPr>
-              <w:t xml:space="preserve"> who joins</w:t>
-            </w:r>
-          </w:p>
-        </w:tc>
-      </w:tr>
-      <w:tr>
-        <w:trPr>
-          <w:cantSplit/>
-        </w:trPr>
-        <w:tc>
-          <w:tcPr>
-            <w:tcW w:w="2674" w:type="dxa"/>
-            <w:tcBorders>
-              <w:top w:val="single" w:sz="4" w:space="0" w:color="C9CCCF"/>
-              <w:left w:val="single" w:sz="4" w:space="0" w:color="C9CCCF"/>
-              <w:bottom w:val="single" w:sz="4" w:space="0" w:color="C9CCCF"/>
-              <w:right w:val="single" w:sz="4" w:space="0" w:color="C9CCCF"/>
-            </w:tcBorders>
-            <w:tcMar>
-              <w:top w:w="70" w:type="dxa"/>
-              <w:left w:w="100" w:type="dxa"/>
-              <w:bottom w:w="70" w:type="dxa"/>
-              <w:right w:w="100" w:type="dxa"/>
-            </w:tcMar>
-          </w:tcPr>
-          <w:p>
-            <w:pPr>
-              <w:spacing w:line="260" w:lineRule="auto"/>
-            </w:pPr>
-            <w:r>
-              <w:rPr>
-                <w:b/>
-                <w:bCs/>
-                <w:sz w:val="18"/>
-                <w:szCs w:val="18"/>
-              </w:rPr>
-              <w:t>After the call</w:t>
-            </w:r>
-          </w:p>
-        </w:tc>
-        <w:tc>
-          <w:tcPr>
-            <w:tcW w:w="6686" w:type="dxa"/>
-            <w:tcBorders>
-              <w:top w:val="single" w:sz="4" w:space="0" w:color="C9CCCF"/>
-              <w:left w:val="single" w:sz="4" w:space="0" w:color="C9CCCF"/>
-              <w:bottom w:val="single" w:sz="4" w:space="0" w:color="C9CCCF"/>
-              <w:right w:val="single" w:sz="4" w:space="0" w:color="C9CCCF"/>
-            </w:tcBorders>
-            <w:tcMar>
-              <w:top w:w="70" w:type="dxa"/>
-              <w:left w:w="100" w:type="dxa"/>
-              <w:bottom w:w="70" w:type="dxa"/>
-              <w:right w:w="100" w:type="dxa"/>
-            </w:tcMar>
-          </w:tcPr>
-          <w:p>
-            <w:pPr>
-              <w:spacing w:line="260" w:lineRule="auto"/>
-            </w:pPr>
-            <w:r>
-              <w:rPr>
-                <w:sz w:val="18"/>
-                <w:szCs w:val="18"/>
-              </w:rPr>
-              <w:t xml:space="preserve">Within 2 business days </w:t>
-            </w:r>
+              <w:t xml:space="preserve"> </w:t>
+            </w:r>
+            <w:proofErr w:type="gramStart"/>
             <w:r>
               <w:rPr>
                 <w:rFonts w:ascii="JetBrains Mono" w:eastAsia="JetBrains Mono" w:hAnsi="JetBrains Mono" w:cs="JetBrains Mono"/>
@@ -6306,14 +6443,95 @@
                 <w:szCs w:val="14"/>
                 <w:shd w:val="clear" w:color="auto" w:fill="FFE8E0"/>
               </w:rPr>
-              <w:t xml:space="preserve"> CONFIRM </w:t>
-            </w:r>
-            <w:r>
-              <w:rPr>
-                <w:sz w:val="18"/>
-                <w:szCs w:val="18"/>
-              </w:rPr>
-              <w:t xml:space="preserve">, a written plan: the 3 workflows to automate first, what each one would take, the HIPAA points to plan for, and a rough cost range </w:t>
+              <w:t xml:space="preserve">CONFIRM </w:t>
+            </w:r>
+            <w:r>
+              <w:rPr>
+                <w:sz w:val="18"/>
+                <w:szCs w:val="18"/>
+              </w:rPr>
+              <w:t xml:space="preserve"> who</w:t>
+            </w:r>
+            <w:proofErr w:type="gramEnd"/>
+            <w:r>
+              <w:rPr>
+                <w:sz w:val="18"/>
+                <w:szCs w:val="18"/>
+              </w:rPr>
+              <w:t xml:space="preserve"> joins</w:t>
+            </w:r>
+          </w:p>
+        </w:tc>
+      </w:tr>
+      <w:tr>
+        <w:trPr>
+          <w:cantSplit/>
+        </w:trPr>
+        <w:tc>
+          <w:tcPr>
+            <w:tcW w:w="2674" w:type="dxa"/>
+            <w:tcBorders>
+              <w:top w:val="single" w:sz="4" w:space="0" w:color="C9CCCF"/>
+              <w:left w:val="single" w:sz="4" w:space="0" w:color="C9CCCF"/>
+              <w:bottom w:val="single" w:sz="4" w:space="0" w:color="C9CCCF"/>
+              <w:right w:val="single" w:sz="4" w:space="0" w:color="C9CCCF"/>
+            </w:tcBorders>
+            <w:tcMar>
+              <w:top w:w="70" w:type="dxa"/>
+              <w:left w:w="100" w:type="dxa"/>
+              <w:bottom w:w="70" w:type="dxa"/>
+              <w:right w:w="100" w:type="dxa"/>
+            </w:tcMar>
+          </w:tcPr>
+          <w:p>
+            <w:pPr>
+              <w:spacing w:line="260" w:lineRule="auto"/>
+            </w:pPr>
+            <w:r>
+              <w:rPr>
+                <w:b/>
+                <w:bCs/>
+                <w:sz w:val="18"/>
+                <w:szCs w:val="18"/>
+              </w:rPr>
+              <w:t>After the call</w:t>
+            </w:r>
+          </w:p>
+        </w:tc>
+        <w:tc>
+          <w:tcPr>
+            <w:tcW w:w="6686" w:type="dxa"/>
+            <w:tcBorders>
+              <w:top w:val="single" w:sz="4" w:space="0" w:color="C9CCCF"/>
+              <w:left w:val="single" w:sz="4" w:space="0" w:color="C9CCCF"/>
+              <w:bottom w:val="single" w:sz="4" w:space="0" w:color="C9CCCF"/>
+              <w:right w:val="single" w:sz="4" w:space="0" w:color="C9CCCF"/>
+            </w:tcBorders>
+            <w:tcMar>
+              <w:top w:w="70" w:type="dxa"/>
+              <w:left w:w="100" w:type="dxa"/>
+              <w:bottom w:w="70" w:type="dxa"/>
+              <w:right w:w="100" w:type="dxa"/>
+            </w:tcMar>
+          </w:tcPr>
+          <w:p>
+            <w:pPr>
+              <w:spacing w:line="260" w:lineRule="auto"/>
+            </w:pPr>
+            <w:r>
+              <w:rPr>
+                <w:sz w:val="18"/>
+                <w:szCs w:val="18"/>
+              </w:rPr>
+              <w:t xml:space="preserve">Within 2 business </w:t>
+            </w:r>
+            <w:proofErr w:type="gramStart"/>
+            <w:r>
+              <w:rPr>
+                <w:sz w:val="18"/>
+                <w:szCs w:val="18"/>
+              </w:rPr>
+              <w:t xml:space="preserve">days </w:t>
             </w:r>
             <w:r>
               <w:rPr>
@@ -6325,8 +6543,42 @@
                 <w:szCs w:val="14"/>
                 <w:shd w:val="clear" w:color="auto" w:fill="FFE8E0"/>
               </w:rPr>
+              <w:t xml:space="preserve"> CONFIRM</w:t>
+            </w:r>
+            <w:proofErr w:type="gramEnd"/>
+            <w:r>
+              <w:rPr>
+                <w:rFonts w:ascii="JetBrains Mono" w:eastAsia="JetBrains Mono" w:hAnsi="JetBrains Mono" w:cs="JetBrains Mono"/>
+                <w:b/>
+                <w:bCs/>
+                <w:color w:val="C23A00"/>
+                <w:sz w:val="14"/>
+                <w:szCs w:val="14"/>
+                <w:shd w:val="clear" w:color="auto" w:fill="FFE8E0"/>
+              </w:rPr>
+              <w:t xml:space="preserve"> </w:t>
+            </w:r>
+            <w:r>
+              <w:rPr>
+                <w:sz w:val="18"/>
+                <w:szCs w:val="18"/>
+              </w:rPr>
+              <w:t xml:space="preserve">, a written plan: the 3 workflows to automate first, what each one would take, the HIPAA points to plan for, and a rough cost range </w:t>
+            </w:r>
+            <w:r>
+              <w:rPr>
+                <w:rFonts w:ascii="JetBrains Mono" w:eastAsia="JetBrains Mono" w:hAnsi="JetBrains Mono" w:cs="JetBrains Mono"/>
+                <w:b/>
+                <w:bCs/>
+                <w:color w:val="C23A00"/>
+                <w:sz w:val="14"/>
+                <w:szCs w:val="14"/>
+                <w:shd w:val="clear" w:color="auto" w:fill="FFE8E0"/>
+              </w:rPr>
               <w:t xml:space="preserve"> CONFIRM </w:t>
             </w:r>
+            <w:bookmarkStart w:id="0" w:name="_GoBack"/>
+            <w:bookmarkEnd w:id="0"/>
           </w:p>
         </w:tc>
       </w:tr>
@@ -6367,6 +6619,7 @@
           <w:sz w:val="34"/>
           <w:szCs w:val="34"/>
         </w:rPr>
+        <w:lastRenderedPageBreak/>
         <w:t>Section 7: How we build</w:t>
       </w:r>
     </w:p>
@@ -6645,14 +6898,7 @@
                 <w:sz w:val="18"/>
                 <w:szCs w:val="18"/>
               </w:rPr>
-              <w:t>Healthcare can't run on a demo. We try ideas quickly with AI, then every workflow crosses the Ship Line before it touches patient data. The Ship Line is a written, pass-or-fail check of security, data handling, AI accuracy and the experience for your staff</w:t>
-            </w:r>
-            <w:r>
-              <w:rPr>
-                <w:sz w:val="18"/>
-                <w:szCs w:val="18"/>
-              </w:rPr>
-              <w:t>, signed by our CTO. You see the report.</w:t>
+              <w:t>Healthcare can't run on a demo. We try ideas quickly with AI, then every workflow crosses the Ship Line before it touches patient data. The Ship Line is a written, pass-or-fail check of security, data handling, AI accuracy and the experience for your staff, signed by our CTO. You see the report.</w:t>
             </w:r>
           </w:p>
         </w:tc>
@@ -6877,7 +7123,15 @@
                 <w:sz w:val="18"/>
                 <w:szCs w:val="18"/>
               </w:rPr>
-              <w:t xml:space="preserve">A working version, tested on sample or de-identified data </w:t>
+              <w:t xml:space="preserve">A working version, tested on sample or de-identified </w:t>
+            </w:r>
+            <w:proofErr w:type="gramStart"/>
+            <w:r>
+              <w:rPr>
+                <w:sz w:val="18"/>
+                <w:szCs w:val="18"/>
+              </w:rPr>
+              <w:t xml:space="preserve">data </w:t>
             </w:r>
             <w:r>
               <w:rPr>
@@ -6889,7 +7143,20 @@
                 <w:szCs w:val="14"/>
                 <w:shd w:val="clear" w:color="auto" w:fill="FFE8E0"/>
               </w:rPr>
-              <w:t xml:space="preserve"> CONFIRM </w:t>
+              <w:t xml:space="preserve"> CONFIRM</w:t>
+            </w:r>
+            <w:proofErr w:type="gramEnd"/>
+            <w:r>
+              <w:rPr>
+                <w:rFonts w:ascii="JetBrains Mono" w:eastAsia="JetBrains Mono" w:hAnsi="JetBrains Mono" w:cs="JetBrains Mono"/>
+                <w:b/>
+                <w:bCs/>
+                <w:color w:val="C23A00"/>
+                <w:sz w:val="14"/>
+                <w:szCs w:val="14"/>
+                <w:shd w:val="clear" w:color="auto" w:fill="FFE8E0"/>
+              </w:rPr>
+              <w:t xml:space="preserve"> </w:t>
             </w:r>
             <w:r>
               <w:rPr>
@@ -7284,7 +7551,11 @@
         <w:spacing w:after="70" w:line="290" w:lineRule="auto"/>
       </w:pPr>
       <w:r>
-        <w:t xml:space="preserve">We sign a Business Associate Agreement </w:t>
+        <w:t xml:space="preserve">We sign a Business Associate </w:t>
+      </w:r>
+      <w:proofErr w:type="gramStart"/>
+      <w:r>
+        <w:t xml:space="preserve">Agreement </w:t>
       </w:r>
       <w:r>
         <w:rPr>
@@ -7296,7 +7567,20 @@
           <w:szCs w:val="14"/>
           <w:shd w:val="clear" w:color="auto" w:fill="FFE8E0"/>
         </w:rPr>
-        <w:t xml:space="preserve"> CONFIRM </w:t>
+        <w:t xml:space="preserve"> CONFIRM</w:t>
+      </w:r>
+      <w:proofErr w:type="gramEnd"/>
+      <w:r>
+        <w:rPr>
+          <w:rFonts w:ascii="JetBrains Mono" w:eastAsia="JetBrains Mono" w:hAnsi="JetBrains Mono" w:cs="JetBrains Mono"/>
+          <w:b/>
+          <w:bCs/>
+          <w:color w:val="C23A00"/>
+          <w:sz w:val="14"/>
+          <w:szCs w:val="14"/>
+          <w:shd w:val="clear" w:color="auto" w:fill="FFE8E0"/>
+        </w:rPr>
+        <w:t xml:space="preserve"> </w:t>
       </w:r>
     </w:p>
     <w:p>
@@ -7322,14 +7606,7 @@
           <w:b/>
           <w:bCs/>
         </w:rPr>
-        <w:t xml:space="preserve">Second </w:t>
-      </w:r>
-      <w:r>
-        <w:rPr>
-          <w:b/>
-          <w:bCs/>
-        </w:rPr>
-        <w:t>conversion, for the champion:</w:t>
+        <w:t>Second conversion, for the champion:</w:t>
       </w:r>
     </w:p>
     <w:tbl>
@@ -7640,6 +7917,7 @@
                 <w:sz w:val="18"/>
                 <w:szCs w:val="18"/>
               </w:rPr>
+              <w:lastRenderedPageBreak/>
               <w:t>Button</w:t>
             </w:r>
           </w:p>
@@ -7737,6 +8015,7 @@
               </w:rPr>
               <w:t xml:space="preserve">Fires </w:t>
             </w:r>
+            <w:proofErr w:type="spellStart"/>
             <w:r>
               <w:rPr>
                 <w:rFonts w:ascii="JetBrains Mono" w:eastAsia="JetBrains Mono" w:hAnsi="JetBrains Mono" w:cs="JetBrains Mono"/>
@@ -7746,6 +8025,7 @@
               </w:rPr>
               <w:t>summary_requested</w:t>
             </w:r>
+            <w:proofErr w:type="spellEnd"/>
             <w:r>
               <w:rPr>
                 <w:sz w:val="18"/>
@@ -7753,6 +8033,7 @@
               </w:rPr>
               <w:t xml:space="preserve">, not </w:t>
             </w:r>
+            <w:proofErr w:type="spellStart"/>
             <w:r>
               <w:rPr>
                 <w:rFonts w:ascii="JetBrains Mono" w:eastAsia="JetBrains Mono" w:hAnsi="JetBrains Mono" w:cs="JetBrains Mono"/>
@@ -7762,6 +8043,7 @@
               </w:rPr>
               <w:t>lead_created</w:t>
             </w:r>
+            <w:proofErr w:type="spellEnd"/>
             <w:r>
               <w:rPr>
                 <w:sz w:val="18"/>
@@ -8301,14 +8583,7 @@
                 <w:sz w:val="18"/>
                 <w:szCs w:val="18"/>
               </w:rPr>
-              <w:t xml:space="preserve">Both </w:t>
-            </w:r>
-            <w:r>
-              <w:rPr>
-                <w:sz w:val="18"/>
-                <w:szCs w:val="18"/>
-              </w:rPr>
-              <w:t>numbers are in the case study body. Safe</w:t>
+              <w:t>Both numbers are in the case study body. Safe</w:t>
             </w:r>
           </w:p>
         </w:tc>
@@ -8405,7 +8680,15 @@
                 <w:sz w:val="18"/>
                 <w:szCs w:val="18"/>
               </w:rPr>
-              <w:t xml:space="preserve">Cut patient wait times by 40% </w:t>
+              <w:t>Cut patient wait times by 40</w:t>
+            </w:r>
+            <w:proofErr w:type="gramStart"/>
+            <w:r>
+              <w:rPr>
+                <w:sz w:val="18"/>
+                <w:szCs w:val="18"/>
+              </w:rPr>
+              <w:t xml:space="preserve">% </w:t>
             </w:r>
             <w:r>
               <w:rPr>
@@ -8417,132 +8700,9 @@
                 <w:szCs w:val="14"/>
                 <w:shd w:val="clear" w:color="auto" w:fill="FFE8E0"/>
               </w:rPr>
-              <w:t xml:space="preserve"> CONFIRM </w:t>
-            </w:r>
-          </w:p>
-        </w:tc>
-        <w:tc>
-          <w:tcPr>
-            <w:tcW w:w="2529" w:type="dxa"/>
-            <w:tcBorders>
-              <w:top w:val="single" w:sz="4" w:space="0" w:color="C9CCCF"/>
-              <w:left w:val="single" w:sz="4" w:space="0" w:color="C9CCCF"/>
-              <w:bottom w:val="single" w:sz="4" w:space="0" w:color="C9CCCF"/>
-              <w:right w:val="single" w:sz="4" w:space="0" w:color="C9CCCF"/>
-            </w:tcBorders>
-            <w:shd w:val="clear" w:color="auto" w:fill="F3F4F4"/>
-            <w:tcMar>
-              <w:top w:w="70" w:type="dxa"/>
-              <w:left w:w="100" w:type="dxa"/>
-              <w:bottom w:w="70" w:type="dxa"/>
-              <w:right w:w="100" w:type="dxa"/>
-            </w:tcMar>
-          </w:tcPr>
-          <w:p>
-            <w:pPr>
-              <w:spacing w:line="260" w:lineRule="auto"/>
-            </w:pPr>
-            <w:r>
-              <w:rPr>
-                <w:sz w:val="18"/>
-                <w:szCs w:val="18"/>
-              </w:rPr>
-              <w:t>Only in the page's meta description, not the body. Use only if TekRevol confirms it; otherwise show the card without a number</w:t>
-            </w:r>
-          </w:p>
-        </w:tc>
-      </w:tr>
-      <w:tr>
-        <w:trPr>
-          <w:cantSplit/>
-        </w:trPr>
-        <w:tc>
-          <w:tcPr>
-            <w:tcW w:w="1771" w:type="dxa"/>
-            <w:tcBorders>
-              <w:top w:val="single" w:sz="4" w:space="0" w:color="C9CCCF"/>
-              <w:left w:val="single" w:sz="4" w:space="0" w:color="C9CCCF"/>
-              <w:bottom w:val="single" w:sz="4" w:space="0" w:color="C9CCCF"/>
-              <w:right w:val="single" w:sz="4" w:space="0" w:color="C9CCCF"/>
-            </w:tcBorders>
-            <w:tcMar>
-              <w:top w:w="70" w:type="dxa"/>
-              <w:left w:w="100" w:type="dxa"/>
-              <w:bottom w:w="70" w:type="dxa"/>
-              <w:right w:w="100" w:type="dxa"/>
-            </w:tcMar>
-          </w:tcPr>
-          <w:p>
-            <w:pPr>
-              <w:spacing w:line="260" w:lineRule="auto"/>
-            </w:pPr>
-            <w:r>
-              <w:rPr>
-                <w:b/>
-                <w:bCs/>
-                <w:sz w:val="18"/>
-                <w:szCs w:val="18"/>
-              </w:rPr>
-              <w:t>Kinekt</w:t>
-            </w:r>
-          </w:p>
-        </w:tc>
-        <w:tc>
-          <w:tcPr>
-            <w:tcW w:w="2530" w:type="dxa"/>
-            <w:tcBorders>
-              <w:top w:val="single" w:sz="4" w:space="0" w:color="C9CCCF"/>
-              <w:left w:val="single" w:sz="4" w:space="0" w:color="C9CCCF"/>
-              <w:bottom w:val="single" w:sz="4" w:space="0" w:color="C9CCCF"/>
-              <w:right w:val="single" w:sz="4" w:space="0" w:color="C9CCCF"/>
-            </w:tcBorders>
-            <w:tcMar>
-              <w:top w:w="70" w:type="dxa"/>
-              <w:left w:w="100" w:type="dxa"/>
-              <w:bottom w:w="70" w:type="dxa"/>
-              <w:right w:w="100" w:type="dxa"/>
-            </w:tcMar>
-          </w:tcPr>
-          <w:p>
-            <w:pPr>
-              <w:spacing w:line="260" w:lineRule="auto"/>
-            </w:pPr>
-            <w:r>
-              <w:rPr>
-                <w:sz w:val="18"/>
-                <w:szCs w:val="18"/>
-              </w:rPr>
-              <w:t>AI patient feedback for UK care providers. GPT-4 reads feedback from every channel, scores sentiment, sorts it automatically and drafts replies.</w:t>
-            </w:r>
-          </w:p>
-        </w:tc>
-        <w:tc>
-          <w:tcPr>
-            <w:tcW w:w="2530" w:type="dxa"/>
-            <w:tcBorders>
-              <w:top w:val="single" w:sz="4" w:space="0" w:color="C9CCCF"/>
-              <w:left w:val="single" w:sz="4" w:space="0" w:color="C9CCCF"/>
-              <w:bottom w:val="single" w:sz="4" w:space="0" w:color="C9CCCF"/>
-              <w:right w:val="single" w:sz="4" w:space="0" w:color="C9CCCF"/>
-            </w:tcBorders>
-            <w:tcMar>
-              <w:top w:w="70" w:type="dxa"/>
-              <w:left w:w="100" w:type="dxa"/>
-              <w:bottom w:w="70" w:type="dxa"/>
-              <w:right w:w="100" w:type="dxa"/>
-            </w:tcMar>
-          </w:tcPr>
-          <w:p>
-            <w:pPr>
-              <w:spacing w:line="260" w:lineRule="auto"/>
-            </w:pPr>
-            <w:r>
-              <w:rPr>
-                <w:sz w:val="18"/>
-                <w:szCs w:val="18"/>
-              </w:rPr>
-              <w:t xml:space="preserve">45% more user engagement </w:t>
-            </w:r>
+              <w:t xml:space="preserve"> CONFIRM</w:t>
+            </w:r>
+            <w:proofErr w:type="gramEnd"/>
             <w:r>
               <w:rPr>
                 <w:rFonts w:ascii="JetBrains Mono" w:eastAsia="JetBrains Mono" w:hAnsi="JetBrains Mono" w:cs="JetBrains Mono"/>
@@ -8553,7 +8713,7 @@
                 <w:szCs w:val="14"/>
                 <w:shd w:val="clear" w:color="auto" w:fill="FFE8E0"/>
               </w:rPr>
-              <w:t xml:space="preserve"> CONFIRM </w:t>
+              <w:t xml:space="preserve"> </w:t>
             </w:r>
           </w:p>
         </w:tc>
@@ -8566,30 +8726,40 @@
               <w:bottom w:val="single" w:sz="4" w:space="0" w:color="C9CCCF"/>
               <w:right w:val="single" w:sz="4" w:space="0" w:color="C9CCCF"/>
             </w:tcBorders>
-            <w:tcMar>
-              <w:top w:w="70" w:type="dxa"/>
-              <w:left w:w="100" w:type="dxa"/>
-              <w:bottom w:w="70" w:type="dxa"/>
-              <w:right w:w="100" w:type="dxa"/>
-            </w:tcMar>
-          </w:tcPr>
-          <w:p>
-            <w:pPr>
-              <w:spacing w:line="260" w:lineRule="auto"/>
-            </w:pPr>
-            <w:r>
-              <w:rPr>
-                <w:sz w:val="18"/>
-                <w:szCs w:val="18"/>
-              </w:rPr>
-              <w:t>Headline number on the page, but the projects list says "30% faster response</w:t>
-            </w:r>
-            <w:r>
-              <w:rPr>
-                <w:sz w:val="18"/>
-                <w:szCs w:val="18"/>
-              </w:rPr>
-              <w:t xml:space="preserve"> times" for the same case. TekRevol must pick one</w:t>
+            <w:shd w:val="clear" w:color="auto" w:fill="F3F4F4"/>
+            <w:tcMar>
+              <w:top w:w="70" w:type="dxa"/>
+              <w:left w:w="100" w:type="dxa"/>
+              <w:bottom w:w="70" w:type="dxa"/>
+              <w:right w:w="100" w:type="dxa"/>
+            </w:tcMar>
+          </w:tcPr>
+          <w:p>
+            <w:pPr>
+              <w:spacing w:line="260" w:lineRule="auto"/>
+            </w:pPr>
+            <w:r>
+              <w:rPr>
+                <w:sz w:val="18"/>
+                <w:szCs w:val="18"/>
+              </w:rPr>
+              <w:t xml:space="preserve">Only in the page's meta description, not the body. Use only if </w:t>
+            </w:r>
+            <w:proofErr w:type="spellStart"/>
+            <w:r>
+              <w:rPr>
+                <w:sz w:val="18"/>
+                <w:szCs w:val="18"/>
+              </w:rPr>
+              <w:t>TekRevol</w:t>
+            </w:r>
+            <w:proofErr w:type="spellEnd"/>
+            <w:r>
+              <w:rPr>
+                <w:sz w:val="18"/>
+                <w:szCs w:val="18"/>
+              </w:rPr>
+              <w:t xml:space="preserve"> confirms it; otherwise show the card without a number</w:t>
             </w:r>
           </w:p>
         </w:tc>
@@ -8607,18 +8777,18 @@
               <w:bottom w:val="single" w:sz="4" w:space="0" w:color="C9CCCF"/>
               <w:right w:val="single" w:sz="4" w:space="0" w:color="C9CCCF"/>
             </w:tcBorders>
-            <w:shd w:val="clear" w:color="auto" w:fill="F3F4F4"/>
-            <w:tcMar>
-              <w:top w:w="70" w:type="dxa"/>
-              <w:left w:w="100" w:type="dxa"/>
-              <w:bottom w:w="70" w:type="dxa"/>
-              <w:right w:w="100" w:type="dxa"/>
-            </w:tcMar>
-          </w:tcPr>
-          <w:p>
-            <w:pPr>
-              <w:spacing w:line="260" w:lineRule="auto"/>
-            </w:pPr>
+            <w:tcMar>
+              <w:top w:w="70" w:type="dxa"/>
+              <w:left w:w="100" w:type="dxa"/>
+              <w:bottom w:w="70" w:type="dxa"/>
+              <w:right w:w="100" w:type="dxa"/>
+            </w:tcMar>
+          </w:tcPr>
+          <w:p>
+            <w:pPr>
+              <w:spacing w:line="260" w:lineRule="auto"/>
+            </w:pPr>
+            <w:proofErr w:type="spellStart"/>
             <w:r>
               <w:rPr>
                 <w:b/>
@@ -8626,8 +8796,184 @@
                 <w:sz w:val="18"/>
                 <w:szCs w:val="18"/>
               </w:rPr>
+              <w:t>Kinekt</w:t>
+            </w:r>
+            <w:proofErr w:type="spellEnd"/>
+          </w:p>
+        </w:tc>
+        <w:tc>
+          <w:tcPr>
+            <w:tcW w:w="2530" w:type="dxa"/>
+            <w:tcBorders>
+              <w:top w:val="single" w:sz="4" w:space="0" w:color="C9CCCF"/>
+              <w:left w:val="single" w:sz="4" w:space="0" w:color="C9CCCF"/>
+              <w:bottom w:val="single" w:sz="4" w:space="0" w:color="C9CCCF"/>
+              <w:right w:val="single" w:sz="4" w:space="0" w:color="C9CCCF"/>
+            </w:tcBorders>
+            <w:tcMar>
+              <w:top w:w="70" w:type="dxa"/>
+              <w:left w:w="100" w:type="dxa"/>
+              <w:bottom w:w="70" w:type="dxa"/>
+              <w:right w:w="100" w:type="dxa"/>
+            </w:tcMar>
+          </w:tcPr>
+          <w:p>
+            <w:pPr>
+              <w:spacing w:line="260" w:lineRule="auto"/>
+            </w:pPr>
+            <w:r>
+              <w:rPr>
+                <w:sz w:val="18"/>
+                <w:szCs w:val="18"/>
+              </w:rPr>
+              <w:t>AI patient feedback for UK care providers. GPT-4 reads feedback from every channel, scores sentiment, sorts it automatically and drafts replies.</w:t>
+            </w:r>
+          </w:p>
+        </w:tc>
+        <w:tc>
+          <w:tcPr>
+            <w:tcW w:w="2530" w:type="dxa"/>
+            <w:tcBorders>
+              <w:top w:val="single" w:sz="4" w:space="0" w:color="C9CCCF"/>
+              <w:left w:val="single" w:sz="4" w:space="0" w:color="C9CCCF"/>
+              <w:bottom w:val="single" w:sz="4" w:space="0" w:color="C9CCCF"/>
+              <w:right w:val="single" w:sz="4" w:space="0" w:color="C9CCCF"/>
+            </w:tcBorders>
+            <w:tcMar>
+              <w:top w:w="70" w:type="dxa"/>
+              <w:left w:w="100" w:type="dxa"/>
+              <w:bottom w:w="70" w:type="dxa"/>
+              <w:right w:w="100" w:type="dxa"/>
+            </w:tcMar>
+          </w:tcPr>
+          <w:p>
+            <w:pPr>
+              <w:spacing w:line="260" w:lineRule="auto"/>
+            </w:pPr>
+            <w:r>
+              <w:rPr>
+                <w:sz w:val="18"/>
+                <w:szCs w:val="18"/>
+              </w:rPr>
+              <w:t xml:space="preserve">45% more user </w:t>
+            </w:r>
+            <w:proofErr w:type="gramStart"/>
+            <w:r>
+              <w:rPr>
+                <w:sz w:val="18"/>
+                <w:szCs w:val="18"/>
+              </w:rPr>
+              <w:t xml:space="preserve">engagement </w:t>
+            </w:r>
+            <w:r>
+              <w:rPr>
+                <w:rFonts w:ascii="JetBrains Mono" w:eastAsia="JetBrains Mono" w:hAnsi="JetBrains Mono" w:cs="JetBrains Mono"/>
+                <w:b/>
+                <w:bCs/>
+                <w:color w:val="C23A00"/>
+                <w:sz w:val="14"/>
+                <w:szCs w:val="14"/>
+                <w:shd w:val="clear" w:color="auto" w:fill="FFE8E0"/>
+              </w:rPr>
+              <w:t xml:space="preserve"> CONFIRM</w:t>
+            </w:r>
+            <w:proofErr w:type="gramEnd"/>
+            <w:r>
+              <w:rPr>
+                <w:rFonts w:ascii="JetBrains Mono" w:eastAsia="JetBrains Mono" w:hAnsi="JetBrains Mono" w:cs="JetBrains Mono"/>
+                <w:b/>
+                <w:bCs/>
+                <w:color w:val="C23A00"/>
+                <w:sz w:val="14"/>
+                <w:szCs w:val="14"/>
+                <w:shd w:val="clear" w:color="auto" w:fill="FFE8E0"/>
+              </w:rPr>
+              <w:t xml:space="preserve"> </w:t>
+            </w:r>
+          </w:p>
+        </w:tc>
+        <w:tc>
+          <w:tcPr>
+            <w:tcW w:w="2529" w:type="dxa"/>
+            <w:tcBorders>
+              <w:top w:val="single" w:sz="4" w:space="0" w:color="C9CCCF"/>
+              <w:left w:val="single" w:sz="4" w:space="0" w:color="C9CCCF"/>
+              <w:bottom w:val="single" w:sz="4" w:space="0" w:color="C9CCCF"/>
+              <w:right w:val="single" w:sz="4" w:space="0" w:color="C9CCCF"/>
+            </w:tcBorders>
+            <w:tcMar>
+              <w:top w:w="70" w:type="dxa"/>
+              <w:left w:w="100" w:type="dxa"/>
+              <w:bottom w:w="70" w:type="dxa"/>
+              <w:right w:w="100" w:type="dxa"/>
+            </w:tcMar>
+          </w:tcPr>
+          <w:p>
+            <w:pPr>
+              <w:spacing w:line="260" w:lineRule="auto"/>
+            </w:pPr>
+            <w:r>
+              <w:rPr>
+                <w:sz w:val="18"/>
+                <w:szCs w:val="18"/>
+              </w:rPr>
+              <w:t xml:space="preserve">Headline number on the page, but the projects list says "30% faster response times" for the same case. </w:t>
+            </w:r>
+            <w:proofErr w:type="spellStart"/>
+            <w:r>
+              <w:rPr>
+                <w:sz w:val="18"/>
+                <w:szCs w:val="18"/>
+              </w:rPr>
+              <w:t>TekRevol</w:t>
+            </w:r>
+            <w:proofErr w:type="spellEnd"/>
+            <w:r>
+              <w:rPr>
+                <w:sz w:val="18"/>
+                <w:szCs w:val="18"/>
+              </w:rPr>
+              <w:t xml:space="preserve"> must pick one</w:t>
+            </w:r>
+          </w:p>
+        </w:tc>
+      </w:tr>
+      <w:tr>
+        <w:trPr>
+          <w:cantSplit/>
+        </w:trPr>
+        <w:tc>
+          <w:tcPr>
+            <w:tcW w:w="1771" w:type="dxa"/>
+            <w:tcBorders>
+              <w:top w:val="single" w:sz="4" w:space="0" w:color="C9CCCF"/>
+              <w:left w:val="single" w:sz="4" w:space="0" w:color="C9CCCF"/>
+              <w:bottom w:val="single" w:sz="4" w:space="0" w:color="C9CCCF"/>
+              <w:right w:val="single" w:sz="4" w:space="0" w:color="C9CCCF"/>
+            </w:tcBorders>
+            <w:shd w:val="clear" w:color="auto" w:fill="F3F4F4"/>
+            <w:tcMar>
+              <w:top w:w="70" w:type="dxa"/>
+              <w:left w:w="100" w:type="dxa"/>
+              <w:bottom w:w="70" w:type="dxa"/>
+              <w:right w:w="100" w:type="dxa"/>
+            </w:tcMar>
+          </w:tcPr>
+          <w:p>
+            <w:pPr>
+              <w:spacing w:line="260" w:lineRule="auto"/>
+            </w:pPr>
+            <w:proofErr w:type="spellStart"/>
+            <w:r>
+              <w:rPr>
+                <w:b/>
+                <w:bCs/>
+                <w:sz w:val="18"/>
+                <w:szCs w:val="18"/>
+              </w:rPr>
               <w:t>Rehkempers</w:t>
             </w:r>
+            <w:proofErr w:type="spellEnd"/>
             <w:r>
               <w:rPr>
                 <w:sz w:val="18"/>
@@ -8744,6 +9090,7 @@
           <w:b/>
           <w:bCs/>
         </w:rPr>
+        <w:lastRenderedPageBreak/>
         <w:t>Testimonial slot (use this):</w:t>
       </w:r>
     </w:p>
@@ -8752,7 +9099,15 @@
         <w:spacing w:after="120" w:line="300" w:lineRule="auto"/>
       </w:pPr>
       <w:r>
-        <w:t>"TekRevol transformed our platform into a comprehensive and secure space where our members feel empowered."</w:t>
+        <w:t>"</w:t>
+      </w:r>
+      <w:proofErr w:type="spellStart"/>
+      <w:r>
+        <w:t>TekRevol</w:t>
+      </w:r>
+      <w:proofErr w:type="spellEnd"/>
+      <w:r>
+        <w:t xml:space="preserve"> transformed our platform into a comprehensive and secure space where our members feel empowered."</w:t>
       </w:r>
     </w:p>
     <w:p>
@@ -8760,7 +9115,19 @@
         <w:spacing w:after="120" w:line="300" w:lineRule="auto"/>
       </w:pPr>
       <w:r>
-        <w:t xml:space="preserve">Libido Health Inc., from the published case study (5.0 rating). Ask TekRevol if a named person and title can be added </w:t>
+        <w:t xml:space="preserve">Libido Health Inc., from the published case study (5.0 rating). Ask </w:t>
+      </w:r>
+      <w:proofErr w:type="spellStart"/>
+      <w:r>
+        <w:t>TekRevol</w:t>
+      </w:r>
+      <w:proofErr w:type="spellEnd"/>
+      <w:r>
+        <w:t xml:space="preserve"> if a named person and title can be </w:t>
+      </w:r>
+      <w:proofErr w:type="gramStart"/>
+      <w:r>
+        <w:t xml:space="preserve">added </w:t>
       </w:r>
       <w:r>
         <w:rPr>
@@ -8772,7 +9139,20 @@
           <w:szCs w:val="14"/>
           <w:shd w:val="clear" w:color="auto" w:fill="FFE8E0"/>
         </w:rPr>
-        <w:t xml:space="preserve"> CONFIRM </w:t>
+        <w:t xml:space="preserve"> CONFIRM</w:t>
+      </w:r>
+      <w:proofErr w:type="gramEnd"/>
+      <w:r>
+        <w:rPr>
+          <w:rFonts w:ascii="JetBrains Mono" w:eastAsia="JetBrains Mono" w:hAnsi="JetBrains Mono" w:cs="JetBrains Mono"/>
+          <w:b/>
+          <w:bCs/>
+          <w:color w:val="C23A00"/>
+          <w:sz w:val="14"/>
+          <w:szCs w:val="14"/>
+          <w:shd w:val="clear" w:color="auto" w:fill="FFE8E0"/>
+        </w:rPr>
+        <w:t xml:space="preserve"> </w:t>
       </w:r>
       <w:r>
         <w:t>; it works without them.</w:t>
@@ -8902,12 +9282,21 @@
             <w:pPr>
               <w:spacing w:line="260" w:lineRule="auto"/>
             </w:pPr>
-            <w:r>
-              <w:rPr>
-                <w:sz w:val="18"/>
-                <w:szCs w:val="18"/>
-              </w:rPr>
-              <w:t>MiloCare+</w:t>
+            <w:proofErr w:type="spellStart"/>
+            <w:r>
+              <w:rPr>
+                <w:sz w:val="18"/>
+                <w:szCs w:val="18"/>
+              </w:rPr>
+              <w:t>MiloCare</w:t>
+            </w:r>
+            <w:proofErr w:type="spellEnd"/>
+            <w:r>
+              <w:rPr>
+                <w:sz w:val="18"/>
+                <w:szCs w:val="18"/>
+              </w:rPr>
+              <w:t>+</w:t>
             </w:r>
           </w:p>
         </w:tc>
@@ -8966,6 +9355,7 @@
             <w:pPr>
               <w:spacing w:line="260" w:lineRule="auto"/>
             </w:pPr>
+            <w:proofErr w:type="spellStart"/>
             <w:r>
               <w:rPr>
                 <w:sz w:val="18"/>
@@ -8973,6 +9363,7 @@
               </w:rPr>
               <w:t>Synapptic</w:t>
             </w:r>
+            <w:proofErr w:type="spellEnd"/>
           </w:p>
         </w:tc>
         <w:tc>
@@ -9001,14 +9392,7 @@
                 <w:sz w:val="18"/>
                 <w:szCs w:val="18"/>
               </w:rPr>
-              <w:t>UK mental wellness app, 60% retentio</w:t>
-            </w:r>
-            <w:r>
-              <w:rPr>
-                <w:sz w:val="18"/>
-                <w:szCs w:val="18"/>
-              </w:rPr>
-              <w:t>n in 30 days (in the body). Consumer wellness, not provider operations. Possible proof for the behavioral health variant later</w:t>
+              <w:t>UK mental wellness app, 60% retention in 30 days (in the body). Consumer wellness, not provider operations. Possible proof for the behavioral health variant later</w:t>
             </w:r>
           </w:p>
         </w:tc>
@@ -9101,12 +9485,21 @@
             <w:pPr>
               <w:spacing w:line="260" w:lineRule="auto"/>
             </w:pPr>
-            <w:r>
-              <w:rPr>
-                <w:sz w:val="18"/>
-                <w:szCs w:val="18"/>
-              </w:rPr>
-              <w:t>Tamreeni, Pure Plank, AMJ Workplace Wellness</w:t>
+            <w:proofErr w:type="spellStart"/>
+            <w:r>
+              <w:rPr>
+                <w:sz w:val="18"/>
+                <w:szCs w:val="18"/>
+              </w:rPr>
+              <w:t>Tamreeni</w:t>
+            </w:r>
+            <w:proofErr w:type="spellEnd"/>
+            <w:r>
+              <w:rPr>
+                <w:sz w:val="18"/>
+                <w:szCs w:val="18"/>
+              </w:rPr>
+              <w:t>, Pure Plank, AMJ Workplace Wellness</w:t>
             </w:r>
           </w:p>
         </w:tc>
@@ -9164,7 +9557,27 @@
         <w:t>Do not use</w:t>
       </w:r>
       <w:r>
-        <w:t xml:space="preserve"> the four reviewer quotes on the Kinekt page (Laura Bennett, Michael Lee, Emily Garcia, James Carter). They have no organization names and read like placeholders. Ask TekRevol whether they are real before they appear anywhere </w:t>
+        <w:t xml:space="preserve"> the four reviewer quotes on the </w:t>
+      </w:r>
+      <w:proofErr w:type="spellStart"/>
+      <w:r>
+        <w:t>Kinekt</w:t>
+      </w:r>
+      <w:proofErr w:type="spellEnd"/>
+      <w:r>
+        <w:t xml:space="preserve"> page (Laura Bennett, Michael Lee, Emily Garcia, James Carter). They have no organization names and read like placeholders. Ask </w:t>
+      </w:r>
+      <w:proofErr w:type="spellStart"/>
+      <w:r>
+        <w:t>TekRevol</w:t>
+      </w:r>
+      <w:proofErr w:type="spellEnd"/>
+      <w:r>
+        <w:t xml:space="preserve"> whether they are real before they appear </w:t>
+      </w:r>
+      <w:proofErr w:type="gramStart"/>
+      <w:r>
+        <w:t xml:space="preserve">anywhere </w:t>
       </w:r>
       <w:r>
         <w:rPr>
@@ -9176,7 +9589,20 @@
           <w:szCs w:val="14"/>
           <w:shd w:val="clear" w:color="auto" w:fill="FFE8E0"/>
         </w:rPr>
-        <w:t xml:space="preserve"> CONFIRM </w:t>
+        <w:t xml:space="preserve"> CONFIRM</w:t>
+      </w:r>
+      <w:proofErr w:type="gramEnd"/>
+      <w:r>
+        <w:rPr>
+          <w:rFonts w:ascii="JetBrains Mono" w:eastAsia="JetBrains Mono" w:hAnsi="JetBrains Mono" w:cs="JetBrains Mono"/>
+          <w:b/>
+          <w:bCs/>
+          <w:color w:val="C23A00"/>
+          <w:sz w:val="14"/>
+          <w:szCs w:val="14"/>
+          <w:shd w:val="clear" w:color="auto" w:fill="FFE8E0"/>
+        </w:rPr>
+        <w:t xml:space="preserve"> </w:t>
       </w:r>
     </w:p>
     <w:p>
@@ -9196,10 +9622,15 @@
         <w:t>Rule:</w:t>
       </w:r>
       <w:r>
-        <w:t xml:space="preserve"> no number unle</w:t>
-      </w:r>
-      <w:r>
-        <w:t>ss it appears in the case study body or TekRevol confirms it. A card with no number still works: it shows the kind of work we've done</w:t>
+        <w:t xml:space="preserve"> no number unless it appears in the case study body or </w:t>
+      </w:r>
+      <w:proofErr w:type="spellStart"/>
+      <w:r>
+        <w:t>TekRevol</w:t>
+      </w:r>
+      <w:proofErr w:type="spellEnd"/>
+      <w:r>
+        <w:t xml:space="preserve"> confirms it. A card with no number still works: it shows the kind of work we've done</w:t>
       </w:r>
     </w:p>
     <w:p>
@@ -9368,14 +9799,15 @@
                 <w:sz w:val="18"/>
                 <w:szCs w:val="18"/>
               </w:rPr>
-              <w:t>It depends on the workflow and the systems invol</w:t>
-            </w:r>
-            <w:r>
-              <w:rPr>
-                <w:sz w:val="18"/>
-                <w:szCs w:val="18"/>
-              </w:rPr>
-              <w:t xml:space="preserve">ved. Your review ends with a rough cost range in writing </w:t>
+              <w:t xml:space="preserve">It depends on the workflow and the systems involved. Your review ends with a rough cost range in </w:t>
+            </w:r>
+            <w:proofErr w:type="gramStart"/>
+            <w:r>
+              <w:rPr>
+                <w:sz w:val="18"/>
+                <w:szCs w:val="18"/>
+              </w:rPr>
+              <w:t xml:space="preserve">writing </w:t>
             </w:r>
             <w:r>
               <w:rPr>
@@ -9387,82 +9819,9 @@
                 <w:szCs w:val="14"/>
                 <w:shd w:val="clear" w:color="auto" w:fill="FFE8E0"/>
               </w:rPr>
-              <w:t xml:space="preserve"> CONFIRM </w:t>
-            </w:r>
-            <w:r>
-              <w:rPr>
-                <w:sz w:val="18"/>
-                <w:szCs w:val="18"/>
-              </w:rPr>
-              <w:t>, so you can budget before you commit to anything.</w:t>
-            </w:r>
-          </w:p>
-        </w:tc>
-      </w:tr>
-      <w:tr>
-        <w:trPr>
-          <w:cantSplit/>
-        </w:trPr>
-        <w:tc>
-          <w:tcPr>
-            <w:tcW w:w="3629" w:type="dxa"/>
-            <w:tcBorders>
-              <w:top w:val="single" w:sz="4" w:space="0" w:color="C9CCCF"/>
-              <w:left w:val="single" w:sz="4" w:space="0" w:color="C9CCCF"/>
-              <w:bottom w:val="single" w:sz="4" w:space="0" w:color="C9CCCF"/>
-              <w:right w:val="single" w:sz="4" w:space="0" w:color="C9CCCF"/>
-            </w:tcBorders>
-            <w:shd w:val="clear" w:color="auto" w:fill="F3F4F4"/>
-            <w:tcMar>
-              <w:top w:w="70" w:type="dxa"/>
-              <w:left w:w="100" w:type="dxa"/>
-              <w:bottom w:w="70" w:type="dxa"/>
-              <w:right w:w="100" w:type="dxa"/>
-            </w:tcMar>
-          </w:tcPr>
-          <w:p>
-            <w:pPr>
-              <w:spacing w:line="260" w:lineRule="auto"/>
-            </w:pPr>
-            <w:r>
-              <w:rPr>
-                <w:b/>
-                <w:bCs/>
-                <w:sz w:val="18"/>
-                <w:szCs w:val="18"/>
-              </w:rPr>
-              <w:t>Does it work with our EHR?</w:t>
-            </w:r>
-          </w:p>
-        </w:tc>
-        <w:tc>
-          <w:tcPr>
-            <w:tcW w:w="5731" w:type="dxa"/>
-            <w:tcBorders>
-              <w:top w:val="single" w:sz="4" w:space="0" w:color="C9CCCF"/>
-              <w:left w:val="single" w:sz="4" w:space="0" w:color="C9CCCF"/>
-              <w:bottom w:val="single" w:sz="4" w:space="0" w:color="C9CCCF"/>
-              <w:right w:val="single" w:sz="4" w:space="0" w:color="C9CCCF"/>
-            </w:tcBorders>
-            <w:shd w:val="clear" w:color="auto" w:fill="F3F4F4"/>
-            <w:tcMar>
-              <w:top w:w="70" w:type="dxa"/>
-              <w:left w:w="100" w:type="dxa"/>
-              <w:bottom w:w="70" w:type="dxa"/>
-              <w:right w:w="100" w:type="dxa"/>
-            </w:tcMar>
-          </w:tcPr>
-          <w:p>
-            <w:pPr>
-              <w:spacing w:line="260" w:lineRule="auto"/>
-            </w:pPr>
-            <w:r>
-              <w:rPr>
-                <w:sz w:val="18"/>
-                <w:szCs w:val="18"/>
-              </w:rPr>
-              <w:t xml:space="preserve">Usually, yes. We connect through your EHR's APIs or standard formats like HL7 and FHIR where they're available </w:t>
-            </w:r>
+              <w:t xml:space="preserve"> CONFIRM</w:t>
+            </w:r>
+            <w:proofErr w:type="gramEnd"/>
             <w:r>
               <w:rPr>
                 <w:rFonts w:ascii="JetBrains Mono" w:eastAsia="JetBrains Mono" w:hAnsi="JetBrains Mono" w:cs="JetBrains Mono"/>
@@ -9473,14 +9832,14 @@
                 <w:szCs w:val="14"/>
                 <w:shd w:val="clear" w:color="auto" w:fill="FFE8E0"/>
               </w:rPr>
-              <w:t xml:space="preserve"> CONFIRM </w:t>
-            </w:r>
-            <w:r>
-              <w:rPr>
-                <w:sz w:val="18"/>
-                <w:szCs w:val="18"/>
-              </w:rPr>
-              <w:t>. If your system has no way in, the review will tell you what's possible.</w:t>
+              <w:t xml:space="preserve"> </w:t>
+            </w:r>
+            <w:r>
+              <w:rPr>
+                <w:sz w:val="18"/>
+                <w:szCs w:val="18"/>
+              </w:rPr>
+              <w:t>, so you can budget before you commit to anything.</w:t>
             </w:r>
           </w:p>
         </w:tc>
@@ -9498,6 +9857,7 @@
               <w:bottom w:val="single" w:sz="4" w:space="0" w:color="C9CCCF"/>
               <w:right w:val="single" w:sz="4" w:space="0" w:color="C9CCCF"/>
             </w:tcBorders>
+            <w:shd w:val="clear" w:color="auto" w:fill="F3F4F4"/>
             <w:tcMar>
               <w:top w:w="70" w:type="dxa"/>
               <w:left w:w="100" w:type="dxa"/>
@@ -9516,7 +9876,7 @@
                 <w:sz w:val="18"/>
                 <w:szCs w:val="18"/>
               </w:rPr>
-              <w:t>Is it HIPAA compliant?</w:t>
+              <w:t>Does it work with our EHR?</w:t>
             </w:r>
           </w:p>
         </w:tc>
@@ -9529,23 +9889,32 @@
               <w:bottom w:val="single" w:sz="4" w:space="0" w:color="C9CCCF"/>
               <w:right w:val="single" w:sz="4" w:space="0" w:color="C9CCCF"/>
             </w:tcBorders>
-            <w:tcMar>
-              <w:top w:w="70" w:type="dxa"/>
-              <w:left w:w="100" w:type="dxa"/>
-              <w:bottom w:w="70" w:type="dxa"/>
-              <w:right w:w="100" w:type="dxa"/>
-            </w:tcMar>
-          </w:tcPr>
-          <w:p>
-            <w:pPr>
-              <w:spacing w:line="260" w:lineRule="auto"/>
-            </w:pPr>
-            <w:r>
-              <w:rPr>
-                <w:sz w:val="18"/>
-                <w:szCs w:val="18"/>
-              </w:rPr>
-              <w:t xml:space="preserve">We build for HIPAA from the first sprint: encryption, access controls, audit logs and private AI models. We sign a BAA </w:t>
+            <w:shd w:val="clear" w:color="auto" w:fill="F3F4F4"/>
+            <w:tcMar>
+              <w:top w:w="70" w:type="dxa"/>
+              <w:left w:w="100" w:type="dxa"/>
+              <w:bottom w:w="70" w:type="dxa"/>
+              <w:right w:w="100" w:type="dxa"/>
+            </w:tcMar>
+          </w:tcPr>
+          <w:p>
+            <w:pPr>
+              <w:spacing w:line="260" w:lineRule="auto"/>
+            </w:pPr>
+            <w:r>
+              <w:rPr>
+                <w:sz w:val="18"/>
+                <w:szCs w:val="18"/>
+              </w:rPr>
+              <w:t xml:space="preserve">Usually, yes. We connect through your EHR's APIs or standard formats like HL7 and FHIR where they're </w:t>
+            </w:r>
+            <w:proofErr w:type="gramStart"/>
+            <w:r>
+              <w:rPr>
+                <w:sz w:val="18"/>
+                <w:szCs w:val="18"/>
+              </w:rPr>
+              <w:t xml:space="preserve">available </w:t>
             </w:r>
             <w:r>
               <w:rPr>
@@ -9557,14 +9926,27 @@
                 <w:szCs w:val="14"/>
                 <w:shd w:val="clear" w:color="auto" w:fill="FFE8E0"/>
               </w:rPr>
-              <w:t xml:space="preserve"> CONFIRM </w:t>
-            </w:r>
-            <w:r>
-              <w:rPr>
-                <w:sz w:val="18"/>
-                <w:szCs w:val="18"/>
-              </w:rPr>
-              <w:t>.</w:t>
+              <w:t xml:space="preserve"> CONFIRM</w:t>
+            </w:r>
+            <w:proofErr w:type="gramEnd"/>
+            <w:r>
+              <w:rPr>
+                <w:rFonts w:ascii="JetBrains Mono" w:eastAsia="JetBrains Mono" w:hAnsi="JetBrains Mono" w:cs="JetBrains Mono"/>
+                <w:b/>
+                <w:bCs/>
+                <w:color w:val="C23A00"/>
+                <w:sz w:val="14"/>
+                <w:szCs w:val="14"/>
+                <w:shd w:val="clear" w:color="auto" w:fill="FFE8E0"/>
+              </w:rPr>
+              <w:t xml:space="preserve"> </w:t>
+            </w:r>
+            <w:r>
+              <w:rPr>
+                <w:sz w:val="18"/>
+                <w:szCs w:val="18"/>
+              </w:rPr>
+              <w:t>. If your system has no way in, the review will tell you what's possible.</w:t>
             </w:r>
           </w:p>
         </w:tc>
@@ -9582,7 +9964,6 @@
               <w:bottom w:val="single" w:sz="4" w:space="0" w:color="C9CCCF"/>
               <w:right w:val="single" w:sz="4" w:space="0" w:color="C9CCCF"/>
             </w:tcBorders>
-            <w:shd w:val="clear" w:color="auto" w:fill="F3F4F4"/>
             <w:tcMar>
               <w:top w:w="70" w:type="dxa"/>
               <w:left w:w="100" w:type="dxa"/>
@@ -9601,7 +9982,7 @@
                 <w:sz w:val="18"/>
                 <w:szCs w:val="18"/>
               </w:rPr>
-              <w:t>Will AI make decisions about patients?</w:t>
+              <w:t>Is it HIPAA compliant?</w:t>
             </w:r>
           </w:p>
         </w:tc>
@@ -9614,24 +9995,63 @@
               <w:bottom w:val="single" w:sz="4" w:space="0" w:color="C9CCCF"/>
               <w:right w:val="single" w:sz="4" w:space="0" w:color="C9CCCF"/>
             </w:tcBorders>
-            <w:shd w:val="clear" w:color="auto" w:fill="F3F4F4"/>
-            <w:tcMar>
-              <w:top w:w="70" w:type="dxa"/>
-              <w:left w:w="100" w:type="dxa"/>
-              <w:bottom w:w="70" w:type="dxa"/>
-              <w:right w:w="100" w:type="dxa"/>
-            </w:tcMar>
-          </w:tcPr>
-          <w:p>
-            <w:pPr>
-              <w:spacing w:line="260" w:lineRule="auto"/>
-            </w:pPr>
-            <w:r>
-              <w:rPr>
-                <w:sz w:val="18"/>
-                <w:szCs w:val="18"/>
-              </w:rPr>
-              <w:t>No. AI prepares, sorts and flags. Clinicians and coordinators approve anything that affects care or billing.</w:t>
+            <w:tcMar>
+              <w:top w:w="70" w:type="dxa"/>
+              <w:left w:w="100" w:type="dxa"/>
+              <w:bottom w:w="70" w:type="dxa"/>
+              <w:right w:w="100" w:type="dxa"/>
+            </w:tcMar>
+          </w:tcPr>
+          <w:p>
+            <w:pPr>
+              <w:spacing w:line="260" w:lineRule="auto"/>
+            </w:pPr>
+            <w:r>
+              <w:rPr>
+                <w:sz w:val="18"/>
+                <w:szCs w:val="18"/>
+              </w:rPr>
+              <w:t xml:space="preserve">We build for HIPAA from the first sprint: encryption, access controls, audit logs and private AI models. We sign a </w:t>
+            </w:r>
+            <w:proofErr w:type="gramStart"/>
+            <w:r>
+              <w:rPr>
+                <w:sz w:val="18"/>
+                <w:szCs w:val="18"/>
+              </w:rPr>
+              <w:t xml:space="preserve">BAA </w:t>
+            </w:r>
+            <w:r>
+              <w:rPr>
+                <w:rFonts w:ascii="JetBrains Mono" w:eastAsia="JetBrains Mono" w:hAnsi="JetBrains Mono" w:cs="JetBrains Mono"/>
+                <w:b/>
+                <w:bCs/>
+                <w:color w:val="C23A00"/>
+                <w:sz w:val="14"/>
+                <w:szCs w:val="14"/>
+                <w:shd w:val="clear" w:color="auto" w:fill="FFE8E0"/>
+              </w:rPr>
+              <w:t xml:space="preserve"> CONFIRM</w:t>
+            </w:r>
+            <w:proofErr w:type="gramEnd"/>
+            <w:r>
+              <w:rPr>
+                <w:rFonts w:ascii="JetBrains Mono" w:eastAsia="JetBrains Mono" w:hAnsi="JetBrains Mono" w:cs="JetBrains Mono"/>
+                <w:b/>
+                <w:bCs/>
+                <w:color w:val="C23A00"/>
+                <w:sz w:val="14"/>
+                <w:szCs w:val="14"/>
+                <w:shd w:val="clear" w:color="auto" w:fill="FFE8E0"/>
+              </w:rPr>
+              <w:t xml:space="preserve"> </w:t>
+            </w:r>
+            <w:r>
+              <w:rPr>
+                <w:sz w:val="18"/>
+                <w:szCs w:val="18"/>
+              </w:rPr>
+              <w:t>.</w:t>
             </w:r>
           </w:p>
         </w:tc>
@@ -9649,6 +10069,7 @@
               <w:bottom w:val="single" w:sz="4" w:space="0" w:color="C9CCCF"/>
               <w:right w:val="single" w:sz="4" w:space="0" w:color="C9CCCF"/>
             </w:tcBorders>
+            <w:shd w:val="clear" w:color="auto" w:fill="F3F4F4"/>
             <w:tcMar>
               <w:top w:w="70" w:type="dxa"/>
               <w:left w:w="100" w:type="dxa"/>
@@ -9667,6 +10088,73 @@
                 <w:sz w:val="18"/>
                 <w:szCs w:val="18"/>
               </w:rPr>
+              <w:t>Will AI make decisions about patients?</w:t>
+            </w:r>
+          </w:p>
+        </w:tc>
+        <w:tc>
+          <w:tcPr>
+            <w:tcW w:w="5731" w:type="dxa"/>
+            <w:tcBorders>
+              <w:top w:val="single" w:sz="4" w:space="0" w:color="C9CCCF"/>
+              <w:left w:val="single" w:sz="4" w:space="0" w:color="C9CCCF"/>
+              <w:bottom w:val="single" w:sz="4" w:space="0" w:color="C9CCCF"/>
+              <w:right w:val="single" w:sz="4" w:space="0" w:color="C9CCCF"/>
+            </w:tcBorders>
+            <w:shd w:val="clear" w:color="auto" w:fill="F3F4F4"/>
+            <w:tcMar>
+              <w:top w:w="70" w:type="dxa"/>
+              <w:left w:w="100" w:type="dxa"/>
+              <w:bottom w:w="70" w:type="dxa"/>
+              <w:right w:w="100" w:type="dxa"/>
+            </w:tcMar>
+          </w:tcPr>
+          <w:p>
+            <w:pPr>
+              <w:spacing w:line="260" w:lineRule="auto"/>
+            </w:pPr>
+            <w:r>
+              <w:rPr>
+                <w:sz w:val="18"/>
+                <w:szCs w:val="18"/>
+              </w:rPr>
+              <w:t>No. AI prepares, sorts and flags. Clinicians and coordinators approve anything that affects care or billing.</w:t>
+            </w:r>
+          </w:p>
+        </w:tc>
+      </w:tr>
+      <w:tr>
+        <w:trPr>
+          <w:cantSplit/>
+        </w:trPr>
+        <w:tc>
+          <w:tcPr>
+            <w:tcW w:w="3629" w:type="dxa"/>
+            <w:tcBorders>
+              <w:top w:val="single" w:sz="4" w:space="0" w:color="C9CCCF"/>
+              <w:left w:val="single" w:sz="4" w:space="0" w:color="C9CCCF"/>
+              <w:bottom w:val="single" w:sz="4" w:space="0" w:color="C9CCCF"/>
+              <w:right w:val="single" w:sz="4" w:space="0" w:color="C9CCCF"/>
+            </w:tcBorders>
+            <w:tcMar>
+              <w:top w:w="70" w:type="dxa"/>
+              <w:left w:w="100" w:type="dxa"/>
+              <w:bottom w:w="70" w:type="dxa"/>
+              <w:right w:w="100" w:type="dxa"/>
+            </w:tcMar>
+          </w:tcPr>
+          <w:p>
+            <w:pPr>
+              <w:spacing w:line="260" w:lineRule="auto"/>
+            </w:pPr>
+            <w:r>
+              <w:rPr>
+                <w:b/>
+                <w:bCs/>
+                <w:sz w:val="18"/>
+                <w:szCs w:val="18"/>
+              </w:rPr>
+              <w:lastRenderedPageBreak/>
               <w:t>Will this replace our staff?</w:t>
             </w:r>
           </w:p>
@@ -9696,14 +10184,7 @@
                 <w:sz w:val="18"/>
                 <w:szCs w:val="18"/>
               </w:rPr>
-              <w:t>It replaces tasks, not people. The aim is fewer late nights for coordinators a</w:t>
-            </w:r>
-            <w:r>
-              <w:rPr>
-                <w:sz w:val="18"/>
-                <w:szCs w:val="18"/>
-              </w:rPr>
-              <w:t>nd clinicians, and more of their time on patients.</w:t>
+              <w:t>It replaces tasks, not people. The aim is fewer late nights for coordinators and clinicians, and more of their time on patients.</w:t>
             </w:r>
           </w:p>
         </w:tc>
@@ -10512,7 +10993,15 @@
                 <w:sz w:val="18"/>
                 <w:szCs w:val="18"/>
               </w:rPr>
-              <w:t xml:space="preserve">Booking calendar (Calendly or HubSpot meetings) </w:t>
+              <w:t xml:space="preserve">Booking calendar (Calendly or HubSpot </w:t>
+            </w:r>
+            <w:proofErr w:type="gramStart"/>
+            <w:r>
+              <w:rPr>
+                <w:sz w:val="18"/>
+                <w:szCs w:val="18"/>
+              </w:rPr>
+              <w:t xml:space="preserve">meetings) </w:t>
             </w:r>
             <w:r>
               <w:rPr>
@@ -10524,143 +11013,9 @@
                 <w:szCs w:val="14"/>
                 <w:shd w:val="clear" w:color="auto" w:fill="FFE8E0"/>
               </w:rPr>
-              <w:t xml:space="preserve"> CONFIRM </w:t>
-            </w:r>
-            <w:r>
-              <w:rPr>
-                <w:sz w:val="18"/>
-                <w:szCs w:val="18"/>
-              </w:rPr>
-              <w:t xml:space="preserve"> which tool</w:t>
-            </w:r>
-          </w:p>
-        </w:tc>
-      </w:tr>
-      <w:tr>
-        <w:trPr>
-          <w:cantSplit/>
-        </w:trPr>
-        <w:tc>
-          <w:tcPr>
-            <w:tcW w:w="2160" w:type="dxa"/>
-            <w:tcBorders>
-              <w:top w:val="single" w:sz="4" w:space="0" w:color="C9CCCF"/>
-              <w:left w:val="single" w:sz="4" w:space="0" w:color="C9CCCF"/>
-              <w:bottom w:val="single" w:sz="4" w:space="0" w:color="C9CCCF"/>
-              <w:right w:val="single" w:sz="4" w:space="0" w:color="C9CCCF"/>
-            </w:tcBorders>
-            <w:shd w:val="clear" w:color="auto" w:fill="F3F4F4"/>
-            <w:tcMar>
-              <w:top w:w="70" w:type="dxa"/>
-              <w:left w:w="100" w:type="dxa"/>
-              <w:bottom w:w="70" w:type="dxa"/>
-              <w:right w:w="100" w:type="dxa"/>
-            </w:tcMar>
-          </w:tcPr>
-          <w:p>
-            <w:pPr>
-              <w:spacing w:line="260" w:lineRule="auto"/>
-            </w:pPr>
-            <w:r>
-              <w:rPr>
-                <w:sz w:val="18"/>
-                <w:szCs w:val="18"/>
-              </w:rPr>
-              <w:t>What to have ready</w:t>
-            </w:r>
-          </w:p>
-        </w:tc>
-        <w:tc>
-          <w:tcPr>
-            <w:tcW w:w="7200" w:type="dxa"/>
-            <w:tcBorders>
-              <w:top w:val="single" w:sz="4" w:space="0" w:color="C9CCCF"/>
-              <w:left w:val="single" w:sz="4" w:space="0" w:color="C9CCCF"/>
-              <w:bottom w:val="single" w:sz="4" w:space="0" w:color="C9CCCF"/>
-              <w:right w:val="single" w:sz="4" w:space="0" w:color="C9CCCF"/>
-            </w:tcBorders>
-            <w:shd w:val="clear" w:color="auto" w:fill="F3F4F4"/>
-            <w:tcMar>
-              <w:top w:w="70" w:type="dxa"/>
-              <w:left w:w="100" w:type="dxa"/>
-              <w:bottom w:w="70" w:type="dxa"/>
-              <w:right w:w="100" w:type="dxa"/>
-            </w:tcMar>
-          </w:tcPr>
-          <w:p>
-            <w:pPr>
-              <w:spacing w:line="260" w:lineRule="auto"/>
-            </w:pPr>
-            <w:r>
-              <w:rPr>
-                <w:sz w:val="18"/>
-                <w:szCs w:val="18"/>
-              </w:rPr>
-              <w:t>The workflow you picked, and a rough idea of how many people work on it each week · The names of the systems it touches (EHR, scheduling, billing) · Any numbers you already track, like referrals per week or denial rate</w:t>
-            </w:r>
-          </w:p>
-        </w:tc>
-      </w:tr>
-      <w:tr>
-        <w:trPr>
-          <w:cantSplit/>
-        </w:trPr>
-        <w:tc>
-          <w:tcPr>
-            <w:tcW w:w="2160" w:type="dxa"/>
-            <w:tcBorders>
-              <w:top w:val="single" w:sz="4" w:space="0" w:color="C9CCCF"/>
-              <w:left w:val="single" w:sz="4" w:space="0" w:color="C9CCCF"/>
-              <w:bottom w:val="single" w:sz="4" w:space="0" w:color="C9CCCF"/>
-              <w:right w:val="single" w:sz="4" w:space="0" w:color="C9CCCF"/>
-            </w:tcBorders>
-            <w:tcMar>
-              <w:top w:w="70" w:type="dxa"/>
-              <w:left w:w="100" w:type="dxa"/>
-              <w:bottom w:w="70" w:type="dxa"/>
-              <w:right w:w="100" w:type="dxa"/>
-            </w:tcMar>
-          </w:tcPr>
-          <w:p>
-            <w:pPr>
-              <w:spacing w:line="260" w:lineRule="auto"/>
-            </w:pPr>
-            <w:r>
-              <w:rPr>
-                <w:sz w:val="18"/>
-                <w:szCs w:val="18"/>
-              </w:rPr>
-              <w:t>If they don't book</w:t>
-            </w:r>
-          </w:p>
-        </w:tc>
-        <w:tc>
-          <w:tcPr>
-            <w:tcW w:w="7200" w:type="dxa"/>
-            <w:tcBorders>
-              <w:top w:val="single" w:sz="4" w:space="0" w:color="C9CCCF"/>
-              <w:left w:val="single" w:sz="4" w:space="0" w:color="C9CCCF"/>
-              <w:bottom w:val="single" w:sz="4" w:space="0" w:color="C9CCCF"/>
-              <w:right w:val="single" w:sz="4" w:space="0" w:color="C9CCCF"/>
-            </w:tcBorders>
-            <w:tcMar>
-              <w:top w:w="70" w:type="dxa"/>
-              <w:left w:w="100" w:type="dxa"/>
-              <w:bottom w:w="70" w:type="dxa"/>
-              <w:right w:w="100" w:type="dxa"/>
-            </w:tcMar>
-          </w:tcPr>
-          <w:p>
-            <w:pPr>
-              <w:spacing w:line="260" w:lineRule="auto"/>
-            </w:pPr>
-            <w:r>
-              <w:rPr>
-                <w:sz w:val="18"/>
-                <w:szCs w:val="18"/>
-              </w:rPr>
-              <w:t xml:space="preserve">Prefer a call? We'll reach out within 1 business hour </w:t>
-            </w:r>
+              <w:t xml:space="preserve"> CONFIRM</w:t>
+            </w:r>
+            <w:proofErr w:type="gramEnd"/>
             <w:r>
               <w:rPr>
                 <w:rFonts w:ascii="JetBrains Mono" w:eastAsia="JetBrains Mono" w:hAnsi="JetBrains Mono" w:cs="JetBrains Mono"/>
@@ -10671,14 +11026,14 @@
                 <w:szCs w:val="14"/>
                 <w:shd w:val="clear" w:color="auto" w:fill="FFE8E0"/>
               </w:rPr>
-              <w:t xml:space="preserve"> CONFIRM </w:t>
-            </w:r>
-            <w:r>
-              <w:rPr>
-                <w:sz w:val="18"/>
-                <w:szCs w:val="18"/>
-              </w:rPr>
-              <w:t xml:space="preserve"> sales can meet this</w:t>
+              <w:t xml:space="preserve"> </w:t>
+            </w:r>
+            <w:r>
+              <w:rPr>
+                <w:sz w:val="18"/>
+                <w:szCs w:val="18"/>
+              </w:rPr>
+              <w:t xml:space="preserve"> which tool</w:t>
             </w:r>
           </w:p>
         </w:tc>
@@ -10713,6 +11068,174 @@
                 <w:sz w:val="18"/>
                 <w:szCs w:val="18"/>
               </w:rPr>
+              <w:t>What to have ready</w:t>
+            </w:r>
+          </w:p>
+        </w:tc>
+        <w:tc>
+          <w:tcPr>
+            <w:tcW w:w="7200" w:type="dxa"/>
+            <w:tcBorders>
+              <w:top w:val="single" w:sz="4" w:space="0" w:color="C9CCCF"/>
+              <w:left w:val="single" w:sz="4" w:space="0" w:color="C9CCCF"/>
+              <w:bottom w:val="single" w:sz="4" w:space="0" w:color="C9CCCF"/>
+              <w:right w:val="single" w:sz="4" w:space="0" w:color="C9CCCF"/>
+            </w:tcBorders>
+            <w:shd w:val="clear" w:color="auto" w:fill="F3F4F4"/>
+            <w:tcMar>
+              <w:top w:w="70" w:type="dxa"/>
+              <w:left w:w="100" w:type="dxa"/>
+              <w:bottom w:w="70" w:type="dxa"/>
+              <w:right w:w="100" w:type="dxa"/>
+            </w:tcMar>
+          </w:tcPr>
+          <w:p>
+            <w:pPr>
+              <w:spacing w:line="260" w:lineRule="auto"/>
+            </w:pPr>
+            <w:r>
+              <w:rPr>
+                <w:sz w:val="18"/>
+                <w:szCs w:val="18"/>
+              </w:rPr>
+              <w:t>The workflow you picked, and a rough idea of how many people work on it each week · The names of the systems it touches (EHR, scheduling, billing) · Any numbers you already track, like referrals per week or denial rate</w:t>
+            </w:r>
+          </w:p>
+        </w:tc>
+      </w:tr>
+      <w:tr>
+        <w:trPr>
+          <w:cantSplit/>
+        </w:trPr>
+        <w:tc>
+          <w:tcPr>
+            <w:tcW w:w="2160" w:type="dxa"/>
+            <w:tcBorders>
+              <w:top w:val="single" w:sz="4" w:space="0" w:color="C9CCCF"/>
+              <w:left w:val="single" w:sz="4" w:space="0" w:color="C9CCCF"/>
+              <w:bottom w:val="single" w:sz="4" w:space="0" w:color="C9CCCF"/>
+              <w:right w:val="single" w:sz="4" w:space="0" w:color="C9CCCF"/>
+            </w:tcBorders>
+            <w:tcMar>
+              <w:top w:w="70" w:type="dxa"/>
+              <w:left w:w="100" w:type="dxa"/>
+              <w:bottom w:w="70" w:type="dxa"/>
+              <w:right w:w="100" w:type="dxa"/>
+            </w:tcMar>
+          </w:tcPr>
+          <w:p>
+            <w:pPr>
+              <w:spacing w:line="260" w:lineRule="auto"/>
+            </w:pPr>
+            <w:r>
+              <w:rPr>
+                <w:sz w:val="18"/>
+                <w:szCs w:val="18"/>
+              </w:rPr>
+              <w:t>If they don't book</w:t>
+            </w:r>
+          </w:p>
+        </w:tc>
+        <w:tc>
+          <w:tcPr>
+            <w:tcW w:w="7200" w:type="dxa"/>
+            <w:tcBorders>
+              <w:top w:val="single" w:sz="4" w:space="0" w:color="C9CCCF"/>
+              <w:left w:val="single" w:sz="4" w:space="0" w:color="C9CCCF"/>
+              <w:bottom w:val="single" w:sz="4" w:space="0" w:color="C9CCCF"/>
+              <w:right w:val="single" w:sz="4" w:space="0" w:color="C9CCCF"/>
+            </w:tcBorders>
+            <w:tcMar>
+              <w:top w:w="70" w:type="dxa"/>
+              <w:left w:w="100" w:type="dxa"/>
+              <w:bottom w:w="70" w:type="dxa"/>
+              <w:right w:w="100" w:type="dxa"/>
+            </w:tcMar>
+          </w:tcPr>
+          <w:p>
+            <w:pPr>
+              <w:spacing w:line="260" w:lineRule="auto"/>
+            </w:pPr>
+            <w:r>
+              <w:rPr>
+                <w:sz w:val="18"/>
+                <w:szCs w:val="18"/>
+              </w:rPr>
+              <w:t xml:space="preserve">Prefer a call? We'll reach out within 1 business </w:t>
+            </w:r>
+            <w:proofErr w:type="gramStart"/>
+            <w:r>
+              <w:rPr>
+                <w:sz w:val="18"/>
+                <w:szCs w:val="18"/>
+              </w:rPr>
+              <w:t xml:space="preserve">hour </w:t>
+            </w:r>
+            <w:r>
+              <w:rPr>
+                <w:rFonts w:ascii="JetBrains Mono" w:eastAsia="JetBrains Mono" w:hAnsi="JetBrains Mono" w:cs="JetBrains Mono"/>
+                <w:b/>
+                <w:bCs/>
+                <w:color w:val="C23A00"/>
+                <w:sz w:val="14"/>
+                <w:szCs w:val="14"/>
+                <w:shd w:val="clear" w:color="auto" w:fill="FFE8E0"/>
+              </w:rPr>
+              <w:t xml:space="preserve"> CONFIRM</w:t>
+            </w:r>
+            <w:proofErr w:type="gramEnd"/>
+            <w:r>
+              <w:rPr>
+                <w:rFonts w:ascii="JetBrains Mono" w:eastAsia="JetBrains Mono" w:hAnsi="JetBrains Mono" w:cs="JetBrains Mono"/>
+                <w:b/>
+                <w:bCs/>
+                <w:color w:val="C23A00"/>
+                <w:sz w:val="14"/>
+                <w:szCs w:val="14"/>
+                <w:shd w:val="clear" w:color="auto" w:fill="FFE8E0"/>
+              </w:rPr>
+              <w:t xml:space="preserve"> </w:t>
+            </w:r>
+            <w:r>
+              <w:rPr>
+                <w:sz w:val="18"/>
+                <w:szCs w:val="18"/>
+              </w:rPr>
+              <w:t xml:space="preserve"> sales can meet this</w:t>
+            </w:r>
+          </w:p>
+        </w:tc>
+      </w:tr>
+      <w:tr>
+        <w:trPr>
+          <w:cantSplit/>
+        </w:trPr>
+        <w:tc>
+          <w:tcPr>
+            <w:tcW w:w="2160" w:type="dxa"/>
+            <w:tcBorders>
+              <w:top w:val="single" w:sz="4" w:space="0" w:color="C9CCCF"/>
+              <w:left w:val="single" w:sz="4" w:space="0" w:color="C9CCCF"/>
+              <w:bottom w:val="single" w:sz="4" w:space="0" w:color="C9CCCF"/>
+              <w:right w:val="single" w:sz="4" w:space="0" w:color="C9CCCF"/>
+            </w:tcBorders>
+            <w:shd w:val="clear" w:color="auto" w:fill="F3F4F4"/>
+            <w:tcMar>
+              <w:top w:w="70" w:type="dxa"/>
+              <w:left w:w="100" w:type="dxa"/>
+              <w:bottom w:w="70" w:type="dxa"/>
+              <w:right w:w="100" w:type="dxa"/>
+            </w:tcMar>
+          </w:tcPr>
+          <w:p>
+            <w:pPr>
+              <w:spacing w:line="260" w:lineRule="auto"/>
+            </w:pPr>
+            <w:r>
+              <w:rPr>
+                <w:sz w:val="18"/>
+                <w:szCs w:val="18"/>
+              </w:rPr>
               <w:t>Tracking</w:t>
             </w:r>
           </w:p>
@@ -10738,6 +11261,7 @@
             <w:pPr>
               <w:spacing w:line="260" w:lineRule="auto"/>
             </w:pPr>
+            <w:proofErr w:type="spellStart"/>
             <w:r>
               <w:rPr>
                 <w:rFonts w:ascii="JetBrains Mono" w:eastAsia="JetBrains Mono" w:hAnsi="JetBrains Mono" w:cs="JetBrains Mono"/>
@@ -10747,6 +11271,7 @@
               </w:rPr>
               <w:t>lead_created</w:t>
             </w:r>
+            <w:proofErr w:type="spellEnd"/>
             <w:r>
               <w:rPr>
                 <w:sz w:val="18"/>
@@ -10927,7 +11452,24 @@
                 <w:sz w:val="18"/>
                 <w:szCs w:val="18"/>
               </w:rPr>
-              <w:t xml:space="preserve">[Name], [title] at TekRevol </w:t>
+              <w:t xml:space="preserve">[Name], [title] at </w:t>
+            </w:r>
+            <w:proofErr w:type="spellStart"/>
+            <w:proofErr w:type="gramStart"/>
+            <w:r>
+              <w:rPr>
+                <w:sz w:val="18"/>
+                <w:szCs w:val="18"/>
+              </w:rPr>
+              <w:t>TekRevol</w:t>
+            </w:r>
+            <w:proofErr w:type="spellEnd"/>
+            <w:r>
+              <w:rPr>
+                <w:sz w:val="18"/>
+                <w:szCs w:val="18"/>
+              </w:rPr>
+              <w:t xml:space="preserve"> </w:t>
             </w:r>
             <w:r>
               <w:rPr>
@@ -10939,7 +11481,20 @@
                 <w:szCs w:val="14"/>
                 <w:shd w:val="clear" w:color="auto" w:fill="FFE8E0"/>
               </w:rPr>
-              <w:t xml:space="preserve"> CONFIRM </w:t>
+              <w:t xml:space="preserve"> CONFIRM</w:t>
+            </w:r>
+            <w:proofErr w:type="gramEnd"/>
+            <w:r>
+              <w:rPr>
+                <w:rFonts w:ascii="JetBrains Mono" w:eastAsia="JetBrains Mono" w:hAnsi="JetBrains Mono" w:cs="JetBrains Mono"/>
+                <w:b/>
+                <w:bCs/>
+                <w:color w:val="C23A00"/>
+                <w:sz w:val="14"/>
+                <w:szCs w:val="14"/>
+                <w:shd w:val="clear" w:color="auto" w:fill="FFE8E0"/>
+              </w:rPr>
+              <w:t xml:space="preserve"> </w:t>
             </w:r>
             <w:r>
               <w:rPr>
@@ -10981,6 +11536,7 @@
                 <w:sz w:val="18"/>
                 <w:szCs w:val="18"/>
               </w:rPr>
+              <w:lastRenderedPageBreak/>
               <w:t>Subject</w:t>
             </w:r>
           </w:p>
@@ -11090,14 +11646,7 @@
                 <w:sz w:val="18"/>
                 <w:szCs w:val="18"/>
               </w:rPr>
-              <w:t xml:space="preserve"> as the work that costs your team the most time, so that's where we'll start. If you haven't booked a time yet, here's the link: [booking link]. On the call we'll walk through how that work runs today, and within 2 business days you'll have a written plan </w:t>
-            </w:r>
-            <w:r>
-              <w:rPr>
-                <w:sz w:val="18"/>
-                <w:szCs w:val="18"/>
-              </w:rPr>
-              <w:t>for the first 3 workflows to automate. If it's easier, reply with a good time and your number, and I'll call you. [Name]</w:t>
+              <w:t xml:space="preserve"> as the work that costs your team the most time, so that's where we'll start. If you haven't booked a time yet, here's the link: [booking link]. On the call we'll walk through how that work runs today, and within 2 business days you'll have a written plan for the first 3 workflows to automate. If it's easier, reply with a good time and your number, and I'll call you. [Name]</w:t>
             </w:r>
           </w:p>
         </w:tc>
@@ -11189,7 +11738,27 @@
           <w:sz w:val="34"/>
           <w:szCs w:val="34"/>
         </w:rPr>
-        <w:t>Matching ad copy (ChatGPT Ads)</w:t>
+        <w:t>Matching ad copy (</w:t>
+      </w:r>
+      <w:proofErr w:type="spellStart"/>
+      <w:r>
+        <w:rPr>
+          <w:rFonts w:ascii="Funnel Display" w:eastAsia="Funnel Display" w:hAnsi="Funnel Display" w:cs="Funnel Display"/>
+          <w:color w:val="1D1E21"/>
+          <w:sz w:val="34"/>
+          <w:szCs w:val="34"/>
+        </w:rPr>
+        <w:t>ChatGPT</w:t>
+      </w:r>
+      <w:proofErr w:type="spellEnd"/>
+      <w:r>
+        <w:rPr>
+          <w:rFonts w:ascii="Funnel Display" w:eastAsia="Funnel Display" w:hAnsi="Funnel Display" w:cs="Funnel Display"/>
+          <w:color w:val="1D1E21"/>
+          <w:sz w:val="34"/>
+          <w:szCs w:val="34"/>
+        </w:rPr>
+        <w:t xml:space="preserve"> Ads)</w:t>
       </w:r>
     </w:p>
     <w:p>
@@ -11197,7 +11766,11 @@
         <w:spacing w:after="120" w:line="300" w:lineRule="auto"/>
       </w:pPr>
       <w:r>
-        <w:t xml:space="preserve">Each ad's headline repeats its variant's H1, and each ad links to its </w:t>
+        <w:t xml:space="preserve">Each ad's headline repeats its variant's H1, and each ad links to </w:t>
+      </w:r>
+      <w:proofErr w:type="gramStart"/>
+      <w:r>
+        <w:t xml:space="preserve">its </w:t>
       </w:r>
       <w:r>
         <w:rPr>
@@ -11206,11 +11779,9 @@
           <w:sz w:val="17"/>
           <w:szCs w:val="17"/>
         </w:rPr>
-        <w:t>?for=</w:t>
-      </w:r>
-      <w:r>
-        <w:t xml:space="preserve"> variant with </w:t>
-      </w:r>
+        <w:t>?for</w:t>
+      </w:r>
+      <w:proofErr w:type="gramEnd"/>
       <w:r>
         <w:rPr>
           <w:rFonts w:ascii="JetBrains Mono" w:eastAsia="JetBrains Mono" w:hAnsi="JetBrains Mono" w:cs="JetBrains Mono"/>
@@ -11218,8 +11789,12 @@
           <w:sz w:val="17"/>
           <w:szCs w:val="17"/>
         </w:rPr>
-        <w:t>utm_cont</w:t>
-      </w:r>
+        <w:t>=</w:t>
+      </w:r>
+      <w:r>
+        <w:t xml:space="preserve"> variant with </w:t>
+      </w:r>
+      <w:proofErr w:type="spellStart"/>
       <w:r>
         <w:rPr>
           <w:rFonts w:ascii="JetBrains Mono" w:eastAsia="JetBrains Mono" w:hAnsi="JetBrains Mono" w:cs="JetBrains Mono"/>
@@ -11227,8 +11802,9 @@
           <w:sz w:val="17"/>
           <w:szCs w:val="17"/>
         </w:rPr>
-        <w:t>ent</w:t>
-      </w:r>
+        <w:t>utm_content</w:t>
+      </w:r>
+      <w:proofErr w:type="spellEnd"/>
       <w:r>
         <w:t xml:space="preserve"> set.</w:t>
       </w:r>
@@ -11247,10 +11823,10 @@
         <w:tblLook w:val="04A0" w:firstRow="1" w:lastRow="0" w:firstColumn="1" w:lastColumn="0" w:noHBand="0" w:noVBand="1"/>
       </w:tblPr>
       <w:tblGrid>
-        <w:gridCol w:w="1560"/>
-        <w:gridCol w:w="1740"/>
-        <w:gridCol w:w="3600"/>
-        <w:gridCol w:w="2460"/>
+        <w:gridCol w:w="1538"/>
+        <w:gridCol w:w="1711"/>
+        <w:gridCol w:w="3481"/>
+        <w:gridCol w:w="2630"/>
       </w:tblGrid>
       <w:tr>
         <w:trPr>
@@ -11504,8 +12080,39 @@
                 <w:sz w:val="15"/>
                 <w:szCs w:val="15"/>
               </w:rPr>
-              <w:t>?utm_content=hc_ops</w:t>
-            </w:r>
+              <w:t>?</w:t>
+            </w:r>
+            <w:proofErr w:type="spellStart"/>
+            <w:r>
+              <w:rPr>
+                <w:rFonts w:ascii="JetBrains Mono" w:eastAsia="JetBrains Mono" w:hAnsi="JetBrains Mono" w:cs="JetBrains Mono"/>
+                <w:color w:val="5E6166"/>
+                <w:sz w:val="15"/>
+                <w:szCs w:val="15"/>
+              </w:rPr>
+              <w:t>utm_content</w:t>
+            </w:r>
+            <w:proofErr w:type="spellEnd"/>
+            <w:r>
+              <w:rPr>
+                <w:rFonts w:ascii="JetBrains Mono" w:eastAsia="JetBrains Mono" w:hAnsi="JetBrains Mono" w:cs="JetBrains Mono"/>
+                <w:color w:val="5E6166"/>
+                <w:sz w:val="15"/>
+                <w:szCs w:val="15"/>
+              </w:rPr>
+              <w:t>=</w:t>
+            </w:r>
+            <w:proofErr w:type="spellStart"/>
+            <w:r>
+              <w:rPr>
+                <w:rFonts w:ascii="JetBrains Mono" w:eastAsia="JetBrains Mono" w:hAnsi="JetBrains Mono" w:cs="JetBrains Mono"/>
+                <w:color w:val="5E6166"/>
+                <w:sz w:val="15"/>
+                <w:szCs w:val="15"/>
+              </w:rPr>
+              <w:t>hc_ops</w:t>
+            </w:r>
+            <w:proofErr w:type="spellEnd"/>
           </w:p>
         </w:tc>
       </w:tr>
@@ -11631,8 +12238,39 @@
                 <w:sz w:val="15"/>
                 <w:szCs w:val="15"/>
               </w:rPr>
-              <w:t>?for=home-health&amp;utm_content=hh_auth</w:t>
-            </w:r>
+              <w:t>?for=</w:t>
+            </w:r>
+            <w:proofErr w:type="spellStart"/>
+            <w:r>
+              <w:rPr>
+                <w:rFonts w:ascii="JetBrains Mono" w:eastAsia="JetBrains Mono" w:hAnsi="JetBrains Mono" w:cs="JetBrains Mono"/>
+                <w:color w:val="5E6166"/>
+                <w:sz w:val="15"/>
+                <w:szCs w:val="15"/>
+              </w:rPr>
+              <w:t>home-health&amp;utm_content</w:t>
+            </w:r>
+            <w:proofErr w:type="spellEnd"/>
+            <w:r>
+              <w:rPr>
+                <w:rFonts w:ascii="JetBrains Mono" w:eastAsia="JetBrains Mono" w:hAnsi="JetBrains Mono" w:cs="JetBrains Mono"/>
+                <w:color w:val="5E6166"/>
+                <w:sz w:val="15"/>
+                <w:szCs w:val="15"/>
+              </w:rPr>
+              <w:t>=</w:t>
+            </w:r>
+            <w:proofErr w:type="spellStart"/>
+            <w:r>
+              <w:rPr>
+                <w:rFonts w:ascii="JetBrains Mono" w:eastAsia="JetBrains Mono" w:hAnsi="JetBrains Mono" w:cs="JetBrains Mono"/>
+                <w:color w:val="5E6166"/>
+                <w:sz w:val="15"/>
+                <w:szCs w:val="15"/>
+              </w:rPr>
+              <w:t>hh_auth</w:t>
+            </w:r>
+            <w:proofErr w:type="spellEnd"/>
           </w:p>
         </w:tc>
       </w:tr>
@@ -11754,8 +12392,39 @@
                 <w:sz w:val="15"/>
                 <w:szCs w:val="15"/>
               </w:rPr>
-              <w:t>?for=home-care&amp;utm_content=hc_sched</w:t>
-            </w:r>
+              <w:t>?for=</w:t>
+            </w:r>
+            <w:proofErr w:type="spellStart"/>
+            <w:r>
+              <w:rPr>
+                <w:rFonts w:ascii="JetBrains Mono" w:eastAsia="JetBrains Mono" w:hAnsi="JetBrains Mono" w:cs="JetBrains Mono"/>
+                <w:color w:val="5E6166"/>
+                <w:sz w:val="15"/>
+                <w:szCs w:val="15"/>
+              </w:rPr>
+              <w:t>home-care&amp;utm_content</w:t>
+            </w:r>
+            <w:proofErr w:type="spellEnd"/>
+            <w:r>
+              <w:rPr>
+                <w:rFonts w:ascii="JetBrains Mono" w:eastAsia="JetBrains Mono" w:hAnsi="JetBrains Mono" w:cs="JetBrains Mono"/>
+                <w:color w:val="5E6166"/>
+                <w:sz w:val="15"/>
+                <w:szCs w:val="15"/>
+              </w:rPr>
+              <w:t>=</w:t>
+            </w:r>
+            <w:proofErr w:type="spellStart"/>
+            <w:r>
+              <w:rPr>
+                <w:rFonts w:ascii="JetBrains Mono" w:eastAsia="JetBrains Mono" w:hAnsi="JetBrains Mono" w:cs="JetBrains Mono"/>
+                <w:color w:val="5E6166"/>
+                <w:sz w:val="15"/>
+                <w:szCs w:val="15"/>
+              </w:rPr>
+              <w:t>hc_sched</w:t>
+            </w:r>
+            <w:proofErr w:type="spellEnd"/>
           </w:p>
         </w:tc>
       </w:tr>
@@ -11849,7 +12518,23 @@
                 <w:sz w:val="18"/>
                 <w:szCs w:val="18"/>
               </w:rPr>
-              <w:t>Prior auths and claim follow-up, checked by your team. Free review.</w:t>
+              <w:t xml:space="preserve">Prior </w:t>
+            </w:r>
+            <w:proofErr w:type="spellStart"/>
+            <w:r>
+              <w:rPr>
+                <w:sz w:val="18"/>
+                <w:szCs w:val="18"/>
+              </w:rPr>
+              <w:t>auths</w:t>
+            </w:r>
+            <w:proofErr w:type="spellEnd"/>
+            <w:r>
+              <w:rPr>
+                <w:sz w:val="18"/>
+                <w:szCs w:val="18"/>
+              </w:rPr>
+              <w:t xml:space="preserve"> and claim follow-up, checked by your team. Free review.</w:t>
             </w:r>
           </w:p>
         </w:tc>
@@ -11881,8 +12566,39 @@
                 <w:sz w:val="15"/>
                 <w:szCs w:val="15"/>
               </w:rPr>
-              <w:t>?for=clinic&amp;utm_content=rcm</w:t>
-            </w:r>
+              <w:t>?for=</w:t>
+            </w:r>
+            <w:proofErr w:type="spellStart"/>
+            <w:r>
+              <w:rPr>
+                <w:rFonts w:ascii="JetBrains Mono" w:eastAsia="JetBrains Mono" w:hAnsi="JetBrains Mono" w:cs="JetBrains Mono"/>
+                <w:color w:val="5E6166"/>
+                <w:sz w:val="15"/>
+                <w:szCs w:val="15"/>
+              </w:rPr>
+              <w:t>clinic&amp;utm_content</w:t>
+            </w:r>
+            <w:proofErr w:type="spellEnd"/>
+            <w:r>
+              <w:rPr>
+                <w:rFonts w:ascii="JetBrains Mono" w:eastAsia="JetBrains Mono" w:hAnsi="JetBrains Mono" w:cs="JetBrains Mono"/>
+                <w:color w:val="5E6166"/>
+                <w:sz w:val="15"/>
+                <w:szCs w:val="15"/>
+              </w:rPr>
+              <w:t>=</w:t>
+            </w:r>
+            <w:proofErr w:type="spellStart"/>
+            <w:r>
+              <w:rPr>
+                <w:rFonts w:ascii="JetBrains Mono" w:eastAsia="JetBrains Mono" w:hAnsi="JetBrains Mono" w:cs="JetBrains Mono"/>
+                <w:color w:val="5E6166"/>
+                <w:sz w:val="15"/>
+                <w:szCs w:val="15"/>
+              </w:rPr>
+              <w:t>rcm</w:t>
+            </w:r>
+            <w:proofErr w:type="spellEnd"/>
           </w:p>
         </w:tc>
       </w:tr>
@@ -12004,8 +12720,39 @@
                 <w:sz w:val="15"/>
                 <w:szCs w:val="15"/>
               </w:rPr>
-              <w:t>?for=behavioral-health&amp;utm_content=bh_adm</w:t>
-            </w:r>
+              <w:t>?for=</w:t>
+            </w:r>
+            <w:proofErr w:type="spellStart"/>
+            <w:r>
+              <w:rPr>
+                <w:rFonts w:ascii="JetBrains Mono" w:eastAsia="JetBrains Mono" w:hAnsi="JetBrains Mono" w:cs="JetBrains Mono"/>
+                <w:color w:val="5E6166"/>
+                <w:sz w:val="15"/>
+                <w:szCs w:val="15"/>
+              </w:rPr>
+              <w:t>behavioral-health&amp;utm_content</w:t>
+            </w:r>
+            <w:proofErr w:type="spellEnd"/>
+            <w:r>
+              <w:rPr>
+                <w:rFonts w:ascii="JetBrains Mono" w:eastAsia="JetBrains Mono" w:hAnsi="JetBrains Mono" w:cs="JetBrains Mono"/>
+                <w:color w:val="5E6166"/>
+                <w:sz w:val="15"/>
+                <w:szCs w:val="15"/>
+              </w:rPr>
+              <w:t>=</w:t>
+            </w:r>
+            <w:proofErr w:type="spellStart"/>
+            <w:r>
+              <w:rPr>
+                <w:rFonts w:ascii="JetBrains Mono" w:eastAsia="JetBrains Mono" w:hAnsi="JetBrains Mono" w:cs="JetBrains Mono"/>
+                <w:color w:val="5E6166"/>
+                <w:sz w:val="15"/>
+                <w:szCs w:val="15"/>
+              </w:rPr>
+              <w:t>bh_adm</w:t>
+            </w:r>
+            <w:proofErr w:type="spellEnd"/>
           </w:p>
         </w:tc>
       </w:tr>
@@ -12056,9 +12803,9 @@
         <w:tblLook w:val="04A0" w:firstRow="1" w:lastRow="0" w:firstColumn="1" w:lastColumn="0" w:noHBand="0" w:noVBand="1"/>
       </w:tblPr>
       <w:tblGrid>
-        <w:gridCol w:w="1545"/>
-        <w:gridCol w:w="3908"/>
-        <w:gridCol w:w="3907"/>
+        <w:gridCol w:w="1730"/>
+        <w:gridCol w:w="3814"/>
+        <w:gridCol w:w="3816"/>
       </w:tblGrid>
       <w:tr>
         <w:trPr>
@@ -12186,6 +12933,7 @@
             <w:pPr>
               <w:spacing w:line="260" w:lineRule="auto"/>
             </w:pPr>
+            <w:proofErr w:type="spellStart"/>
             <w:r>
               <w:rPr>
                 <w:rFonts w:ascii="JetBrains Mono" w:eastAsia="JetBrains Mono" w:hAnsi="JetBrains Mono" w:cs="JetBrains Mono"/>
@@ -12195,6 +12943,7 @@
               </w:rPr>
               <w:t>lead_created</w:t>
             </w:r>
+            <w:proofErr w:type="spellEnd"/>
           </w:p>
         </w:tc>
         <w:tc>
@@ -12283,6 +13032,7 @@
             <w:pPr>
               <w:spacing w:line="260" w:lineRule="auto"/>
             </w:pPr>
+            <w:proofErr w:type="spellStart"/>
             <w:r>
               <w:rPr>
                 <w:rFonts w:ascii="JetBrains Mono" w:eastAsia="JetBrains Mono" w:hAnsi="JetBrains Mono" w:cs="JetBrains Mono"/>
@@ -12292,6 +13042,7 @@
               </w:rPr>
               <w:t>summary_requested</w:t>
             </w:r>
+            <w:proofErr w:type="spellEnd"/>
           </w:p>
         </w:tc>
         <w:tc>
@@ -12379,6 +13130,7 @@
             <w:pPr>
               <w:spacing w:line="260" w:lineRule="auto"/>
             </w:pPr>
+            <w:proofErr w:type="spellStart"/>
             <w:r>
               <w:rPr>
                 <w:rFonts w:ascii="JetBrains Mono" w:eastAsia="JetBrains Mono" w:hAnsi="JetBrains Mono" w:cs="JetBrains Mono"/>
@@ -12388,6 +13140,7 @@
               </w:rPr>
               <w:t>booking_made</w:t>
             </w:r>
+            <w:proofErr w:type="spellEnd"/>
           </w:p>
         </w:tc>
         <w:tc>
@@ -12474,6 +13227,7 @@
             <w:pPr>
               <w:spacing w:line="260" w:lineRule="auto"/>
             </w:pPr>
+            <w:proofErr w:type="spellStart"/>
             <w:r>
               <w:rPr>
                 <w:rFonts w:ascii="JetBrains Mono" w:eastAsia="JetBrains Mono" w:hAnsi="JetBrains Mono" w:cs="JetBrains Mono"/>
@@ -12483,6 +13237,7 @@
               </w:rPr>
               <w:t>form_start</w:t>
             </w:r>
+            <w:proofErr w:type="spellEnd"/>
           </w:p>
         </w:tc>
         <w:tc>
@@ -12570,6 +13325,7 @@
             <w:pPr>
               <w:spacing w:line="260" w:lineRule="auto"/>
             </w:pPr>
+            <w:proofErr w:type="spellStart"/>
             <w:r>
               <w:rPr>
                 <w:rFonts w:ascii="JetBrains Mono" w:eastAsia="JetBrains Mono" w:hAnsi="JetBrains Mono" w:cs="JetBrains Mono"/>
@@ -12577,8 +13333,10 @@
                 <w:sz w:val="15"/>
                 <w:szCs w:val="15"/>
               </w:rPr>
+              <w:lastRenderedPageBreak/>
               <w:t>cta_click</w:t>
             </w:r>
+            <w:proofErr w:type="spellEnd"/>
           </w:p>
         </w:tc>
         <w:tc>
@@ -12653,6 +13411,7 @@
       <w:r>
         <w:t xml:space="preserve">Report the 5% on </w:t>
       </w:r>
+      <w:proofErr w:type="spellStart"/>
       <w:r>
         <w:rPr>
           <w:rFonts w:ascii="JetBrains Mono" w:eastAsia="JetBrains Mono" w:hAnsi="JetBrains Mono" w:cs="JetBrains Mono"/>
@@ -12662,6 +13421,7 @@
         </w:rPr>
         <w:t>lead_created</w:t>
       </w:r>
+      <w:proofErr w:type="spellEnd"/>
       <w:r>
         <w:t xml:space="preserve"> only, so the number isn't inflated by email-only sign-ups.</w:t>
       </w:r>
@@ -12722,10 +13482,7 @@
         <w:t>Hero H1:</w:t>
       </w:r>
       <w:r>
-        <w:t xml:space="preserve"> generic healthcare ops vs operator-specific variant for the s</w:t>
-      </w:r>
-      <w:r>
-        <w:t>ame ad group</w:t>
+        <w:t xml:space="preserve"> generic healthcare ops vs operator-specific variant for the same ad group</w:t>
       </w:r>
     </w:p>
     <w:p>
@@ -12791,11 +13548,13 @@
       <w:pPr>
         <w:spacing w:after="120" w:line="300" w:lineRule="auto"/>
       </w:pPr>
-      <w:r>
-        <w:t>TekRev</w:t>
-      </w:r>
-      <w:r>
-        <w:t xml:space="preserve">ol's existing </w:t>
+      <w:proofErr w:type="spellStart"/>
+      <w:r>
+        <w:t>TekRevol's</w:t>
+      </w:r>
+      <w:proofErr w:type="spellEnd"/>
+      <w:r>
+        <w:t xml:space="preserve"> existing </w:t>
       </w:r>
       <w:r>
         <w:rPr>
@@ -12819,10 +13578,15 @@
         <w:t>/healthcare-software-development</w:t>
       </w:r>
       <w:r>
-        <w:t>, and it already offers a free workflow audit. If the campaign has to restart before this page is live, point the healthcare ads there, but first remove the unapproved stats ("200+ healthcare projects", "50+ AI specialists", "Deloitte Fast 50") and the pro</w:t>
-      </w:r>
-      <w:r>
-        <w:t>duct names still under naming review, unless TekRevol confirms them.</w:t>
+        <w:t xml:space="preserve">, and it already offers a free workflow audit. If the campaign has to restart before this page is live, point the healthcare ads there, but first remove the unapproved stats ("200+ healthcare projects", "50+ AI specialists", "Deloitte Fast 50") and the product names still under naming review, unless </w:t>
+      </w:r>
+      <w:proofErr w:type="spellStart"/>
+      <w:r>
+        <w:t>TekRevol</w:t>
+      </w:r>
+      <w:proofErr w:type="spellEnd"/>
+      <w:r>
+        <w:t xml:space="preserve"> confirms them.</w:t>
       </w:r>
     </w:p>
     <w:p>
@@ -12841,7 +13605,27 @@
           <w:sz w:val="34"/>
           <w:szCs w:val="34"/>
         </w:rPr>
-        <w:t>Open items for TekRevol (`CONFIRM` list)</w:t>
+        <w:t xml:space="preserve">Open items for </w:t>
+      </w:r>
+      <w:proofErr w:type="spellStart"/>
+      <w:r>
+        <w:rPr>
+          <w:rFonts w:ascii="Funnel Display" w:eastAsia="Funnel Display" w:hAnsi="Funnel Display" w:cs="Funnel Display"/>
+          <w:color w:val="1D1E21"/>
+          <w:sz w:val="34"/>
+          <w:szCs w:val="34"/>
+        </w:rPr>
+        <w:t>TekRevol</w:t>
+      </w:r>
+      <w:proofErr w:type="spellEnd"/>
+      <w:r>
+        <w:rPr>
+          <w:rFonts w:ascii="Funnel Display" w:eastAsia="Funnel Display" w:hAnsi="Funnel Display" w:cs="Funnel Display"/>
+          <w:color w:val="1D1E21"/>
+          <w:sz w:val="34"/>
+          <w:szCs w:val="34"/>
+        </w:rPr>
+        <w:t xml:space="preserve"> (`CONFIRM` list)</w:t>
       </w:r>
     </w:p>
     <w:tbl>
@@ -13490,7 +14274,23 @@
                 <w:sz w:val="18"/>
                 <w:szCs w:val="18"/>
               </w:rPr>
-              <w:t>Nurse Practitioners "40% shorter wait times" (meta description only) and Kinekt "45% engagement" vs "30% faster response" (pick one)</w:t>
+              <w:t xml:space="preserve">Nurse Practitioners "40% shorter wait times" (meta description only) and </w:t>
+            </w:r>
+            <w:proofErr w:type="spellStart"/>
+            <w:r>
+              <w:rPr>
+                <w:sz w:val="18"/>
+                <w:szCs w:val="18"/>
+              </w:rPr>
+              <w:t>Kinekt</w:t>
+            </w:r>
+            <w:proofErr w:type="spellEnd"/>
+            <w:r>
+              <w:rPr>
+                <w:sz w:val="18"/>
+                <w:szCs w:val="18"/>
+              </w:rPr>
+              <w:t xml:space="preserve"> "45% engagement" vs "30% faster response" (pick one)</w:t>
             </w:r>
           </w:p>
         </w:tc>
@@ -13583,7 +14383,23 @@
                 <w:sz w:val="18"/>
                 <w:szCs w:val="18"/>
               </w:rPr>
-              <w:t>A named person and title for the Libido Health quote; whether the Kinekt reviewer quotes are real</w:t>
+              <w:t xml:space="preserve">A named person and title for the Libido Health quote; whether the </w:t>
+            </w:r>
+            <w:proofErr w:type="spellStart"/>
+            <w:r>
+              <w:rPr>
+                <w:sz w:val="18"/>
+                <w:szCs w:val="18"/>
+              </w:rPr>
+              <w:t>Kinekt</w:t>
+            </w:r>
+            <w:proofErr w:type="spellEnd"/>
+            <w:r>
+              <w:rPr>
+                <w:sz w:val="18"/>
+                <w:szCs w:val="18"/>
+              </w:rPr>
+              <w:t xml:space="preserve"> reviewer quotes are real</w:t>
             </w:r>
           </w:p>
         </w:tc>
@@ -13647,6 +14463,7 @@
                 <w:sz w:val="18"/>
                 <w:szCs w:val="18"/>
               </w:rPr>
+              <w:lastRenderedPageBreak/>
               <w:t>8</w:t>
             </w:r>
           </w:p>
@@ -13947,7 +14764,11 @@
         <w:spacing w:after="80" w:line="290" w:lineRule="auto"/>
       </w:pPr>
       <w:r>
-        <w:t xml:space="preserve">Send the </w:t>
+        <w:t xml:space="preserve">Send </w:t>
+      </w:r>
+      <w:proofErr w:type="gramStart"/>
+      <w:r>
+        <w:t xml:space="preserve">the </w:t>
       </w:r>
       <w:r>
         <w:rPr>
@@ -13959,10 +14780,31 @@
           <w:szCs w:val="14"/>
           <w:shd w:val="clear" w:color="auto" w:fill="FFE8E0"/>
         </w:rPr>
-        <w:t xml:space="preserve"> CONFIRM </w:t>
-      </w:r>
-      <w:r>
-        <w:t xml:space="preserve"> list to TekRevol (delivery + sales)</w:t>
+        <w:t xml:space="preserve"> CONFIRM</w:t>
+      </w:r>
+      <w:proofErr w:type="gramEnd"/>
+      <w:r>
+        <w:rPr>
+          <w:rFonts w:ascii="JetBrains Mono" w:eastAsia="JetBrains Mono" w:hAnsi="JetBrains Mono" w:cs="JetBrains Mono"/>
+          <w:b/>
+          <w:bCs/>
+          <w:color w:val="C23A00"/>
+          <w:sz w:val="14"/>
+          <w:szCs w:val="14"/>
+          <w:shd w:val="clear" w:color="auto" w:fill="FFE8E0"/>
+        </w:rPr>
+        <w:t xml:space="preserve"> </w:t>
+      </w:r>
+      <w:r>
+        <w:t xml:space="preserve"> list to </w:t>
+      </w:r>
+      <w:proofErr w:type="spellStart"/>
+      <w:r>
+        <w:t>TekRevol</w:t>
+      </w:r>
+      <w:proofErr w:type="spellEnd"/>
+      <w:r>
+        <w:t xml:space="preserve"> (delivery + sales)</w:t>
       </w:r>
     </w:p>
     <w:p>
@@ -13988,7 +14830,11 @@
         <w:spacing w:after="80" w:line="290" w:lineRule="auto"/>
       </w:pPr>
       <w:r>
-        <w:t xml:space="preserve">Dev: build the page with </w:t>
+        <w:t xml:space="preserve">Dev: build the page </w:t>
+      </w:r>
+      <w:proofErr w:type="gramStart"/>
+      <w:r>
+        <w:t xml:space="preserve">with </w:t>
       </w:r>
       <w:r>
         <w:rPr>
@@ -13997,7 +14843,17 @@
           <w:sz w:val="17"/>
           <w:szCs w:val="17"/>
         </w:rPr>
-        <w:t>?for=</w:t>
+        <w:t>?for</w:t>
+      </w:r>
+      <w:proofErr w:type="gramEnd"/>
+      <w:r>
+        <w:rPr>
+          <w:rFonts w:ascii="JetBrains Mono" w:eastAsia="JetBrains Mono" w:hAnsi="JetBrains Mono" w:cs="JetBrains Mono"/>
+          <w:color w:val="5E6166"/>
+          <w:sz w:val="17"/>
+          <w:szCs w:val="17"/>
+        </w:rPr>
+        <w:t>=</w:t>
       </w:r>
       <w:r>
         <w:t xml:space="preserve"> variants, the 4-field form, thank-you page and the five tracking events</w:t>
@@ -14065,6 +14921,7 @@
     <w:pPr>
       <w:jc w:val="right"/>
     </w:pPr>
+    <w:proofErr w:type="spellStart"/>
     <w:r>
       <w:rPr>
         <w:rFonts w:ascii="JetBrains Mono" w:eastAsia="JetBrains Mono" w:hAnsi="JetBrains Mono" w:cs="JetBrains Mono"/>
@@ -14072,7 +14929,17 @@
         <w:sz w:val="14"/>
         <w:szCs w:val="14"/>
       </w:rPr>
-      <w:t xml:space="preserve">TekRevol · Healthcare AI Ops Page · Internal · </w:t>
+      <w:t>TekRevol</w:t>
+    </w:r>
+    <w:proofErr w:type="spellEnd"/>
+    <w:r>
+      <w:rPr>
+        <w:rFonts w:ascii="JetBrains Mono" w:eastAsia="JetBrains Mono" w:hAnsi="JetBrains Mono" w:cs="JetBrains Mono"/>
+        <w:color w:val="5E6166"/>
+        <w:sz w:val="14"/>
+        <w:szCs w:val="14"/>
+      </w:rPr>
+      <w:t xml:space="preserve"> · Healthcare AI Ops Page · Internal · </w:t>
     </w:r>
     <w:r>
       <w:rPr>
@@ -14356,7 +15223,7 @@
     <w:nsid w:val="5AA40C8B"/>
     <w:multiLevelType w:val="hybridMultilevel"/>
     <w:tmpl w:val="E8989CC8"/>
-    <w:lvl w:ilvl="0" w:tplc="0F7A2406" w:tentative="1">
+    <w:lvl w:ilvl="0" w:tplc="0F7A2406">
       <w:start w:val="1"/>
       <w:numFmt w:val="decimal"/>
       <w:lvlText w:val="%1."/>
@@ -14414,7 +15281,7 @@
     <w:nsid w:val="6B376847"/>
     <w:multiLevelType w:val="hybridMultilevel"/>
     <w:tmpl w:val="74DED3F6"/>
-    <w:lvl w:ilvl="0" w:tplc="1632D280" w:tentative="1">
+    <w:lvl w:ilvl="0" w:tplc="1632D280">
       <w:start w:val="1"/>
       <w:numFmt w:val="bullet"/>
       <w:lvlText w:val="☐"/>

</xml_diff>